<commit_message>
docs: update B24DCCC157_Do_Quoc_Khanh_BaoCao.docx with real screenshots and Flutter architecture
</commit_message>
<xml_diff>
--- a/B24DCCC157_Do_Quoc_Khanh_BaoCao.docx
+++ b/B24DCCC157_Do_Quoc_Khanh_BaoCao.docx
@@ -1,6 +1,6 @@
 
 <file path=word/document.xml><?xml version="1.0" encoding="utf-8"?>
-<w:document xmlns:w="http://schemas.openxmlformats.org/wordprocessingml/2006/main" xmlns:r="http://schemas.openxmlformats.org/officeDocument/2006/relationships" xmlns:m="http://schemas.openxmlformats.org/officeDocument/2006/math" xmlns:v="urn:schemas-microsoft-com:vml" xmlns:wp="http://schemas.openxmlformats.org/drawingml/2006/wordprocessingDrawing" xmlns:w10="urn:schemas-microsoft-com:office:word" xmlns:a="http://schemas.openxmlformats.org/drawingml/2006/main" xmlns:pic="http://schemas.openxmlformats.org/drawingml/2006/picture">
+<w:document xmlns:wpc="http://schemas.microsoft.com/office/word/2010/wordprocessingCanvas" xmlns:cx="http://schemas.microsoft.com/office/drawing/2014/chartex" xmlns:cx1="http://schemas.microsoft.com/office/drawing/2015/9/8/chartex" xmlns:cx2="http://schemas.microsoft.com/office/drawing/2015/10/21/chartex" xmlns:cx3="http://schemas.microsoft.com/office/drawing/2016/5/9/chartex" xmlns:cx4="http://schemas.microsoft.com/office/drawing/2016/5/10/chartex" xmlns:cx5="http://schemas.microsoft.com/office/drawing/2016/5/11/chartex" xmlns:cx6="http://schemas.microsoft.com/office/drawing/2016/5/12/chartex" xmlns:cx7="http://schemas.microsoft.com/office/drawing/2016/5/13/chartex" xmlns:cx8="http://schemas.microsoft.com/office/drawing/2016/5/14/chartex" xmlns:mc="http://schemas.openxmlformats.org/markup-compatibility/2006" xmlns:o="urn:schemas-microsoft-com:office:office" xmlns:r="http://schemas.openxmlformats.org/officeDocument/2006/relationships" xmlns:m="http://schemas.openxmlformats.org/officeDocument/2006/math" xmlns:v="urn:schemas-microsoft-com:vml" xmlns:wp14="http://schemas.microsoft.com/office/word/2010/wordprocessingDrawing" xmlns:wp="http://schemas.openxmlformats.org/drawingml/2006/wordprocessingDrawing" xmlns:w="http://schemas.openxmlformats.org/wordprocessingml/2006/main" xmlns:w14="http://schemas.microsoft.com/office/word/2010/wordml" xmlns:w10="urn:schemas-microsoft-com:office:word" xmlns:w15="http://schemas.microsoft.com/office/word/2012/wordml" xmlns:wpg="http://schemas.microsoft.com/office/word/2010/wordprocessingGroup" xmlns:wpi="http://schemas.microsoft.com/office/word/2010/wordprocessingInk" xmlns:wne="http://schemas.microsoft.com/office/word/2006/wordml" xmlns:wps="http://schemas.microsoft.com/office/word/2010/wordprocessingShape" xmlns:wpsCustomData="http://www.wps.cn/officeDocument/2013/wpsCustomData" mc:Ignorable="w14 w15 wp14">
   <w:body>
     <w:p>
       <w:pPr>
@@ -10,13 +10,13 @@
       <w:r>
         <w:rPr>
           <w:rFonts w:ascii="Arial" w:hAnsi="Arial" w:cs="Arial"/>
+          <w:b/>
+          <w:bCs/>
+          <w:color w:val="1A56DB"/>
           <w:sz w:val="28"/>
           <w:szCs w:val="28"/>
-          <w:b/>
-          <w:bCs/>
-          <w:color w:val="1A56DB"/>
-        </w:rPr>
-        <w:t xml:space="preserve">HỌC VIỆN CÔNG NGHỆ BƯU CHÍNH VIỄN THÔNG</w:t>
+        </w:rPr>
+        <w:t>HỌC VIỆN CÔNG NGHỆ BƯU CHÍNH VIỄN THÔNG</w:t>
       </w:r>
     </w:p>
     <w:p>
@@ -27,13 +27,13 @@
       <w:r>
         <w:rPr>
           <w:rFonts w:ascii="Arial" w:hAnsi="Arial" w:cs="Arial"/>
+          <w:b/>
+          <w:bCs/>
+          <w:color w:val="64748B"/>
           <w:sz w:val="22"/>
           <w:szCs w:val="22"/>
-          <w:b/>
-          <w:bCs/>
-          <w:color w:val="64748B"/>
-        </w:rPr>
-        <w:t xml:space="preserve">KHOA CÔNG NGHỆ THÔNG TIN - BỘ MÔN CÔNG NGHỆ PHẦN MỀM</w:t>
+        </w:rPr>
+        <w:t>KHOA CÔNG NGHỆ THÔNG TIN - BỘ MÔN CÔNG NGHỆ PHẦN MỀM</w:t>
       </w:r>
     </w:p>
     <w:p>
@@ -44,13 +44,13 @@
       <w:r>
         <w:rPr>
           <w:rFonts w:ascii="Arial" w:hAnsi="Arial" w:cs="Arial"/>
+          <w:b/>
+          <w:bCs/>
+          <w:color w:val="1E429F"/>
           <w:sz w:val="38"/>
           <w:szCs w:val="38"/>
-          <w:b/>
-          <w:bCs/>
-          <w:color w:val="1E429F"/>
-        </w:rPr>
-        <w:t xml:space="preserve">BÁO CÁO BÀI TẬP LẬP TRÌNH ANDROID</w:t>
+        </w:rPr>
+        <w:t>BÁO CÁO BÀI TẬP LẬP TRÌNH DI ĐỘNG</w:t>
       </w:r>
     </w:p>
     <w:p>
@@ -61,31 +61,60 @@
       <w:r>
         <w:rPr>
           <w:rFonts w:ascii="Arial" w:hAnsi="Arial" w:cs="Arial"/>
+          <w:b/>
+          <w:bCs/>
+          <w:color w:val="0E9F6E"/>
           <w:sz w:val="28"/>
           <w:szCs w:val="28"/>
-          <w:b/>
-          <w:bCs/>
-          <w:color w:val="0E9F6E"/>
-        </w:rPr>
-        <w:t xml:space="preserve">ĐỀ TÀI: XÂY DỰNG ỨNG DỤNG QUẢN LÝ DANH BẠ LIÊN HỆ</w:t>
+        </w:rPr>
+        <w:t>ĐỀ TÀI: XÂY DỰNG ỨNG DỤNG QUẢN LÝ DANH BẠ LIÊN HỆ</w:t>
       </w:r>
     </w:p>
     <w:tbl>
       <w:tblPr>
+        <w:tblStyle w:val="9"/>
         <w:tblW w:w="9360" w:type="dxa"/>
+        <w:jc w:val="center"/>
         <w:tblBorders>
-          <w:top w:val="single" w:sz="4" w:space="0" w:color="CCCCCC"/>
-          <w:left w:val="single" w:sz="4" w:space="0" w:color="CCCCCC"/>
-          <w:bottom w:val="single" w:sz="4" w:space="0" w:color="CCCCCC"/>
-          <w:right w:val="single" w:sz="4" w:space="0" w:color="CCCCCC"/>
-          <w:insideH w:val="single" w:sz="4" w:space="0" w:color="E2E8F0"/>
-          <w:insideV w:val="single" w:sz="4" w:space="0" w:color="E2E8F0"/>
+          <w:top w:val="single" w:color="CCCCCC" w:sz="4" w:space="0"/>
+          <w:left w:val="single" w:color="CCCCCC" w:sz="4" w:space="0"/>
+          <w:bottom w:val="single" w:color="CCCCCC" w:sz="4" w:space="0"/>
+          <w:right w:val="single" w:color="CCCCCC" w:sz="4" w:space="0"/>
+          <w:insideH w:val="single" w:color="E2E8F0" w:sz="4" w:space="0"/>
+          <w:insideV w:val="single" w:color="E2E8F0" w:sz="4" w:space="0"/>
         </w:tblBorders>
-        <w:jc w:val="center"/>
+        <w:tblLayout w:type="autofit"/>
+        <w:tblCellMar>
+          <w:top w:w="0" w:type="dxa"/>
+          <w:left w:w="10" w:type="dxa"/>
+          <w:bottom w:w="0" w:type="dxa"/>
+          <w:right w:w="10" w:type="dxa"/>
+        </w:tblCellMar>
       </w:tblPr>
+      <w:tblGrid>
+        <w:gridCol w:w="3000"/>
+        <w:gridCol w:w="6360"/>
+      </w:tblGrid>
       <w:tr>
+        <w:tblPrEx>
+          <w:tblBorders>
+            <w:top w:val="single" w:color="CCCCCC" w:sz="4" w:space="0"/>
+            <w:left w:val="single" w:color="CCCCCC" w:sz="4" w:space="0"/>
+            <w:bottom w:val="single" w:color="CCCCCC" w:sz="4" w:space="0"/>
+            <w:right w:val="single" w:color="CCCCCC" w:sz="4" w:space="0"/>
+            <w:insideH w:val="single" w:color="E2E8F0" w:sz="4" w:space="0"/>
+            <w:insideV w:val="single" w:color="E2E8F0" w:sz="4" w:space="0"/>
+          </w:tblBorders>
+          <w:tblCellMar>
+            <w:top w:w="0" w:type="dxa"/>
+            <w:left w:w="10" w:type="dxa"/>
+            <w:bottom w:w="0" w:type="dxa"/>
+            <w:right w:w="10" w:type="dxa"/>
+          </w:tblCellMar>
+        </w:tblPrEx>
         <w:trPr>
           <w:tblHeader/>
+          <w:jc w:val="center"/>
         </w:trPr>
         <w:tc>
           <w:tcPr>
@@ -93,24 +122,24 @@
             <w:shd w:val="clear" w:color="auto" w:fill="E1EFFE"/>
             <w:tcMar>
               <w:top w:w="120" w:type="dxa"/>
+              <w:left w:w="160" w:type="dxa"/>
               <w:bottom w:w="120" w:type="dxa"/>
-              <w:left w:w="160" w:type="dxa"/>
               <w:right w:w="160" w:type="dxa"/>
             </w:tcMar>
           </w:tcPr>
           <w:p>
             <w:pPr>
+              <w:spacing w:before="60" w:after="60"/>
               <w:jc w:val="center"/>
-              <w:spacing w:before="60" w:after="60"/>
             </w:pPr>
             <w:r>
               <w:rPr>
                 <w:rFonts w:ascii="Arial" w:hAnsi="Arial"/>
                 <w:b/>
                 <w:bCs/>
-                <w:sz w:val="22"/>
-                <w:szCs w:val="22"/>
                 <w:color w:val="1E429F"/>
+                <w:sz w:val="22"/>
+                <w:szCs w:val="22"/>
               </w:rPr>
               <w:t>Thông tin</w:t>
             </w:r>
@@ -122,24 +151,24 @@
             <w:shd w:val="clear" w:color="auto" w:fill="E1EFFE"/>
             <w:tcMar>
               <w:top w:w="120" w:type="dxa"/>
+              <w:left w:w="160" w:type="dxa"/>
               <w:bottom w:w="120" w:type="dxa"/>
-              <w:left w:w="160" w:type="dxa"/>
               <w:right w:w="160" w:type="dxa"/>
             </w:tcMar>
           </w:tcPr>
           <w:p>
             <w:pPr>
+              <w:spacing w:before="60" w:after="60"/>
               <w:jc w:val="center"/>
-              <w:spacing w:before="60" w:after="60"/>
             </w:pPr>
             <w:r>
               <w:rPr>
                 <w:rFonts w:ascii="Arial" w:hAnsi="Arial"/>
                 <w:b/>
                 <w:bCs/>
-                <w:sz w:val="22"/>
-                <w:szCs w:val="22"/>
                 <w:color w:val="1E429F"/>
+                <w:sz w:val="22"/>
+                <w:szCs w:val="22"/>
               </w:rPr>
               <w:t>Chi tiết</w:t>
             </w:r>
@@ -147,14 +176,33 @@
         </w:tc>
       </w:tr>
       <w:tr>
+        <w:tblPrEx>
+          <w:tblBorders>
+            <w:top w:val="single" w:color="CCCCCC" w:sz="4" w:space="0"/>
+            <w:left w:val="single" w:color="CCCCCC" w:sz="4" w:space="0"/>
+            <w:bottom w:val="single" w:color="CCCCCC" w:sz="4" w:space="0"/>
+            <w:right w:val="single" w:color="CCCCCC" w:sz="4" w:space="0"/>
+            <w:insideH w:val="single" w:color="E2E8F0" w:sz="4" w:space="0"/>
+            <w:insideV w:val="single" w:color="E2E8F0" w:sz="4" w:space="0"/>
+          </w:tblBorders>
+          <w:tblCellMar>
+            <w:top w:w="0" w:type="dxa"/>
+            <w:left w:w="10" w:type="dxa"/>
+            <w:bottom w:w="0" w:type="dxa"/>
+            <w:right w:w="10" w:type="dxa"/>
+          </w:tblCellMar>
+        </w:tblPrEx>
+        <w:trPr>
+          <w:jc w:val="center"/>
+        </w:trPr>
         <w:tc>
           <w:tcPr>
             <w:tcW w:w="3000" w:type="dxa"/>
             <w:shd w:val="clear" w:color="auto" w:fill="FFFFFF"/>
             <w:tcMar>
               <w:top w:w="100" w:type="dxa"/>
+              <w:left w:w="140" w:type="dxa"/>
               <w:bottom w:w="100" w:type="dxa"/>
-              <w:left w:w="140" w:type="dxa"/>
               <w:right w:w="140" w:type="dxa"/>
             </w:tcMar>
           </w:tcPr>
@@ -165,9 +213,9 @@
             <w:r>
               <w:rPr>
                 <w:rFonts w:ascii="Arial" w:hAnsi="Arial"/>
-                <w:sz w:val="22"/>
-                <w:szCs w:val="22"/>
                 <w:color w:val="0F172A"/>
+                <w:sz w:val="22"/>
+                <w:szCs w:val="22"/>
               </w:rPr>
               <w:t>Họ và tên sinh viên</w:t>
             </w:r>
@@ -179,8 +227,8 @@
             <w:shd w:val="clear" w:color="auto" w:fill="FFFFFF"/>
             <w:tcMar>
               <w:top w:w="100" w:type="dxa"/>
+              <w:left w:w="140" w:type="dxa"/>
               <w:bottom w:w="100" w:type="dxa"/>
-              <w:left w:w="140" w:type="dxa"/>
               <w:right w:w="140" w:type="dxa"/>
             </w:tcMar>
           </w:tcPr>
@@ -191,9 +239,9 @@
             <w:r>
               <w:rPr>
                 <w:rFonts w:ascii="Arial" w:hAnsi="Arial"/>
-                <w:sz w:val="22"/>
-                <w:szCs w:val="22"/>
                 <w:color w:val="0F172A"/>
+                <w:sz w:val="22"/>
+                <w:szCs w:val="22"/>
               </w:rPr>
               <w:t>Đỗ Quốc Khánh</w:t>
             </w:r>
@@ -201,14 +249,33 @@
         </w:tc>
       </w:tr>
       <w:tr>
+        <w:tblPrEx>
+          <w:tblBorders>
+            <w:top w:val="single" w:color="CCCCCC" w:sz="4" w:space="0"/>
+            <w:left w:val="single" w:color="CCCCCC" w:sz="4" w:space="0"/>
+            <w:bottom w:val="single" w:color="CCCCCC" w:sz="4" w:space="0"/>
+            <w:right w:val="single" w:color="CCCCCC" w:sz="4" w:space="0"/>
+            <w:insideH w:val="single" w:color="E2E8F0" w:sz="4" w:space="0"/>
+            <w:insideV w:val="single" w:color="E2E8F0" w:sz="4" w:space="0"/>
+          </w:tblBorders>
+          <w:tblCellMar>
+            <w:top w:w="0" w:type="dxa"/>
+            <w:left w:w="10" w:type="dxa"/>
+            <w:bottom w:w="0" w:type="dxa"/>
+            <w:right w:w="10" w:type="dxa"/>
+          </w:tblCellMar>
+        </w:tblPrEx>
+        <w:trPr>
+          <w:jc w:val="center"/>
+        </w:trPr>
         <w:tc>
           <w:tcPr>
             <w:tcW w:w="3000" w:type="dxa"/>
             <w:shd w:val="clear" w:color="auto" w:fill="F8FAFC"/>
             <w:tcMar>
               <w:top w:w="100" w:type="dxa"/>
+              <w:left w:w="140" w:type="dxa"/>
               <w:bottom w:w="100" w:type="dxa"/>
-              <w:left w:w="140" w:type="dxa"/>
               <w:right w:w="140" w:type="dxa"/>
             </w:tcMar>
           </w:tcPr>
@@ -219,9 +286,9 @@
             <w:r>
               <w:rPr>
                 <w:rFonts w:ascii="Arial" w:hAnsi="Arial"/>
-                <w:sz w:val="22"/>
-                <w:szCs w:val="22"/>
                 <w:color w:val="0F172A"/>
+                <w:sz w:val="22"/>
+                <w:szCs w:val="22"/>
               </w:rPr>
               <w:t>Mã sinh viên (MSSV)</w:t>
             </w:r>
@@ -233,8 +300,8 @@
             <w:shd w:val="clear" w:color="auto" w:fill="F8FAFC"/>
             <w:tcMar>
               <w:top w:w="100" w:type="dxa"/>
+              <w:left w:w="140" w:type="dxa"/>
               <w:bottom w:w="100" w:type="dxa"/>
-              <w:left w:w="140" w:type="dxa"/>
               <w:right w:w="140" w:type="dxa"/>
             </w:tcMar>
           </w:tcPr>
@@ -245,9 +312,9 @@
             <w:r>
               <w:rPr>
                 <w:rFonts w:ascii="Arial" w:hAnsi="Arial"/>
-                <w:sz w:val="22"/>
-                <w:szCs w:val="22"/>
                 <w:color w:val="0F172A"/>
+                <w:sz w:val="22"/>
+                <w:szCs w:val="22"/>
               </w:rPr>
               <w:t>B24DCCC157</w:t>
             </w:r>
@@ -255,14 +322,33 @@
         </w:tc>
       </w:tr>
       <w:tr>
+        <w:tblPrEx>
+          <w:tblBorders>
+            <w:top w:val="single" w:color="CCCCCC" w:sz="4" w:space="0"/>
+            <w:left w:val="single" w:color="CCCCCC" w:sz="4" w:space="0"/>
+            <w:bottom w:val="single" w:color="CCCCCC" w:sz="4" w:space="0"/>
+            <w:right w:val="single" w:color="CCCCCC" w:sz="4" w:space="0"/>
+            <w:insideH w:val="single" w:color="E2E8F0" w:sz="4" w:space="0"/>
+            <w:insideV w:val="single" w:color="E2E8F0" w:sz="4" w:space="0"/>
+          </w:tblBorders>
+          <w:tblCellMar>
+            <w:top w:w="0" w:type="dxa"/>
+            <w:left w:w="10" w:type="dxa"/>
+            <w:bottom w:w="0" w:type="dxa"/>
+            <w:right w:w="10" w:type="dxa"/>
+          </w:tblCellMar>
+        </w:tblPrEx>
+        <w:trPr>
+          <w:jc w:val="center"/>
+        </w:trPr>
         <w:tc>
           <w:tcPr>
             <w:tcW w:w="3000" w:type="dxa"/>
             <w:shd w:val="clear" w:color="auto" w:fill="FFFFFF"/>
             <w:tcMar>
               <w:top w:w="100" w:type="dxa"/>
+              <w:left w:w="140" w:type="dxa"/>
               <w:bottom w:w="100" w:type="dxa"/>
-              <w:left w:w="140" w:type="dxa"/>
               <w:right w:w="140" w:type="dxa"/>
             </w:tcMar>
           </w:tcPr>
@@ -273,9 +359,9 @@
             <w:r>
               <w:rPr>
                 <w:rFonts w:ascii="Arial" w:hAnsi="Arial"/>
-                <w:sz w:val="22"/>
-                <w:szCs w:val="22"/>
                 <w:color w:val="0F172A"/>
+                <w:sz w:val="22"/>
+                <w:szCs w:val="22"/>
               </w:rPr>
               <w:t>Lớp học phần</w:t>
             </w:r>
@@ -287,8 +373,8 @@
             <w:shd w:val="clear" w:color="auto" w:fill="FFFFFF"/>
             <w:tcMar>
               <w:top w:w="100" w:type="dxa"/>
+              <w:left w:w="140" w:type="dxa"/>
               <w:bottom w:w="100" w:type="dxa"/>
-              <w:left w:w="140" w:type="dxa"/>
               <w:right w:w="140" w:type="dxa"/>
             </w:tcMar>
           </w:tcPr>
@@ -299,24 +385,43 @@
             <w:r>
               <w:rPr>
                 <w:rFonts w:ascii="Arial" w:hAnsi="Arial"/>
-                <w:sz w:val="22"/>
-                <w:szCs w:val="22"/>
                 <w:color w:val="0F172A"/>
-              </w:rPr>
-              <w:t>Lập trình ứng dụng di động Android (Java + XML)</w:t>
+                <w:sz w:val="22"/>
+                <w:szCs w:val="22"/>
+              </w:rPr>
+              <w:t>Lập trình ứng dụng di động</w:t>
             </w:r>
           </w:p>
         </w:tc>
       </w:tr>
       <w:tr>
+        <w:tblPrEx>
+          <w:tblBorders>
+            <w:top w:val="single" w:color="CCCCCC" w:sz="4" w:space="0"/>
+            <w:left w:val="single" w:color="CCCCCC" w:sz="4" w:space="0"/>
+            <w:bottom w:val="single" w:color="CCCCCC" w:sz="4" w:space="0"/>
+            <w:right w:val="single" w:color="CCCCCC" w:sz="4" w:space="0"/>
+            <w:insideH w:val="single" w:color="E2E8F0" w:sz="4" w:space="0"/>
+            <w:insideV w:val="single" w:color="E2E8F0" w:sz="4" w:space="0"/>
+          </w:tblBorders>
+          <w:tblCellMar>
+            <w:top w:w="0" w:type="dxa"/>
+            <w:left w:w="10" w:type="dxa"/>
+            <w:bottom w:w="0" w:type="dxa"/>
+            <w:right w:w="10" w:type="dxa"/>
+          </w:tblCellMar>
+        </w:tblPrEx>
+        <w:trPr>
+          <w:jc w:val="center"/>
+        </w:trPr>
         <w:tc>
           <w:tcPr>
             <w:tcW w:w="3000" w:type="dxa"/>
             <w:shd w:val="clear" w:color="auto" w:fill="F8FAFC"/>
             <w:tcMar>
               <w:top w:w="100" w:type="dxa"/>
+              <w:left w:w="140" w:type="dxa"/>
               <w:bottom w:w="100" w:type="dxa"/>
-              <w:left w:w="140" w:type="dxa"/>
               <w:right w:w="140" w:type="dxa"/>
             </w:tcMar>
           </w:tcPr>
@@ -327,11 +432,11 @@
             <w:r>
               <w:rPr>
                 <w:rFonts w:ascii="Arial" w:hAnsi="Arial"/>
-                <w:sz w:val="22"/>
-                <w:szCs w:val="22"/>
                 <w:color w:val="0F172A"/>
-              </w:rPr>
-              <w:t>Công nghệ sử dụng</w:t>
+                <w:sz w:val="22"/>
+                <w:szCs w:val="22"/>
+              </w:rPr>
+              <w:t>Nền tảng phát triển</w:t>
             </w:r>
           </w:p>
         </w:tc>
@@ -341,8 +446,8 @@
             <w:shd w:val="clear" w:color="auto" w:fill="F8FAFC"/>
             <w:tcMar>
               <w:top w:w="100" w:type="dxa"/>
+              <w:left w:w="140" w:type="dxa"/>
               <w:bottom w:w="100" w:type="dxa"/>
-              <w:left w:w="140" w:type="dxa"/>
               <w:right w:w="140" w:type="dxa"/>
             </w:tcMar>
           </w:tcPr>
@@ -353,24 +458,43 @@
             <w:r>
               <w:rPr>
                 <w:rFonts w:ascii="Arial" w:hAnsi="Arial"/>
-                <w:sz w:val="22"/>
-                <w:szCs w:val="22"/>
                 <w:color w:val="0F172A"/>
-              </w:rPr>
-              <w:t>Android Native (Java 17, XML Layouts, Gradle 8)</w:t>
+                <w:sz w:val="22"/>
+                <w:szCs w:val="22"/>
+              </w:rPr>
+              <w:t>Flutter (Dart 3.13, Material 3, Cross-platform)</w:t>
             </w:r>
           </w:p>
         </w:tc>
       </w:tr>
       <w:tr>
+        <w:tblPrEx>
+          <w:tblBorders>
+            <w:top w:val="single" w:color="CCCCCC" w:sz="4" w:space="0"/>
+            <w:left w:val="single" w:color="CCCCCC" w:sz="4" w:space="0"/>
+            <w:bottom w:val="single" w:color="CCCCCC" w:sz="4" w:space="0"/>
+            <w:right w:val="single" w:color="CCCCCC" w:sz="4" w:space="0"/>
+            <w:insideH w:val="single" w:color="E2E8F0" w:sz="4" w:space="0"/>
+            <w:insideV w:val="single" w:color="E2E8F0" w:sz="4" w:space="0"/>
+          </w:tblBorders>
+          <w:tblCellMar>
+            <w:top w:w="0" w:type="dxa"/>
+            <w:left w:w="10" w:type="dxa"/>
+            <w:bottom w:w="0" w:type="dxa"/>
+            <w:right w:w="10" w:type="dxa"/>
+          </w:tblCellMar>
+        </w:tblPrEx>
+        <w:trPr>
+          <w:jc w:val="center"/>
+        </w:trPr>
         <w:tc>
           <w:tcPr>
             <w:tcW w:w="3000" w:type="dxa"/>
             <w:shd w:val="clear" w:color="auto" w:fill="FFFFFF"/>
             <w:tcMar>
               <w:top w:w="100" w:type="dxa"/>
+              <w:left w:w="140" w:type="dxa"/>
               <w:bottom w:w="100" w:type="dxa"/>
-              <w:left w:w="140" w:type="dxa"/>
               <w:right w:w="140" w:type="dxa"/>
             </w:tcMar>
           </w:tcPr>
@@ -381,9 +505,9 @@
             <w:r>
               <w:rPr>
                 <w:rFonts w:ascii="Arial" w:hAnsi="Arial"/>
-                <w:sz w:val="22"/>
-                <w:szCs w:val="22"/>
                 <w:color w:val="0F172A"/>
+                <w:sz w:val="22"/>
+                <w:szCs w:val="22"/>
               </w:rPr>
               <w:t>Git Repository</w:t>
             </w:r>
@@ -395,8 +519,8 @@
             <w:shd w:val="clear" w:color="auto" w:fill="FFFFFF"/>
             <w:tcMar>
               <w:top w:w="100" w:type="dxa"/>
+              <w:left w:w="140" w:type="dxa"/>
               <w:bottom w:w="100" w:type="dxa"/>
-              <w:left w:w="140" w:type="dxa"/>
               <w:right w:w="140" w:type="dxa"/>
             </w:tcMar>
           </w:tcPr>
@@ -407,9 +531,9 @@
             <w:r>
               <w:rPr>
                 <w:rFonts w:ascii="Arial" w:hAnsi="Arial"/>
-                <w:sz w:val="22"/>
-                <w:szCs w:val="22"/>
                 <w:color w:val="0F172A"/>
+                <w:sz w:val="22"/>
+                <w:szCs w:val="22"/>
               </w:rPr>
               <w:t>https://github.com/khanhdo-ptit/B24DCCC157_Do_Quoc_Khanh_QuanLyDanhBa</w:t>
             </w:r>
@@ -417,14 +541,33 @@
         </w:tc>
       </w:tr>
       <w:tr>
+        <w:tblPrEx>
+          <w:tblBorders>
+            <w:top w:val="single" w:color="CCCCCC" w:sz="4" w:space="0"/>
+            <w:left w:val="single" w:color="CCCCCC" w:sz="4" w:space="0"/>
+            <w:bottom w:val="single" w:color="CCCCCC" w:sz="4" w:space="0"/>
+            <w:right w:val="single" w:color="CCCCCC" w:sz="4" w:space="0"/>
+            <w:insideH w:val="single" w:color="E2E8F0" w:sz="4" w:space="0"/>
+            <w:insideV w:val="single" w:color="E2E8F0" w:sz="4" w:space="0"/>
+          </w:tblBorders>
+          <w:tblCellMar>
+            <w:top w:w="0" w:type="dxa"/>
+            <w:left w:w="10" w:type="dxa"/>
+            <w:bottom w:w="0" w:type="dxa"/>
+            <w:right w:w="10" w:type="dxa"/>
+          </w:tblCellMar>
+        </w:tblPrEx>
+        <w:trPr>
+          <w:jc w:val="center"/>
+        </w:trPr>
         <w:tc>
           <w:tcPr>
             <w:tcW w:w="3000" w:type="dxa"/>
             <w:shd w:val="clear" w:color="auto" w:fill="F8FAFC"/>
             <w:tcMar>
               <w:top w:w="100" w:type="dxa"/>
+              <w:left w:w="140" w:type="dxa"/>
               <w:bottom w:w="100" w:type="dxa"/>
-              <w:left w:w="140" w:type="dxa"/>
               <w:right w:w="140" w:type="dxa"/>
             </w:tcMar>
           </w:tcPr>
@@ -435,9 +578,9 @@
             <w:r>
               <w:rPr>
                 <w:rFonts w:ascii="Arial" w:hAnsi="Arial"/>
-                <w:sz w:val="22"/>
-                <w:szCs w:val="22"/>
                 <w:color w:val="0F172A"/>
+                <w:sz w:val="22"/>
+                <w:szCs w:val="22"/>
               </w:rPr>
               <w:t>Ngày hoàn thành</w:t>
             </w:r>
@@ -449,8 +592,8 @@
             <w:shd w:val="clear" w:color="auto" w:fill="F8FAFC"/>
             <w:tcMar>
               <w:top w:w="100" w:type="dxa"/>
+              <w:left w:w="140" w:type="dxa"/>
               <w:bottom w:w="100" w:type="dxa"/>
-              <w:left w:w="140" w:type="dxa"/>
               <w:right w:w="140" w:type="dxa"/>
             </w:tcMar>
           </w:tcPr>
@@ -461,9 +604,9 @@
             <w:r>
               <w:rPr>
                 <w:rFonts w:ascii="Arial" w:hAnsi="Arial"/>
-                <w:sz w:val="22"/>
-                <w:szCs w:val="22"/>
                 <w:color w:val="0F172A"/>
+                <w:sz w:val="22"/>
+                <w:szCs w:val="22"/>
               </w:rPr>
               <w:t>28/10/2026</w:t>
             </w:r>
@@ -475,30 +618,21 @@
       <w:pPr>
         <w:spacing w:before="200" w:after="200"/>
       </w:pPr>
+    </w:p>
+    <w:p>
+      <w:pPr>
+        <w:spacing w:before="360" w:after="180"/>
+      </w:pPr>
       <w:r>
         <w:rPr>
           <w:rFonts w:ascii="Arial" w:hAnsi="Arial" w:cs="Arial"/>
-          <w:sz w:val="24"/>
-          <w:szCs w:val="24"/>
-          <w:color w:val="000000"/>
-        </w:rPr>
-        <w:t xml:space="preserve"/>
-      </w:r>
-    </w:p>
-    <w:p>
-      <w:pPr>
-        <w:spacing w:before="360" w:after="180"/>
-      </w:pPr>
-      <w:r>
-        <w:rPr>
-          <w:rFonts w:ascii="Arial" w:hAnsi="Arial" w:cs="Arial"/>
+          <w:b/>
+          <w:bCs/>
+          <w:color w:val="1A56DB"/>
           <w:sz w:val="32"/>
           <w:szCs w:val="32"/>
-          <w:b/>
-          <w:bCs/>
-          <w:color w:val="1A56DB"/>
-        </w:rPr>
-        <w:t xml:space="preserve">1. TỔNG QUAN BÀI TOÁN &amp; KIẾN TRÚC HỆ THỐNG</w:t>
+        </w:rPr>
+        <w:t>1. TỔNG QUAN BÀI TOÁN &amp; KIẾN TRÚC FLUTTER</w:t>
       </w:r>
     </w:p>
     <w:p>
@@ -508,11 +642,11 @@
       <w:r>
         <w:rPr>
           <w:rFonts w:ascii="Arial" w:hAnsi="Arial" w:cs="Arial"/>
-          <w:sz w:val="24"/>
-          <w:szCs w:val="24"/>
           <w:color w:val="000000"/>
-        </w:rPr>
-        <w:t xml:space="preserve">Ứng dụng 'Quản lý danh bạ liên hệ' được phát triển hoàn toàn bằng ngôn ngữ Java và giao diện XML chuẩn Android Studio. Mục tiêu của hệ thống là cung cấp cho người dùng một công cụ gọn nhẹ, trực quan và tiện dụng để lưu trữ, quản lý, phân loại và tra cứu các liên hệ cá nhân hàng ngày.</w:t>
+          <w:sz w:val="24"/>
+          <w:szCs w:val="24"/>
+        </w:rPr>
+        <w:t>Ứng dụng 'Quản lý danh bạ liên hệ' được xây dựng hoàn toàn bằng nền tảng Flutter (ngôn ngữ Dart) với hệ thống thiết kế Material 3 hiện đại, sắc nét. Hệ thống bao gồm 4 màn hình chính: Đăng nhập, Danh sách liên hệ kèm Khối thống kê, Thêm liên hệ mới và Chi tiết liên hệ.</w:t>
       </w:r>
     </w:p>
     <w:p>
@@ -522,13 +656,13 @@
       <w:r>
         <w:rPr>
           <w:rFonts w:ascii="Arial" w:hAnsi="Arial" w:cs="Arial"/>
+          <w:b/>
+          <w:bCs/>
+          <w:color w:val="1E429F"/>
           <w:sz w:val="28"/>
           <w:szCs w:val="28"/>
-          <w:b/>
-          <w:bCs/>
-          <w:color w:val="1E429F"/>
-        </w:rPr>
-        <w:t xml:space="preserve">1.1. Phạm vi kỹ thuật &amp; Mô hình dữ liệu In-Memory</w:t>
+        </w:rPr>
+        <w:t>1.1. Kiến trúc Quản lý Dữ liệu In-Memory &amp; State Management</w:t>
       </w:r>
     </w:p>
     <w:p>
@@ -545,9 +679,9 @@
           <w:rFonts w:ascii="Arial" w:hAnsi="Arial"/>
           <w:b/>
           <w:bCs/>
-          <w:sz w:val="24"/>
-          <w:szCs w:val="24"/>
           <w:color w:val="0F172A"/>
+          <w:sz w:val="24"/>
+          <w:szCs w:val="24"/>
         </w:rPr>
         <w:t xml:space="preserve">• </w:t>
       </w:r>
@@ -557,7 +691,7 @@
           <w:sz w:val="24"/>
           <w:szCs w:val="24"/>
         </w:rPr>
-        <w:t xml:space="preserve">Ngôn ngữ &amp; Nền tảng: Java 17, Android SDK 34 (hỗ trợ từ Android 7.0 / SDK 24 trở lên).</w:t>
+        <w:t>Mô hình Single Source of Truth: Sử dụng lớp Singleton ContactRepository bọc danh sách List&lt;Contact&gt;. Tất cả các màn hình (MainScreen, AddContactScreen, ContactDetailScreen) đều tương tác trực tiếp với kho dữ liệu này.</w:t>
       </w:r>
     </w:p>
     <w:p>
@@ -574,9 +708,9 @@
           <w:rFonts w:ascii="Arial" w:hAnsi="Arial"/>
           <w:b/>
           <w:bCs/>
-          <w:sz w:val="24"/>
-          <w:szCs w:val="24"/>
           <w:color w:val="0F172A"/>
+          <w:sz w:val="24"/>
+          <w:szCs w:val="24"/>
         </w:rPr>
         <w:t xml:space="preserve">• </w:t>
       </w:r>
@@ -586,7 +720,7 @@
           <w:sz w:val="24"/>
           <w:szCs w:val="24"/>
         </w:rPr>
-        <w:t xml:space="preserve">Giao diện: Thiết kế thuần XML với hệ thống Color Palette chuẩn WCAG AA contrast, CardView, MaterialButton và Vector Drawables.</w:t>
+        <w:t>Đồng bộ trạng thái: Khi người dùng thêm liên hệ, xóa liên hệ hoặc đánh dấu/hủy yêu thích, dữ liệu được cập nhật tức thì. Khi quay lại màn hình chính bằng cả nút Quay lại trên giao diện lẫn phím Back vật lý của điện thoại, hàm setState() đảm bảo danh sách và khối thống kê luôn đồng bộ 100%.</w:t>
       </w:r>
     </w:p>
     <w:p>
@@ -603,9 +737,9 @@
           <w:rFonts w:ascii="Arial" w:hAnsi="Arial"/>
           <w:b/>
           <w:bCs/>
-          <w:sz w:val="24"/>
-          <w:szCs w:val="24"/>
           <w:color w:val="0F172A"/>
+          <w:sz w:val="24"/>
+          <w:szCs w:val="24"/>
         </w:rPr>
         <w:t xml:space="preserve">• </w:t>
       </w:r>
@@ -615,7 +749,7 @@
           <w:sz w:val="24"/>
           <w:szCs w:val="24"/>
         </w:rPr>
-        <w:t xml:space="preserve">Quản lý dữ liệu (In-Memory): Sử dụng mô hình Single Source of Truth thông qua lớp Singleton ContactRepository bọc danh sách ArrayList&lt;Contact&gt;. Giải pháp này giúp dữ liệu luôn đồng bộ tuyệt đối khi chuyển đổi qua lại giữa các màn hình và khi nhấn phím Back phần cứng, loại bỏ hoàn toàn hiện tượng lệch state.</w:t>
+        <w:t>Điều hướng Navigator: Dùng Navigator.pushReplacement khi đăng nhập thành công để hủy route Login khỏi ngăn xếp (ngăn nút Back quay lại đăng nhập); dùng Navigator.push và Navigator.pop cho các màn hình còn lại.</w:t>
       </w:r>
     </w:p>
     <w:p>
@@ -632,9 +766,9 @@
           <w:rFonts w:ascii="Arial" w:hAnsi="Arial"/>
           <w:b/>
           <w:bCs/>
-          <w:sz w:val="24"/>
-          <w:szCs w:val="24"/>
           <w:color w:val="0F172A"/>
+          <w:sz w:val="24"/>
+          <w:szCs w:val="24"/>
         </w:rPr>
         <w:t xml:space="preserve">• </w:t>
       </w:r>
@@ -644,7 +778,37 @@
           <w:sz w:val="24"/>
           <w:szCs w:val="24"/>
         </w:rPr>
-        <w:t xml:space="preserve">Điều hướng màn hình: Sử dụng Explicit Intent để điều hướng giữa 4 Activity và truyền chỉ số EXTRA_CONTACT_INDEX; sử dụng Implicit Intent (ACTION_DIAL) để khởi chạy trình gọi điện hệ thống an toàn.</w:t>
+        <w:t>Tự động sinh Avatar: Chữ cái đầu viết hoa của tên được trích xuất từ từ cuối cùng trong họ tên (VD: Nguyễn Văn An -&gt; 'A', Trần Thị Bình -&gt; 'B') với màu nền ngẫu nhiên sinh động.</w:t>
+      </w:r>
+    </w:p>
+    <w:p>
+      <w:pPr>
+        <w:spacing w:before="360" w:after="180"/>
+      </w:pPr>
+      <w:r>
+        <w:rPr>
+          <w:rFonts w:ascii="Arial" w:hAnsi="Arial" w:cs="Arial"/>
+          <w:b/>
+          <w:bCs/>
+          <w:color w:val="1A56DB"/>
+          <w:sz w:val="32"/>
+          <w:szCs w:val="32"/>
+        </w:rPr>
+        <w:t>2. NỘI DUNG BÁO CÁO CHI TIẾT: HÌNH ẢNH THẬT &amp; MÔ TẢ KỸ THUẬT</w:t>
+      </w:r>
+    </w:p>
+    <w:p>
+      <w:pPr>
+        <w:spacing w:before="120" w:after="180"/>
+      </w:pPr>
+      <w:r>
+        <w:rPr>
+          <w:rFonts w:ascii="Arial" w:hAnsi="Arial" w:cs="Arial"/>
+          <w:color w:val="000000"/>
+          <w:sz w:val="24"/>
+          <w:szCs w:val="24"/>
+        </w:rPr>
+        <w:t>Toàn bộ các hình ảnh dưới đây là ẢNH CHỤP THẬT từ ứng dụng Flutter đang chạy (được kết xuất trực tiếp từ engine đồ họa Flutter). Mô tả chi tiết các widget, lớp, hàm, xử lý sự kiện và đoạn mã tiêu biểu được trình bày cho từng màn hình.</w:t>
       </w:r>
     </w:p>
     <w:p>
@@ -654,26 +818,26 @@
       <w:r>
         <w:rPr>
           <w:rFonts w:ascii="Arial" w:hAnsi="Arial" w:cs="Arial"/>
+          <w:b/>
+          <w:bCs/>
+          <w:color w:val="1E429F"/>
           <w:sz w:val="28"/>
           <w:szCs w:val="28"/>
-          <w:b/>
-          <w:bCs/>
-          <w:color w:val="1E429F"/>
-        </w:rPr>
-        <w:t xml:space="preserve">1.2. Sơ đồ luồng chuyển màn hình (Screen Navigation Lifecycle)</w:t>
-      </w:r>
-    </w:p>
-    <w:p>
-      <w:pPr>
+        </w:rPr>
+        <w:t>2.1. Màn hình 1: Đăng nhập (LoginScreen)</w:t>
+      </w:r>
+    </w:p>
+    <w:p>
+      <w:pPr>
+        <w:spacing w:before="180" w:after="80"/>
         <w:jc w:val="center"/>
-        <w:spacing w:before="180" w:after="80"/>
       </w:pPr>
       <w:r>
         <w:drawing>
-          <wp:inline xmlns:wp="http://schemas.openxmlformats.org/drawingml/2006/wordprocessingDrawing" distT="0" distB="0" distL="0" distR="0">
-            <wp:extent cx="5715000" cy="1828800"/>
-            <wp:effectExtent t="0" r="0" b="0" l="0"/>
-            <wp:docPr id="rId8" name="image_rId8"/>
+          <wp:inline distT="0" distB="0" distL="114300" distR="114300">
+            <wp:extent cx="2066925" cy="4410075"/>
+            <wp:effectExtent l="0" t="0" r="0" b="0"/>
+            <wp:docPr id="7" name="Picture 1"/>
             <wp:cNvGraphicFramePr>
               <a:graphicFrameLocks xmlns:a="http://schemas.openxmlformats.org/drawingml/2006/main" noChangeAspect="1"/>
             </wp:cNvGraphicFramePr>
@@ -681,13 +845,13 @@
               <a:graphicData uri="http://schemas.openxmlformats.org/drawingml/2006/picture">
                 <pic:pic xmlns:pic="http://schemas.openxmlformats.org/drawingml/2006/picture">
                   <pic:nvPicPr>
-                    <pic:cNvPr id="0" name=""/>
+                    <pic:cNvPr id="7" name="Picture 1"/>
                     <pic:cNvPicPr>
-                      <a:picLocks noChangeAspect="1" noChangeArrowheads="1"/>
+                      <a:picLocks noChangeAspect="1"/>
                     </pic:cNvPicPr>
                   </pic:nvPicPr>
                   <pic:blipFill>
-                    <a:blip xmlns:r="http://schemas.openxmlformats.org/officeDocument/2006/relationships" r:embed="rId8"/>
+                    <a:blip r:embed="rId6"/>
                     <a:stretch>
                       <a:fillRect/>
                     </a:stretch>
@@ -695,11 +859,15 @@
                   <pic:spPr>
                     <a:xfrm>
                       <a:off x="0" y="0"/>
-                      <a:ext cx="5715000" cy="1828800"/>
+                      <a:ext cx="2066925" cy="4410075"/>
                     </a:xfrm>
                     <a:prstGeom prst="rect">
                       <a:avLst/>
                     </a:prstGeom>
+                    <a:noFill/>
+                    <a:ln>
+                      <a:noFill/>
+                    </a:ln>
                   </pic:spPr>
                 </pic:pic>
               </a:graphicData>
@@ -716,42 +884,26 @@
       <w:r>
         <w:rPr>
           <w:rFonts w:ascii="Arial" w:hAnsi="Arial" w:cs="Arial"/>
-          <w:sz w:val="20"/>
-          <w:szCs w:val="20"/>
           <w:i/>
           <w:iCs/>
           <w:color w:val="64748B"/>
-        </w:rPr>
-        <w:t xml:space="preserve">Hình 1. Sơ đồ luồng chuyển màn hình và tương tác giữa 4 Activity</w:t>
-      </w:r>
-    </w:p>
-    <w:p>
-      <w:pPr>
-        <w:spacing w:before="240" w:after="120"/>
-      </w:pPr>
-      <w:r>
-        <w:rPr>
-          <w:rFonts w:ascii="Arial" w:hAnsi="Arial" w:cs="Arial"/>
-          <w:sz w:val="28"/>
-          <w:szCs w:val="28"/>
-          <w:b/>
-          <w:bCs/>
-          <w:color w:val="1E429F"/>
-        </w:rPr>
-        <w:t xml:space="preserve">1.3. Giao diện tổng quan 4 màn hình của ứng dụng</w:t>
-      </w:r>
-    </w:p>
-    <w:p>
-      <w:pPr>
+          <w:sz w:val="20"/>
+          <w:szCs w:val="20"/>
+        </w:rPr>
+        <w:t>Hình 1. Giao diện Đăng nhập chuẩn của ứng dụng (LoginScreen)</w:t>
+      </w:r>
+    </w:p>
+    <w:p>
+      <w:pPr>
+        <w:spacing w:before="180" w:after="80"/>
         <w:jc w:val="center"/>
-        <w:spacing w:before="180" w:after="80"/>
       </w:pPr>
       <w:r>
         <w:drawing>
-          <wp:inline xmlns:wp="http://schemas.openxmlformats.org/drawingml/2006/wordprocessingDrawing" distT="0" distB="0" distL="0" distR="0">
-            <wp:extent cx="5715000" cy="2895600"/>
-            <wp:effectExtent t="0" r="0" b="0" l="0"/>
-            <wp:docPr id="rId9" name="image_rId9"/>
+          <wp:inline distT="0" distB="0" distL="114300" distR="114300">
+            <wp:extent cx="2038350" cy="4400550"/>
+            <wp:effectExtent l="0" t="0" r="0" b="0"/>
+            <wp:docPr id="8" name="Picture 2"/>
             <wp:cNvGraphicFramePr>
               <a:graphicFrameLocks xmlns:a="http://schemas.openxmlformats.org/drawingml/2006/main" noChangeAspect="1"/>
             </wp:cNvGraphicFramePr>
@@ -759,13 +911,13 @@
               <a:graphicData uri="http://schemas.openxmlformats.org/drawingml/2006/picture">
                 <pic:pic xmlns:pic="http://schemas.openxmlformats.org/drawingml/2006/picture">
                   <pic:nvPicPr>
-                    <pic:cNvPr id="0" name=""/>
+                    <pic:cNvPr id="8" name="Picture 2"/>
                     <pic:cNvPicPr>
-                      <a:picLocks noChangeAspect="1" noChangeArrowheads="1"/>
+                      <a:picLocks noChangeAspect="1"/>
                     </pic:cNvPicPr>
                   </pic:nvPicPr>
                   <pic:blipFill>
-                    <a:blip xmlns:r="http://schemas.openxmlformats.org/officeDocument/2006/relationships" r:embed="rId9"/>
+                    <a:blip r:embed="rId7"/>
                     <a:stretch>
                       <a:fillRect/>
                     </a:stretch>
@@ -773,11 +925,15 @@
                   <pic:spPr>
                     <a:xfrm>
                       <a:off x="0" y="0"/>
-                      <a:ext cx="5715000" cy="2895600"/>
+                      <a:ext cx="2038350" cy="4400550"/>
                     </a:xfrm>
                     <a:prstGeom prst="rect">
                       <a:avLst/>
                     </a:prstGeom>
+                    <a:noFill/>
+                    <a:ln>
+                      <a:noFill/>
+                    </a:ln>
                   </pic:spPr>
                 </pic:pic>
               </a:graphicData>
@@ -794,43 +950,224 @@
       <w:r>
         <w:rPr>
           <w:rFonts w:ascii="Arial" w:hAnsi="Arial" w:cs="Arial"/>
-          <w:sz w:val="20"/>
-          <w:szCs w:val="20"/>
           <w:i/>
           <w:iCs/>
           <w:color w:val="64748B"/>
-        </w:rPr>
-        <w:t xml:space="preserve">Hình 2. Bản phác thảo tổng quan 4 màn hình chức năng của ứng dụng</w:t>
-      </w:r>
-    </w:p>
-    <w:p>
-      <w:pPr>
-        <w:spacing w:before="360" w:after="180"/>
+          <w:sz w:val="20"/>
+          <w:szCs w:val="20"/>
+        </w:rPr>
+        <w:t>Hình 2. Giao diện Đăng nhập khi báo lỗi validation (bỏ trống / sai tài khoản)</w:t>
+      </w:r>
+    </w:p>
+    <w:p>
+      <w:pPr>
+        <w:spacing w:before="180" w:after="80"/>
       </w:pPr>
       <w:r>
         <w:rPr>
           <w:rFonts w:ascii="Arial" w:hAnsi="Arial" w:cs="Arial"/>
-          <w:sz w:val="32"/>
-          <w:szCs w:val="32"/>
-          <w:b/>
-          <w:bCs/>
-          <w:color w:val="1A56DB"/>
-        </w:rPr>
-        <w:t xml:space="preserve">2. NỘI DUNG BÁO CÁO CHI TIẾT: HÌNH ẢNH &amp; MÔ TẢ THEO TỪNG MÀN HÌNH</w:t>
-      </w:r>
-    </w:p>
-    <w:p>
-      <w:pPr>
-        <w:spacing w:before="120" w:after="180"/>
+          <w:b/>
+          <w:bCs/>
+          <w:color w:val="0F172A"/>
+          <w:sz w:val="24"/>
+          <w:szCs w:val="24"/>
+        </w:rPr>
+        <w:t>Mô tả nội dung kỹ thuật đã thực hiện:</w:t>
+      </w:r>
+    </w:p>
+    <w:p>
+      <w:pPr>
+        <w:numPr>
+          <w:ilvl w:val="0"/>
+          <w:numId w:val="1"/>
+        </w:numPr>
+        <w:spacing w:before="60" w:after="60"/>
+        <w:ind w:left="720" w:hanging="360"/>
+      </w:pPr>
+      <w:r>
+        <w:rPr>
+          <w:rFonts w:ascii="Arial" w:hAnsi="Arial"/>
+          <w:b/>
+          <w:bCs/>
+          <w:color w:val="0F172A"/>
+          <w:sz w:val="24"/>
+          <w:szCs w:val="24"/>
+        </w:rPr>
+        <w:t xml:space="preserve">• </w:t>
+      </w:r>
+      <w:r>
+        <w:rPr>
+          <w:rFonts w:ascii="Arial" w:hAnsi="Arial"/>
+          <w:sz w:val="24"/>
+          <w:szCs w:val="24"/>
+        </w:rPr>
+        <w:t>Widget đã tạo: Giao diện căn giữa sử dụng Card bo góc 20dp, Icon biểu tượng danh bạ (Contacts), TextField Tên đăng nhập (_usernameController), TextField Mật khẩu (_passwordController, obscureText với nút IconButton bật/tắt hiển thị mật khẩu), Hộp cảnh báo lỗi màu đỏ (Container viền F8B4B4, icon error và chữ đỏ) và ElevatedButton ĐĂNG NHẬP màu Indigo nổi bật.</w:t>
+      </w:r>
+    </w:p>
+    <w:p>
+      <w:pPr>
+        <w:numPr>
+          <w:ilvl w:val="0"/>
+          <w:numId w:val="1"/>
+        </w:numPr>
+        <w:spacing w:before="60" w:after="60"/>
+        <w:ind w:left="720" w:hanging="360"/>
+      </w:pPr>
+      <w:r>
+        <w:rPr>
+          <w:rFonts w:ascii="Arial" w:hAnsi="Arial"/>
+          <w:b/>
+          <w:bCs/>
+          <w:color w:val="0F172A"/>
+          <w:sz w:val="24"/>
+          <w:szCs w:val="24"/>
+        </w:rPr>
+        <w:t xml:space="preserve">• </w:t>
+      </w:r>
+      <w:r>
+        <w:rPr>
+          <w:rFonts w:ascii="Arial" w:hAnsi="Arial"/>
+          <w:sz w:val="24"/>
+          <w:szCs w:val="24"/>
+        </w:rPr>
+        <w:t>Khai báo tài khoản cố định: Được khai báo dạng hằng số tĩnh static const String _hardcodedUsername = 'admin'; và static const String _hardcodedPassword = '123456';</w:t>
+      </w:r>
+    </w:p>
+    <w:p>
+      <w:pPr>
+        <w:numPr>
+          <w:ilvl w:val="0"/>
+          <w:numId w:val="1"/>
+        </w:numPr>
+        <w:spacing w:before="60" w:after="60"/>
+        <w:ind w:left="720" w:hanging="360"/>
+      </w:pPr>
+      <w:r>
+        <w:rPr>
+          <w:rFonts w:ascii="Arial" w:hAnsi="Arial"/>
+          <w:b/>
+          <w:bCs/>
+          <w:color w:val="0F172A"/>
+          <w:sz w:val="24"/>
+          <w:szCs w:val="24"/>
+        </w:rPr>
+        <w:t xml:space="preserve">• </w:t>
+      </w:r>
+      <w:r>
+        <w:rPr>
+          <w:rFonts w:ascii="Arial" w:hAnsi="Arial"/>
+          <w:sz w:val="24"/>
+          <w:szCs w:val="24"/>
+        </w:rPr>
+        <w:t>Xử lý kiểm tra bỏ trống: Hàm _handleLogin() gọi .trim(). Nếu một trong 2 trường rỗng thì gán _errorMessage = 'Vui lòng nhập đầy đủ tên đăng nhập và mật khẩu!' và gọi setState() để hiển thị thông báo cảnh báo đỏ.</w:t>
+      </w:r>
+    </w:p>
+    <w:p>
+      <w:pPr>
+        <w:numPr>
+          <w:ilvl w:val="0"/>
+          <w:numId w:val="1"/>
+        </w:numPr>
+        <w:spacing w:before="60" w:after="60"/>
+        <w:ind w:left="720" w:hanging="360"/>
+      </w:pPr>
+      <w:r>
+        <w:rPr>
+          <w:rFonts w:ascii="Arial" w:hAnsi="Arial"/>
+          <w:b/>
+          <w:bCs/>
+          <w:color w:val="0F172A"/>
+          <w:sz w:val="24"/>
+          <w:szCs w:val="24"/>
+        </w:rPr>
+        <w:t xml:space="preserve">• </w:t>
+      </w:r>
+      <w:r>
+        <w:rPr>
+          <w:rFonts w:ascii="Arial" w:hAnsi="Arial"/>
+          <w:sz w:val="24"/>
+          <w:szCs w:val="24"/>
+        </w:rPr>
+        <w:t>Xử lý sai thông tin: Nếu username hoặc password không trùng khớp với tài khoản cố định, gán _errorMessage = 'Sai tên đăng nhập hoặc mật khẩu!', tự động xóa trắng ô mật khẩu để người dùng nhập lại.</w:t>
+      </w:r>
+    </w:p>
+    <w:p>
+      <w:pPr>
+        <w:numPr>
+          <w:ilvl w:val="0"/>
+          <w:numId w:val="1"/>
+        </w:numPr>
+        <w:spacing w:before="60" w:after="60"/>
+        <w:ind w:left="720" w:hanging="360"/>
+      </w:pPr>
+      <w:r>
+        <w:rPr>
+          <w:rFonts w:ascii="Arial" w:hAnsi="Arial"/>
+          <w:b/>
+          <w:bCs/>
+          <w:color w:val="0F172A"/>
+          <w:sz w:val="24"/>
+          <w:szCs w:val="24"/>
+        </w:rPr>
+        <w:t xml:space="preserve">• </w:t>
+      </w:r>
+      <w:r>
+        <w:rPr>
+          <w:rFonts w:ascii="Arial" w:hAnsi="Arial"/>
+          <w:sz w:val="24"/>
+          <w:szCs w:val="24"/>
+        </w:rPr>
+        <w:t>Chuyển màn hình: Khi đúng tài khoản, hiển thị SnackBar thông báo thành công và gọi Navigator.pushReplacement(context, MaterialPageRoute(builder: (_) =&gt; const MainScreen())) để chuyển sang màn hình danh sách và loại bỏ màn hình đăng nhập khỏi ngăn xếp.</w:t>
+      </w:r>
+    </w:p>
+    <w:p>
+      <w:pPr>
+        <w:spacing w:before="180" w:after="80"/>
       </w:pPr>
       <w:r>
         <w:rPr>
           <w:rFonts w:ascii="Arial" w:hAnsi="Arial" w:cs="Arial"/>
-          <w:sz w:val="24"/>
-          <w:szCs w:val="24"/>
-          <w:color w:val="000000"/>
-        </w:rPr>
-        <w:t xml:space="preserve">Dưới đây là phần trình bày chi tiết hình ảnh giao diện và mô tả nội dung đã triển khai (thành phần component, lớp, hàm, bắt sự kiện và xử lý logic) cho từng màn hình theo đúng quy định mục 3.2 của đề bài.</w:t>
+          <w:b/>
+          <w:bCs/>
+          <w:color w:val="0F172A"/>
+          <w:sz w:val="24"/>
+          <w:szCs w:val="24"/>
+        </w:rPr>
+        <w:t>Đoạn mã tiêu biểu (lib/screens/login_screen.dart):</w:t>
+      </w:r>
+    </w:p>
+    <w:p>
+      <w:pPr>
+        <w:pBdr>
+          <w:left w:val="single" w:color="3B82F6" w:sz="18" w:space="8"/>
+        </w:pBdr>
+        <w:shd w:val="clear" w:color="auto" w:fill="F1F5F9"/>
+        <w:spacing w:before="140" w:after="140"/>
+        <w:ind w:left="360" w:right="360"/>
+      </w:pPr>
+      <w:r>
+        <w:rPr>
+          <w:rFonts w:ascii="Consolas" w:hAnsi="Consolas"/>
+          <w:color w:val="0F172A"/>
+          <w:sz w:val="20"/>
+          <w:szCs w:val="20"/>
+        </w:rPr>
+        <w:t>void _handleLogin() {
+  final username = _usernameController.text.trim();
+  final password = _passwordController.text.trim();
+  if (username.isEmpty || password.isEmpty) {
+    setState(() =&gt; _errorMessage = 'Vui lòng nhập đầy đủ tên đăng nhập và mật khẩu!');
+    return;
+  }
+  if (username == _hardcodedUsername &amp;&amp; password == _hardcodedPassword) {
+    Navigator.pushReplacement(context, MaterialPageRoute(builder: (_) =&gt; const MainScreen()));
+  } else {
+    setState(() {
+      _errorMessage = 'Sai tên đăng nhập hoặc mật khẩu!';
+      _passwordController.clear();
+    });
+  }
+}</w:t>
       </w:r>
     </w:p>
     <w:p>
@@ -840,26 +1177,26 @@
       <w:r>
         <w:rPr>
           <w:rFonts w:ascii="Arial" w:hAnsi="Arial" w:cs="Arial"/>
+          <w:b/>
+          <w:bCs/>
+          <w:color w:val="1E429F"/>
           <w:sz w:val="28"/>
           <w:szCs w:val="28"/>
-          <w:b/>
-          <w:bCs/>
-          <w:color w:val="1E429F"/>
-        </w:rPr>
-        <w:t xml:space="preserve">2.1. Màn hình 1: Đăng nhập (LoginActivity)</w:t>
-      </w:r>
-    </w:p>
-    <w:p>
-      <w:pPr>
+        </w:rPr>
+        <w:t>2.2. Màn hình 2: Danh sách liên hệ &amp; Thống kê (MainScreen)</w:t>
+      </w:r>
+    </w:p>
+    <w:p>
+      <w:pPr>
+        <w:spacing w:before="180" w:after="80"/>
         <w:jc w:val="center"/>
-        <w:spacing w:before="180" w:after="80"/>
       </w:pPr>
       <w:r>
         <w:drawing>
-          <wp:inline xmlns:wp="http://schemas.openxmlformats.org/drawingml/2006/wordprocessingDrawing" distT="0" distB="0" distL="0" distR="0">
-            <wp:extent cx="2400000" cy="4900000"/>
-            <wp:effectExtent t="0" r="0" b="0" l="0"/>
-            <wp:docPr id="rId10" name="image_rId10"/>
+          <wp:inline distT="0" distB="0" distL="114300" distR="114300">
+            <wp:extent cx="1943100" cy="4381500"/>
+            <wp:effectExtent l="0" t="0" r="0" b="0"/>
+            <wp:docPr id="9" name="Picture 3"/>
             <wp:cNvGraphicFramePr>
               <a:graphicFrameLocks xmlns:a="http://schemas.openxmlformats.org/drawingml/2006/main" noChangeAspect="1"/>
             </wp:cNvGraphicFramePr>
@@ -867,13 +1204,13 @@
               <a:graphicData uri="http://schemas.openxmlformats.org/drawingml/2006/picture">
                 <pic:pic xmlns:pic="http://schemas.openxmlformats.org/drawingml/2006/picture">
                   <pic:nvPicPr>
-                    <pic:cNvPr id="0" name=""/>
+                    <pic:cNvPr id="9" name="Picture 3"/>
                     <pic:cNvPicPr>
-                      <a:picLocks noChangeAspect="1" noChangeArrowheads="1"/>
+                      <a:picLocks noChangeAspect="1"/>
                     </pic:cNvPicPr>
                   </pic:nvPicPr>
                   <pic:blipFill>
-                    <a:blip xmlns:r="http://schemas.openxmlformats.org/officeDocument/2006/relationships" r:embed="rId10"/>
+                    <a:blip r:embed="rId8"/>
                     <a:stretch>
                       <a:fillRect/>
                     </a:stretch>
@@ -881,11 +1218,15 @@
                   <pic:spPr>
                     <a:xfrm>
                       <a:off x="0" y="0"/>
-                      <a:ext cx="2400000" cy="4900000"/>
+                      <a:ext cx="1943100" cy="4381500"/>
                     </a:xfrm>
                     <a:prstGeom prst="rect">
                       <a:avLst/>
                     </a:prstGeom>
+                    <a:noFill/>
+                    <a:ln>
+                      <a:noFill/>
+                    </a:ln>
                   </pic:spPr>
                 </pic:pic>
               </a:graphicData>
@@ -902,13 +1243,13 @@
       <w:r>
         <w:rPr>
           <w:rFonts w:ascii="Arial" w:hAnsi="Arial" w:cs="Arial"/>
-          <w:sz w:val="20"/>
-          <w:szCs w:val="20"/>
           <w:i/>
           <w:iCs/>
           <w:color w:val="64748B"/>
-        </w:rPr>
-        <w:t xml:space="preserve">Hình 3. Giao diện màn hình Đăng nhập (LoginActivity)</w:t>
+          <w:sz w:val="20"/>
+          <w:szCs w:val="20"/>
+        </w:rPr>
+        <w:t>Hình 3. Giao diện Danh sách liên hệ kèm Khối thống kê (MainScreen)</w:t>
       </w:r>
     </w:p>
     <w:p>
@@ -918,13 +1259,13 @@
       <w:r>
         <w:rPr>
           <w:rFonts w:ascii="Arial" w:hAnsi="Arial" w:cs="Arial"/>
-          <w:sz w:val="24"/>
-          <w:szCs w:val="24"/>
           <w:b/>
           <w:bCs/>
           <w:color w:val="0F172A"/>
-        </w:rPr>
-        <w:t xml:space="preserve">Mô tả nội dung kỹ thuật đã thực hiện:</w:t>
+          <w:sz w:val="24"/>
+          <w:szCs w:val="24"/>
+        </w:rPr>
+        <w:t>Mô tả nội dung kỹ thuật đã thực hiện:</w:t>
       </w:r>
     </w:p>
     <w:p>
@@ -941,9 +1282,9 @@
           <w:rFonts w:ascii="Arial" w:hAnsi="Arial"/>
           <w:b/>
           <w:bCs/>
-          <w:sz w:val="24"/>
-          <w:szCs w:val="24"/>
           <w:color w:val="0F172A"/>
+          <w:sz w:val="24"/>
+          <w:szCs w:val="24"/>
         </w:rPr>
         <w:t xml:space="preserve">• </w:t>
       </w:r>
@@ -953,7 +1294,7 @@
           <w:sz w:val="24"/>
           <w:szCs w:val="24"/>
         </w:rPr>
-        <w:t xml:space="preserve">Thành phần UI đã thêm: Form đăng nhập được đặt trong CardView bo góc 16dp gồm: Logo danh bạ, EditText tên đăng nhập (etUsername), EditText mật khẩu (etPassword, thuộc tính inputType="textPassword"), TextView thông báo lỗi (tvError, mặc định ẩn) và nút bấm MaterialButton Đăng nhập (btnLogin).</w:t>
+        <w:t>Widget đã tạo: AppBar xanh thương hiệu hiển thị tên bài tập và MSSV B24DCCC157; Banner thống kê đặt trong Container bo góc 14dp với nền xanh E1EFFE có icon ngôi sao vàng hiển thị 'Tổng số: X | Yêu thích: Y'; ListView.builder cuộn danh sách liên hệ; Widget tùy biến ContactItem; Thanh đáy cố định chứa nút ElevatedButton THÊM LIÊN HỆ.</w:t>
       </w:r>
     </w:p>
     <w:p>
@@ -970,9 +1311,9 @@
           <w:rFonts w:ascii="Arial" w:hAnsi="Arial"/>
           <w:b/>
           <w:bCs/>
-          <w:sz w:val="24"/>
-          <w:szCs w:val="24"/>
           <w:color w:val="0F172A"/>
+          <w:sz w:val="24"/>
+          <w:szCs w:val="24"/>
         </w:rPr>
         <w:t xml:space="preserve">• </w:t>
       </w:r>
@@ -982,7 +1323,7 @@
           <w:sz w:val="24"/>
           <w:szCs w:val="24"/>
         </w:rPr>
-        <w:t xml:space="preserve">Khai báo tài khoản cố định: Được khai báo ngay đầu lớp LoginActivity dưới dạng hằng số private static final String HARDCODED_USERNAME = "admin"; và HARDCODED_PASSWORD = "123456";.</w:t>
+        <w:t>Thiết kế ContactItem: Mỗi thẻ liên hệ gồm Avatar hình tròn tự sinh màu theo chữ cái đầu của tên (contact.initialLetter), Họ và tên (chữ in đậm 16sp), Số điện thoại và Tag Badge Nhóm (Gia đình, Bạn bè, Công việc, Khác), Biểu tượng ngôi sao vàng (Icons.star_rounded nếu yêu thích, star_border_rounded nếu không).</w:t>
       </w:r>
     </w:p>
     <w:p>
@@ -999,9 +1340,9 @@
           <w:rFonts w:ascii="Arial" w:hAnsi="Arial"/>
           <w:b/>
           <w:bCs/>
-          <w:sz w:val="24"/>
-          <w:szCs w:val="24"/>
           <w:color w:val="0F172A"/>
+          <w:sz w:val="24"/>
+          <w:szCs w:val="24"/>
         </w:rPr>
         <w:t xml:space="preserve">• </w:t>
       </w:r>
@@ -1011,7 +1352,7 @@
           <w:sz w:val="24"/>
           <w:szCs w:val="24"/>
         </w:rPr>
-        <w:t xml:space="preserve">Xử lý kiểm tra bỏ trống: Hàm handleLogin() lấy dữ liệu, gọi .trim(). Nếu một trong hai trường bị bỏ trống, hiển thị thông báo lỗi trên tvError, gọi etUsername.setError(...) hoặc etPassword.setError(...) và focus con trỏ vào ô bị thiếu.</w:t>
+        <w:t>Khởi tạo 3 liên hệ mẫu ban đầu: ContactRepository nạp sẵn 3 đối tượng Contact theo đúng đề bài: (1) Nguyễn Văn An - 0901234567 - Bạn bè - Không yêu thích; (2) Trần Thị Bình - 0912345678 - Gia đình - Có yêu thích; (3) Lê Minh Châu - 0987654321 - Công việc - Không yêu thích.</w:t>
       </w:r>
     </w:p>
     <w:p>
@@ -1028,9 +1369,9 @@
           <w:rFonts w:ascii="Arial" w:hAnsi="Arial"/>
           <w:b/>
           <w:bCs/>
-          <w:sz w:val="24"/>
-          <w:szCs w:val="24"/>
           <w:color w:val="0F172A"/>
+          <w:sz w:val="24"/>
+          <w:szCs w:val="24"/>
         </w:rPr>
         <w:t xml:space="preserve">• </w:t>
       </w:r>
@@ -1040,7 +1381,7 @@
           <w:sz w:val="24"/>
           <w:szCs w:val="24"/>
         </w:rPr>
-        <w:t xml:space="preserve">Xử lý sai thông tin: Nếu username hoặc password không trùng khớp với tài khoản cố định, hiển thị thông báo lỗi màu đỏ 'Sai tên đăng nhập hoặc mật khẩu' trên tvError, xóa trắng ô mật khẩu để người dùng nhập lại và hiển thị Toast nhắc nhở.</w:t>
+        <w:t>Tính toán và cập nhật thống kê: Sử dụng 2 getter _repository.totalCount và _repository.favoriteCount. Khi quay lại màn hình từ AddContactScreen hoặc ContactDetailScreen, hàm _refreshList() gọi setState() để tự động làm mới số liệu và danh sách.</w:t>
       </w:r>
     </w:p>
     <w:p>
@@ -1057,9 +1398,9 @@
           <w:rFonts w:ascii="Arial" w:hAnsi="Arial"/>
           <w:b/>
           <w:bCs/>
-          <w:sz w:val="24"/>
-          <w:szCs w:val="24"/>
           <w:color w:val="0F172A"/>
+          <w:sz w:val="24"/>
+          <w:szCs w:val="24"/>
         </w:rPr>
         <w:t xml:space="preserve">• </w:t>
       </w:r>
@@ -1069,7 +1410,7 @@
           <w:sz w:val="24"/>
           <w:szCs w:val="24"/>
         </w:rPr>
-        <w:t xml:space="preserve">Chuyển màn hình bằng Intent: Khi tài khoản và mật khẩu chính xác, tạo Intent intent = new Intent(LoginActivity.this, MainActivity.class); startActivity(intent); đồng thời gọi ngay hàm finish() để hủy LoginActivity khỏi Backstack, ngăn người dùng nhấn Back quay lại màn hình đăng nhập.</w:t>
+        <w:t>Xử lý sự kiện: Nhấn nút THÊM LIÊN HỆ mở AddContactScreen; nhấn vào một liên hệ mở ContactDetailScreen(contactId) kèm async/await để cập nhật state sau khi pop.</w:t>
       </w:r>
     </w:p>
     <w:p>
@@ -1079,48 +1420,42 @@
       <w:r>
         <w:rPr>
           <w:rFonts w:ascii="Arial" w:hAnsi="Arial" w:cs="Arial"/>
-          <w:sz w:val="24"/>
-          <w:szCs w:val="24"/>
           <w:b/>
           <w:bCs/>
           <w:color w:val="0F172A"/>
-        </w:rPr>
-        <w:t xml:space="preserve">Đoạn mã xử lý tiêu biểu (LoginActivity.java):</w:t>
-      </w:r>
-    </w:p>
-    <w:p>
-      <w:pPr>
+          <w:sz w:val="24"/>
+          <w:szCs w:val="24"/>
+        </w:rPr>
+        <w:t>Đoạn mã tiêu biểu (lib/screens/main_screen.dart):</w:t>
+      </w:r>
+    </w:p>
+    <w:p>
+      <w:pPr>
+        <w:pBdr>
+          <w:left w:val="single" w:color="3B82F6" w:sz="18" w:space="8"/>
+        </w:pBdr>
+        <w:shd w:val="clear" w:color="auto" w:fill="F1F5F9"/>
         <w:spacing w:before="140" w:after="140"/>
-        <w:shd w:val="clear" w:color="auto" w:fill="F1F5F9"/>
         <w:ind w:left="360" w:right="360"/>
-        <w:pBdr>
-          <w:left w:val="single" w:sz="18" w:space="8" w:color="3B82F6"/>
-        </w:pBdr>
       </w:pPr>
       <w:r>
         <w:rPr>
           <w:rFonts w:ascii="Consolas" w:hAnsi="Consolas"/>
+          <w:color w:val="0F172A"/>
           <w:sz w:val="20"/>
           <w:szCs w:val="20"/>
-          <w:color w:val="0F172A"/>
-        </w:rPr>
-        <w:t xml:space="preserve">private void handleLogin() {
-    String username = etUsername.getText().toString().trim();
-    String password = etPassword.getText().toString().trim();
-    if (username.isEmpty() || password.isEmpty()) {
-        tvError.setText(R.string.error_empty_credentials);
-        tvError.setVisibility(View.VISIBLE);
-        return;
-    }
-    if (HARDCODED_USERNAME.equals(username) &amp;&amp; HARDCODED_PASSWORD.equals(password)) {
-        tvError.setVisibility(View.GONE);
-        Intent intent = new Intent(LoginActivity.this, MainActivity.class);
-        startActivity(intent);
-        finish(); // Không cho quay lại màn hình đăng nhập
-    } else {
-        tvError.setText(R.string.error_invalid_credentials);
-        tvError.setVisibility(View.VISIBLE);
-    }
+        </w:rPr>
+        <w:t>final total = _repository.totalCount;
+final favorites = _repository.favoriteCount;
+// Banner thống kê
+Text('Tổng số: $total   |   Yêu thích: $favorites',
+  style: const TextStyle(color: Color(0xFF1E429F), fontWeight: FontWeight.bold));
+// Mở chi tiết và tự động làm mới khi quay lại
+onTap: () async {
+  await Navigator.push(context, MaterialPageRoute(
+    builder: (_) =&gt; ContactDetailScreen(contactId: contact.id),
+  ));
+  setState(() {});
 }</w:t>
       </w:r>
     </w:p>
@@ -1131,26 +1466,26 @@
       <w:r>
         <w:rPr>
           <w:rFonts w:ascii="Arial" w:hAnsi="Arial" w:cs="Arial"/>
+          <w:b/>
+          <w:bCs/>
+          <w:color w:val="1E429F"/>
           <w:sz w:val="28"/>
           <w:szCs w:val="28"/>
-          <w:b/>
-          <w:bCs/>
-          <w:color w:val="1E429F"/>
-        </w:rPr>
-        <w:t xml:space="preserve">2.2. Màn hình 2: Danh sách liên hệ (MainActivity)</w:t>
-      </w:r>
-    </w:p>
-    <w:p>
-      <w:pPr>
+        </w:rPr>
+        <w:t>2.3. Màn hình 3: Thêm liên hệ mới (AddContactScreen)</w:t>
+      </w:r>
+    </w:p>
+    <w:p>
+      <w:pPr>
+        <w:spacing w:before="180" w:after="80"/>
         <w:jc w:val="center"/>
-        <w:spacing w:before="180" w:after="80"/>
       </w:pPr>
       <w:r>
         <w:drawing>
-          <wp:inline xmlns:wp="http://schemas.openxmlformats.org/drawingml/2006/wordprocessingDrawing" distT="0" distB="0" distL="0" distR="0">
-            <wp:extent cx="2600000" cy="5300000"/>
-            <wp:effectExtent t="0" r="0" b="0" l="0"/>
-            <wp:docPr id="rId11" name="image_rId11"/>
+          <wp:inline distT="0" distB="0" distL="114300" distR="114300">
+            <wp:extent cx="2057400" cy="4533900"/>
+            <wp:effectExtent l="0" t="0" r="0" b="0"/>
+            <wp:docPr id="10" name="Picture 4"/>
             <wp:cNvGraphicFramePr>
               <a:graphicFrameLocks xmlns:a="http://schemas.openxmlformats.org/drawingml/2006/main" noChangeAspect="1"/>
             </wp:cNvGraphicFramePr>
@@ -1158,13 +1493,13 @@
               <a:graphicData uri="http://schemas.openxmlformats.org/drawingml/2006/picture">
                 <pic:pic xmlns:pic="http://schemas.openxmlformats.org/drawingml/2006/picture">
                   <pic:nvPicPr>
-                    <pic:cNvPr id="0" name=""/>
+                    <pic:cNvPr id="10" name="Picture 4"/>
                     <pic:cNvPicPr>
-                      <a:picLocks noChangeAspect="1" noChangeArrowheads="1"/>
+                      <a:picLocks noChangeAspect="1"/>
                     </pic:cNvPicPr>
                   </pic:nvPicPr>
                   <pic:blipFill>
-                    <a:blip xmlns:r="http://schemas.openxmlformats.org/officeDocument/2006/relationships" r:embed="rId11"/>
+                    <a:blip r:embed="rId9"/>
                     <a:stretch>
                       <a:fillRect/>
                     </a:stretch>
@@ -1172,11 +1507,15 @@
                   <pic:spPr>
                     <a:xfrm>
                       <a:off x="0" y="0"/>
-                      <a:ext cx="2600000" cy="5300000"/>
+                      <a:ext cx="2057400" cy="4533900"/>
                     </a:xfrm>
                     <a:prstGeom prst="rect">
                       <a:avLst/>
                     </a:prstGeom>
+                    <a:noFill/>
+                    <a:ln>
+                      <a:noFill/>
+                    </a:ln>
                   </pic:spPr>
                 </pic:pic>
               </a:graphicData>
@@ -1193,250 +1532,26 @@
       <w:r>
         <w:rPr>
           <w:rFonts w:ascii="Arial" w:hAnsi="Arial" w:cs="Arial"/>
-          <w:sz w:val="20"/>
-          <w:szCs w:val="20"/>
           <w:i/>
           <w:iCs/>
           <w:color w:val="64748B"/>
-        </w:rPr>
-        <w:t xml:space="preserve">Hình 4. Giao diện Danh sách liên hệ &amp; Khối thống kê (MainActivity)</w:t>
-      </w:r>
-    </w:p>
-    <w:p>
-      <w:pPr>
-        <w:spacing w:before="180" w:after="80"/>
-      </w:pPr>
-      <w:r>
-        <w:rPr>
-          <w:rFonts w:ascii="Arial" w:hAnsi="Arial" w:cs="Arial"/>
-          <w:sz w:val="24"/>
-          <w:szCs w:val="24"/>
-          <w:b/>
-          <w:bCs/>
-          <w:color w:val="0F172A"/>
-        </w:rPr>
-        <w:t xml:space="preserve">Mô tả nội dung kỹ thuật đã thực hiện:</w:t>
-      </w:r>
-    </w:p>
-    <w:p>
-      <w:pPr>
-        <w:numPr>
-          <w:ilvl w:val="0"/>
-          <w:numId w:val="1"/>
-        </w:numPr>
-        <w:spacing w:before="60" w:after="60"/>
-        <w:ind w:left="720" w:hanging="360"/>
-      </w:pPr>
-      <w:r>
-        <w:rPr>
-          <w:rFonts w:ascii="Arial" w:hAnsi="Arial"/>
-          <w:b/>
-          <w:bCs/>
-          <w:sz w:val="24"/>
-          <w:szCs w:val="24"/>
-          <w:color w:val="0F172A"/>
-        </w:rPr>
-        <w:t xml:space="preserve">• </w:t>
-      </w:r>
-      <w:r>
-        <w:rPr>
-          <w:rFonts w:ascii="Arial" w:hAnsi="Arial"/>
-          <w:sz w:val="24"/>
-          <w:szCs w:val="24"/>
-        </w:rPr>
-        <w:t xml:space="preserve">Thành phần UI đã thêm: Header Bar màu Primary hiển thị tên bài tập và MSSV B24DCCC157; Khối thống kê (CardView chứa tvStats với icon ngôi sao vàng); Danh sách liên hệ sử dụng ListView (lvContacts); TextView thông báo trống (tvEmpty); Nút Thêm liên hệ (btnAddContact) cố định ở phía dưới.</w:t>
-      </w:r>
-    </w:p>
-    <w:p>
-      <w:pPr>
-        <w:numPr>
-          <w:ilvl w:val="0"/>
-          <w:numId w:val="1"/>
-        </w:numPr>
-        <w:spacing w:before="60" w:after="60"/>
-        <w:ind w:left="720" w:hanging="360"/>
-      </w:pPr>
-      <w:r>
-        <w:rPr>
-          <w:rFonts w:ascii="Arial" w:hAnsi="Arial"/>
-          <w:b/>
-          <w:bCs/>
-          <w:sz w:val="24"/>
-          <w:szCs w:val="24"/>
-          <w:color w:val="0F172A"/>
-        </w:rPr>
-        <w:t xml:space="preserve">• </w:t>
-      </w:r>
-      <w:r>
-        <w:rPr>
-          <w:rFonts w:ascii="Arial" w:hAnsi="Arial"/>
-          <w:sz w:val="24"/>
-          <w:szCs w:val="24"/>
-        </w:rPr>
-        <w:t xml:space="preserve">Thiết kế dòng liên hệ (item_contact.xml) &amp; ContactAdapter: Mỗi dòng liên hệ hiển thị: Chữ cái đầu của tên trong hình tròn (tvAvatarLetter tự động lấy từ từ cuối cùng của họ tên qua contact.getInitialLetter()), Họ tên in đậm (tvContactName), Số điện thoại (tvContactPhone), Badge phân loại nhóm (tvContactGroup) và Biểu tượng ngôi sao vàng (ivFavoriteStar).</w:t>
-      </w:r>
-    </w:p>
-    <w:p>
-      <w:pPr>
-        <w:numPr>
-          <w:ilvl w:val="0"/>
-          <w:numId w:val="1"/>
-        </w:numPr>
-        <w:spacing w:before="60" w:after="60"/>
-        <w:ind w:left="720" w:hanging="360"/>
-      </w:pPr>
-      <w:r>
-        <w:rPr>
-          <w:rFonts w:ascii="Arial" w:hAnsi="Arial"/>
-          <w:b/>
-          <w:bCs/>
-          <w:sz w:val="24"/>
-          <w:szCs w:val="24"/>
-          <w:color w:val="0F172A"/>
-        </w:rPr>
-        <w:t xml:space="preserve">• </w:t>
-      </w:r>
-      <w:r>
-        <w:rPr>
-          <w:rFonts w:ascii="Arial" w:hAnsi="Arial"/>
-          <w:sz w:val="24"/>
-          <w:szCs w:val="24"/>
-        </w:rPr>
-        <w:t xml:space="preserve">Khởi tạo dữ liệu mẫu ban đầu: Lớp ContactRepository tự động nạp sẵn 3 đối tượng Contact theo đúng đề bài: (1) Nguyễn Văn An - 0901234567 - Bạn bè - Không yêu thích; (2) Trần Thị Bình - 0912345678 - Gia đình - Có yêu thích; (3) Lê Minh Châu - 0987654321 - Công việc - Không yêu thích.</w:t>
-      </w:r>
-    </w:p>
-    <w:p>
-      <w:pPr>
-        <w:numPr>
-          <w:ilvl w:val="0"/>
-          <w:numId w:val="1"/>
-        </w:numPr>
-        <w:spacing w:before="60" w:after="60"/>
-        <w:ind w:left="720" w:hanging="360"/>
-      </w:pPr>
-      <w:r>
-        <w:rPr>
-          <w:rFonts w:ascii="Arial" w:hAnsi="Arial"/>
-          <w:b/>
-          <w:bCs/>
-          <w:sz w:val="24"/>
-          <w:szCs w:val="24"/>
-          <w:color w:val="0F172A"/>
-        </w:rPr>
-        <w:t xml:space="preserve">• </w:t>
-      </w:r>
-      <w:r>
-        <w:rPr>
-          <w:rFonts w:ascii="Arial" w:hAnsi="Arial"/>
-          <w:sz w:val="24"/>
-          <w:szCs w:val="24"/>
-        </w:rPr>
-        <w:t xml:space="preserve">Cách tính toán và cập nhật thống kê: Được đặt trong vòng đời onResume(). Khi quay lại màn hình danh sách sau khi thêm mới, xóa hoặc thay đổi yêu thích, onResume() gọi repository.getTotalCount() và repository.getFavoriteCount() để cập nhật chuỗi 'Tổng số: X | Yêu thích: Y' đồng thời gọi adapter.notifyDataSetChanged().</w:t>
-      </w:r>
-    </w:p>
-    <w:p>
-      <w:pPr>
-        <w:numPr>
-          <w:ilvl w:val="0"/>
-          <w:numId w:val="1"/>
-        </w:numPr>
-        <w:spacing w:before="60" w:after="60"/>
-        <w:ind w:left="720" w:hanging="360"/>
-      </w:pPr>
-      <w:r>
-        <w:rPr>
-          <w:rFonts w:ascii="Arial" w:hAnsi="Arial"/>
-          <w:b/>
-          <w:bCs/>
-          <w:sz w:val="24"/>
-          <w:szCs w:val="24"/>
-          <w:color w:val="0F172A"/>
-        </w:rPr>
-        <w:t xml:space="preserve">• </w:t>
-      </w:r>
-      <w:r>
-        <w:rPr>
-          <w:rFonts w:ascii="Arial" w:hAnsi="Arial"/>
-          <w:sz w:val="24"/>
-          <w:szCs w:val="24"/>
-        </w:rPr>
-        <w:t xml:space="preserve">Xử lý sự kiện nhấn nút và item: Nhấn btnAddContact mở AddContactActivity; nhấn vào một item bất kỳ trên ListView sẽ mở ContactDetailActivity và gửi kèm chỉ số dòng qua Intent: intent.putExtra("EXTRA_CONTACT_INDEX", position);.</w:t>
-      </w:r>
-    </w:p>
-    <w:p>
-      <w:pPr>
-        <w:spacing w:before="180" w:after="80"/>
-      </w:pPr>
-      <w:r>
-        <w:rPr>
-          <w:rFonts w:ascii="Arial" w:hAnsi="Arial" w:cs="Arial"/>
-          <w:sz w:val="24"/>
-          <w:szCs w:val="24"/>
-          <w:b/>
-          <w:bCs/>
-          <w:color w:val="0F172A"/>
-        </w:rPr>
-        <w:t xml:space="preserve">Đoạn mã xử lý tiêu biểu (MainActivity.java):</w:t>
-      </w:r>
-    </w:p>
-    <w:p>
-      <w:pPr>
-        <w:spacing w:before="140" w:after="140"/>
-        <w:shd w:val="clear" w:color="auto" w:fill="F1F5F9"/>
-        <w:ind w:left="360" w:right="360"/>
-        <w:pBdr>
-          <w:left w:val="single" w:sz="18" w:space="8" w:color="3B82F6"/>
-        </w:pBdr>
-      </w:pPr>
-      <w:r>
-        <w:rPr>
-          <w:rFonts w:ascii="Consolas" w:hAnsi="Consolas"/>
           <w:sz w:val="20"/>
           <w:szCs w:val="20"/>
-          <w:color w:val="0F172A"/>
-        </w:rPr>
-        <w:t xml:space="preserve">@Override
-protected void onResume() {
-    super.onResume();
-    int total = repository.getTotalCount();
-    int favorite = repository.getFavoriteCount();
-    tvStats.setText(getString(R.string.stats_format, total, favorite));
-    if (adapter != null) adapter.notifyDataSetChanged();
-}
-lvContacts.setOnItemClickListener((parent, view, position, id) -&gt; {
-    Intent intent = new Intent(MainActivity.this, ContactDetailActivity.class);
-    intent.putExtra(EXTRA_CONTACT_INDEX, position);
-    startActivity(intent);
-});</w:t>
-      </w:r>
-    </w:p>
-    <w:p>
-      <w:pPr>
-        <w:spacing w:before="240" w:after="120"/>
-      </w:pPr>
-      <w:r>
-        <w:rPr>
-          <w:rFonts w:ascii="Arial" w:hAnsi="Arial" w:cs="Arial"/>
-          <w:sz w:val="28"/>
-          <w:szCs w:val="28"/>
-          <w:b/>
-          <w:bCs/>
-          <w:color w:val="1E429F"/>
-        </w:rPr>
-        <w:t xml:space="preserve">2.3. Màn hình 3: Thêm liên hệ (AddContactActivity)</w:t>
-      </w:r>
-    </w:p>
-    <w:p>
-      <w:pPr>
+        </w:rPr>
+        <w:t>Hình 4. Giao diện Form thêm liên hệ mới (AddContactScreen)</w:t>
+      </w:r>
+    </w:p>
+    <w:p>
+      <w:pPr>
+        <w:spacing w:before="180" w:after="80"/>
         <w:jc w:val="center"/>
-        <w:spacing w:before="180" w:after="80"/>
       </w:pPr>
       <w:r>
         <w:drawing>
-          <wp:inline xmlns:wp="http://schemas.openxmlformats.org/drawingml/2006/wordprocessingDrawing" distT="0" distB="0" distL="0" distR="0">
-            <wp:extent cx="2400000" cy="4900000"/>
-            <wp:effectExtent t="0" r="0" b="0" l="0"/>
-            <wp:docPr id="rId12" name="image_rId12"/>
+          <wp:inline distT="0" distB="0" distL="114300" distR="114300">
+            <wp:extent cx="2095500" cy="4457700"/>
+            <wp:effectExtent l="0" t="0" r="0" b="0"/>
+            <wp:docPr id="11" name="Picture 5"/>
             <wp:cNvGraphicFramePr>
               <a:graphicFrameLocks xmlns:a="http://schemas.openxmlformats.org/drawingml/2006/main" noChangeAspect="1"/>
             </wp:cNvGraphicFramePr>
@@ -1444,13 +1559,13 @@
               <a:graphicData uri="http://schemas.openxmlformats.org/drawingml/2006/picture">
                 <pic:pic xmlns:pic="http://schemas.openxmlformats.org/drawingml/2006/picture">
                   <pic:nvPicPr>
-                    <pic:cNvPr id="0" name=""/>
+                    <pic:cNvPr id="11" name="Picture 5"/>
                     <pic:cNvPicPr>
-                      <a:picLocks noChangeAspect="1" noChangeArrowheads="1"/>
+                      <a:picLocks noChangeAspect="1"/>
                     </pic:cNvPicPr>
                   </pic:nvPicPr>
                   <pic:blipFill>
-                    <a:blip xmlns:r="http://schemas.openxmlformats.org/officeDocument/2006/relationships" r:embed="rId12"/>
+                    <a:blip r:embed="rId10"/>
                     <a:stretch>
                       <a:fillRect/>
                     </a:stretch>
@@ -1458,11 +1573,15 @@
                   <pic:spPr>
                     <a:xfrm>
                       <a:off x="0" y="0"/>
-                      <a:ext cx="2400000" cy="4900000"/>
+                      <a:ext cx="2095500" cy="4457700"/>
                     </a:xfrm>
                     <a:prstGeom prst="rect">
                       <a:avLst/>
                     </a:prstGeom>
+                    <a:noFill/>
+                    <a:ln>
+                      <a:noFill/>
+                    </a:ln>
                   </pic:spPr>
                 </pic:pic>
               </a:graphicData>
@@ -1479,13 +1598,13 @@
       <w:r>
         <w:rPr>
           <w:rFonts w:ascii="Arial" w:hAnsi="Arial" w:cs="Arial"/>
-          <w:sz w:val="20"/>
-          <w:szCs w:val="20"/>
           <w:i/>
           <w:iCs/>
           <w:color w:val="64748B"/>
-        </w:rPr>
-        <w:t xml:space="preserve">Hình 5. Giao diện Thêm liên hệ mới (AddContactActivity)</w:t>
+          <w:sz w:val="20"/>
+          <w:szCs w:val="20"/>
+        </w:rPr>
+        <w:t>Hình 5. Giao diện Thêm liên hệ khi báo lỗi validation (SĐT không hợp lệ / Trống họ tên)</w:t>
       </w:r>
     </w:p>
     <w:p>
@@ -1495,13 +1614,13 @@
       <w:r>
         <w:rPr>
           <w:rFonts w:ascii="Arial" w:hAnsi="Arial" w:cs="Arial"/>
-          <w:sz w:val="24"/>
-          <w:szCs w:val="24"/>
           <w:b/>
           <w:bCs/>
           <w:color w:val="0F172A"/>
-        </w:rPr>
-        <w:t xml:space="preserve">Mô tả nội dung kỹ thuật đã thực hiện:</w:t>
+          <w:sz w:val="24"/>
+          <w:szCs w:val="24"/>
+        </w:rPr>
+        <w:t>Mô tả nội dung kỹ thuật đã thực hiện:</w:t>
       </w:r>
     </w:p>
     <w:p>
@@ -1518,9 +1637,9 @@
           <w:rFonts w:ascii="Arial" w:hAnsi="Arial"/>
           <w:b/>
           <w:bCs/>
-          <w:sz w:val="24"/>
-          <w:szCs w:val="24"/>
           <w:color w:val="0F172A"/>
+          <w:sz w:val="24"/>
+          <w:szCs w:val="24"/>
         </w:rPr>
         <w:t xml:space="preserve">• </w:t>
       </w:r>
@@ -1530,7 +1649,7 @@
           <w:sz w:val="24"/>
           <w:szCs w:val="24"/>
         </w:rPr>
-        <w:t xml:space="preserve">Thành phần UI đã thêm: Toàn bộ form được bao quanh bởi ScrollView gồm: Nút Back trên header; EditText Họ và tên (etName); EditText Số điện thoại (etPhone, inputType="phone", giới hạn 10 số); Spinner Nhóm (spGroup nạp từ string-array contact_groups: Gia đình, Bạn bè, Công việc, Khác); RadioGroup Giới tính (rgGender gồm 3 RadioButton Nam, Nữ, Khác, mặc định chọn Nam); CheckBox Yêu thích (cbFavorite); EditText Ghi chú nhiều dòng (etNote, inputType="textMultiLine"); Nút Lưu liên hệ (btnSave).</w:t>
+        <w:t>Widget đã tạo: Form cuộn SingleChildScrollView gồm 7 trường: TextField Họ và tên; TextField Số điện thoại (kiểu keyboard phone, maxLength=10); DropdownButtonFormField chọn Nhóm (Gia đình, Bạn bè, Công việc, Khác); SegmentedButton chọn Giới tính (Nam, Nữ, Khác có icon minh họa); CheckboxListTile Yêu thích màu vàng; TextField Ghi chú 3 dòng; Nút LƯU LIÊN HỆ.</w:t>
       </w:r>
     </w:p>
     <w:p>
@@ -1547,9 +1666,9 @@
           <w:rFonts w:ascii="Arial" w:hAnsi="Arial"/>
           <w:b/>
           <w:bCs/>
-          <w:sz w:val="24"/>
-          <w:szCs w:val="24"/>
           <w:color w:val="0F172A"/>
+          <w:sz w:val="24"/>
+          <w:szCs w:val="24"/>
         </w:rPr>
         <w:t xml:space="preserve">• </w:t>
       </w:r>
@@ -1559,7 +1678,7 @@
           <w:sz w:val="24"/>
           <w:szCs w:val="24"/>
         </w:rPr>
-        <w:t xml:space="preserve">Validation Họ tên: Kiểm tra chuỗi sau khi .trim(). Nếu rỗng thì báo lỗi etName.setError("Họ tên không được để trống!") và chặn thao tác lưu.</w:t>
+        <w:t>Validation Họ và tên: Kiểm tra name.isEmpty -&gt; gán _nameError = 'Họ và tên không được để trống!' và hiển thị ngay dưới ô nhập.</w:t>
       </w:r>
     </w:p>
     <w:p>
@@ -1576,9 +1695,9 @@
           <w:rFonts w:ascii="Arial" w:hAnsi="Arial"/>
           <w:b/>
           <w:bCs/>
-          <w:sz w:val="24"/>
-          <w:szCs w:val="24"/>
           <w:color w:val="0F172A"/>
+          <w:sz w:val="24"/>
+          <w:szCs w:val="24"/>
         </w:rPr>
         <w:t xml:space="preserve">• </w:t>
       </w:r>
@@ -1588,7 +1707,7 @@
           <w:sz w:val="24"/>
           <w:szCs w:val="24"/>
         </w:rPr>
-        <w:t xml:space="preserve">Validation Số điện thoại: Áp dụng biểu thức chính quy ^0[0-9]{9}$ để đảm bảo đúng 10 chữ số và bắt đầu bằng số 0. Nếu không khớp sẽ báo lỗi etPhone.setError("Số điện thoại phải gồm 10 chữ số và bắt đầu bằng số 0!").</w:t>
+        <w:t>Validation Số điện thoại: Dùng biểu thức chính quy RegExp(r'^0[0-9]{9}$') để kiểm tra chính xác 10 chữ số và bắt đầu bằng số 0. Nếu không khớp -&gt; gán _phoneError = 'Số điện thoại phải gồm 10 chữ số và bắt đầu bằng số 0!'.</w:t>
       </w:r>
     </w:p>
     <w:p>
@@ -1605,9 +1724,9 @@
           <w:rFonts w:ascii="Arial" w:hAnsi="Arial"/>
           <w:b/>
           <w:bCs/>
-          <w:sz w:val="24"/>
-          <w:szCs w:val="24"/>
           <w:color w:val="0F172A"/>
+          <w:sz w:val="24"/>
+          <w:szCs w:val="24"/>
         </w:rPr>
         <w:t xml:space="preserve">• </w:t>
       </w:r>
@@ -1617,7 +1736,7 @@
           <w:sz w:val="24"/>
           <w:szCs w:val="24"/>
         </w:rPr>
-        <w:t xml:space="preserve">Kiểm tra chống trùng lặp SĐT: Duyệt danh sách qua hàm repository.isPhoneExists(phone). Nếu số điện thoại đã tồn tại, hiển thị cảnh báo lỗi và chặn thêm mới.</w:t>
+        <w:t>Kiểm tra chống trùng lặp SĐT: Gọi hàm _repository.isPhoneExists(phone). Nếu số đã tồn tại -&gt; gán _phoneError = 'Số điện thoại đã tồn tại trong danh bạ!' và chặn lưu.</w:t>
       </w:r>
     </w:p>
     <w:p>
@@ -1634,9 +1753,9 @@
           <w:rFonts w:ascii="Arial" w:hAnsi="Arial"/>
           <w:b/>
           <w:bCs/>
-          <w:sz w:val="24"/>
-          <w:szCs w:val="24"/>
           <w:color w:val="0F172A"/>
+          <w:sz w:val="24"/>
+          <w:szCs w:val="24"/>
         </w:rPr>
         <w:t xml:space="preserve">• </w:t>
       </w:r>
@@ -1646,7 +1765,7 @@
           <w:sz w:val="24"/>
           <w:szCs w:val="24"/>
         </w:rPr>
-        <w:t xml:space="preserve">Tạo đối tượng &amp; Hoàn tất lưu: Khởi tạo Contact newContact = new Contact(name, phone, group, gender, isFavorite, note); gọi repository.addContact(newContact); hiển thị Toast thông báo thành công và gọi finish() để trở về MainActivity.</w:t>
+        <w:t>Lưu liên hệ: Khởi tạo Contact mới, gọi _repository.addContact(newContact), hiển thị SnackBar thông báo thành công và gọi Navigator.pop(context) quay về danh sách.</w:t>
       </w:r>
     </w:p>
     <w:p>
@@ -1656,50 +1775,48 @@
       <w:r>
         <w:rPr>
           <w:rFonts w:ascii="Arial" w:hAnsi="Arial" w:cs="Arial"/>
-          <w:sz w:val="24"/>
-          <w:szCs w:val="24"/>
           <w:b/>
           <w:bCs/>
           <w:color w:val="0F172A"/>
-        </w:rPr>
-        <w:t xml:space="preserve">Đoạn mã xử lý tiêu biểu (AddContactActivity.java):</w:t>
-      </w:r>
-    </w:p>
-    <w:p>
-      <w:pPr>
+          <w:sz w:val="24"/>
+          <w:szCs w:val="24"/>
+        </w:rPr>
+        <w:t>Đoạn mã tiêu biểu (lib/screens/add_contact_screen.dart):</w:t>
+      </w:r>
+    </w:p>
+    <w:p>
+      <w:pPr>
+        <w:pBdr>
+          <w:left w:val="single" w:color="3B82F6" w:sz="18" w:space="8"/>
+        </w:pBdr>
+        <w:shd w:val="clear" w:color="auto" w:fill="F1F5F9"/>
         <w:spacing w:before="140" w:after="140"/>
-        <w:shd w:val="clear" w:color="auto" w:fill="F1F5F9"/>
         <w:ind w:left="360" w:right="360"/>
-        <w:pBdr>
-          <w:left w:val="single" w:sz="18" w:space="8" w:color="3B82F6"/>
-        </w:pBdr>
       </w:pPr>
       <w:r>
         <w:rPr>
           <w:rFonts w:ascii="Consolas" w:hAnsi="Consolas"/>
+          <w:color w:val="0F172A"/>
           <w:sz w:val="20"/>
           <w:szCs w:val="20"/>
-          <w:color w:val="0F172A"/>
-        </w:rPr>
-        <w:t xml:space="preserve">private void handleSaveContact() {
-    String name = etName.getText().toString().trim();
-    String phone = etPhone.getText().toString().trim();
-    if (name.isEmpty()) {
-        etName.setError(getString(R.string.err_empty_name));
-        return;
-    }
-    if (!phone.matches("^0[0-9]{9}$")) {
-        etPhone.setError(getString(R.string.err_invalid_phone));
-        return;
-    }
-    if (repository.isPhoneExists(phone)) {
-        etPhone.setError(getString(R.string.err_duplicate_phone));
-        return;
-    }
-    Contact c = new Contact(name, phone, group, gender, cbFavorite.isChecked(), note);
-    repository.addContact(c);
-    Toast.makeText(this, R.string.msg_added_success, Toast.LENGTH_SHORT).show();
-    finish();
+        </w:rPr>
+        <w:t>void _handleSave() {
+  final name = _nameController.text.trim();
+  final phone = _phoneController.text.trim();
+  if (name.isEmpty) {
+    setState(() =&gt; _nameError = 'Họ và tên không được để trống!');
+    return;
+  }
+  if (!RegExp(r'^0[0-9]{9}$').hasMatch(phone)) {
+    setState(() =&gt; _phoneError = 'Số điện thoại phải gồm 10 chữ số và bắt đầu bằng số 0!');
+    return;
+  }
+  if (_repository.isPhoneExists(phone)) {
+    setState(() =&gt; _phoneError = 'Số điện thoại đã tồn tại trong danh bạ!');
+    return;
+  }
+  _repository.addContact(Contact(id: DateTime.now().toString(), name: name, phone: phone, ...));
+  Navigator.pop(context);
 }</w:t>
       </w:r>
     </w:p>
@@ -1710,26 +1827,26 @@
       <w:r>
         <w:rPr>
           <w:rFonts w:ascii="Arial" w:hAnsi="Arial" w:cs="Arial"/>
+          <w:b/>
+          <w:bCs/>
+          <w:color w:val="1E429F"/>
           <w:sz w:val="28"/>
           <w:szCs w:val="28"/>
-          <w:b/>
-          <w:bCs/>
-          <w:color w:val="1E429F"/>
-        </w:rPr>
-        <w:t xml:space="preserve">2.4. Màn hình 4: Chi tiết liên hệ (ContactDetailActivity)</w:t>
-      </w:r>
-    </w:p>
-    <w:p>
-      <w:pPr>
+        </w:rPr>
+        <w:t>2.4. Màn hình 4: Chi tiết liên hệ (ContactDetailScreen)</w:t>
+      </w:r>
+    </w:p>
+    <w:p>
+      <w:pPr>
+        <w:spacing w:before="180" w:after="80"/>
         <w:jc w:val="center"/>
-        <w:spacing w:before="180" w:after="80"/>
       </w:pPr>
       <w:r>
         <w:drawing>
-          <wp:inline xmlns:wp="http://schemas.openxmlformats.org/drawingml/2006/wordprocessingDrawing" distT="0" distB="0" distL="0" distR="0">
-            <wp:extent cx="2500000" cy="5100000"/>
-            <wp:effectExtent t="0" r="0" b="0" l="0"/>
-            <wp:docPr id="rId13" name="image_rId13"/>
+          <wp:inline distT="0" distB="0" distL="114300" distR="114300">
+            <wp:extent cx="2047875" cy="4448175"/>
+            <wp:effectExtent l="0" t="0" r="0" b="0"/>
+            <wp:docPr id="12" name="Picture 6"/>
             <wp:cNvGraphicFramePr>
               <a:graphicFrameLocks xmlns:a="http://schemas.openxmlformats.org/drawingml/2006/main" noChangeAspect="1"/>
             </wp:cNvGraphicFramePr>
@@ -1737,13 +1854,13 @@
               <a:graphicData uri="http://schemas.openxmlformats.org/drawingml/2006/picture">
                 <pic:pic xmlns:pic="http://schemas.openxmlformats.org/drawingml/2006/picture">
                   <pic:nvPicPr>
-                    <pic:cNvPr id="0" name=""/>
+                    <pic:cNvPr id="12" name="Picture 6"/>
                     <pic:cNvPicPr>
-                      <a:picLocks noChangeAspect="1" noChangeArrowheads="1"/>
+                      <a:picLocks noChangeAspect="1"/>
                     </pic:cNvPicPr>
                   </pic:nvPicPr>
                   <pic:blipFill>
-                    <a:blip xmlns:r="http://schemas.openxmlformats.org/officeDocument/2006/relationships" r:embed="rId13"/>
+                    <a:blip r:embed="rId11"/>
                     <a:stretch>
                       <a:fillRect/>
                     </a:stretch>
@@ -1751,11 +1868,15 @@
                   <pic:spPr>
                     <a:xfrm>
                       <a:off x="0" y="0"/>
-                      <a:ext cx="2500000" cy="5100000"/>
+                      <a:ext cx="2047875" cy="4448175"/>
                     </a:xfrm>
                     <a:prstGeom prst="rect">
                       <a:avLst/>
                     </a:prstGeom>
+                    <a:noFill/>
+                    <a:ln>
+                      <a:noFill/>
+                    </a:ln>
                   </pic:spPr>
                 </pic:pic>
               </a:graphicData>
@@ -1763,6 +1884,8 @@
           </wp:inline>
         </w:drawing>
       </w:r>
+      <w:bookmarkStart w:id="0" w:name="_GoBack"/>
+      <w:bookmarkEnd w:id="0"/>
     </w:p>
     <w:p>
       <w:pPr>
@@ -1772,13 +1895,13 @@
       <w:r>
         <w:rPr>
           <w:rFonts w:ascii="Arial" w:hAnsi="Arial" w:cs="Arial"/>
-          <w:sz w:val="20"/>
-          <w:szCs w:val="20"/>
           <w:i/>
           <w:iCs/>
           <w:color w:val="64748B"/>
-        </w:rPr>
-        <w:t xml:space="preserve">Hình 6. Giao diện Chi tiết liên hệ (ContactDetailActivity)</w:t>
+          <w:sz w:val="20"/>
+          <w:szCs w:val="20"/>
+        </w:rPr>
+        <w:t>Hình 6. Giao diện Chi tiết liên hệ và các nút thao tác (ContactDetailScreen)</w:t>
       </w:r>
     </w:p>
     <w:p>
@@ -1788,13 +1911,13 @@
       <w:r>
         <w:rPr>
           <w:rFonts w:ascii="Arial" w:hAnsi="Arial" w:cs="Arial"/>
-          <w:sz w:val="24"/>
-          <w:szCs w:val="24"/>
           <w:b/>
           <w:bCs/>
           <w:color w:val="0F172A"/>
-        </w:rPr>
-        <w:t xml:space="preserve">Mô tả nội dung kỹ thuật đã thực hiện:</w:t>
+          <w:sz w:val="24"/>
+          <w:szCs w:val="24"/>
+        </w:rPr>
+        <w:t>Mô tả nội dung kỹ thuật đã thực hiện:</w:t>
       </w:r>
     </w:p>
     <w:p>
@@ -1811,9 +1934,9 @@
           <w:rFonts w:ascii="Arial" w:hAnsi="Arial"/>
           <w:b/>
           <w:bCs/>
-          <w:sz w:val="24"/>
-          <w:szCs w:val="24"/>
           <w:color w:val="0F172A"/>
+          <w:sz w:val="24"/>
+          <w:szCs w:val="24"/>
         </w:rPr>
         <w:t xml:space="preserve">• </w:t>
       </w:r>
@@ -1823,7 +1946,7 @@
           <w:sz w:val="24"/>
           <w:szCs w:val="24"/>
         </w:rPr>
-        <w:t xml:space="preserve">Thành phần UI đã thêm: Card Profile gồm Avatar tròn lớn (tvDetailAvatar) và Họ tên (tvDetailName); CheckBox Yêu thích (cbDetailFavorite); Card thông tin chi tiết hiển thị: Số điện thoại (tvDetailPhone), Nhóm (tvDetailGroup), Giới tính (tvDetailGender), Ghi chú (tvDetailNote); Nút Gọi điện màu xanh (btnCall); Nút Quay lại (btnBack); Nút Xóa liên hệ màu đỏ cảnh báo (btnDelete).</w:t>
+        <w:t>Widget đã tạo: Card Profile với Avatar tròn lớn 76dp và Họ tên in đậm 22sp, Checkbox Đánh dấu yêu thích; Card Thông tin chi tiết hiển thị Số điện thoại (chữ to 18sp màu xanh), Nhóm, Giới tính, Ghi chú; Nút GỌI ĐIỆN màu xanh lá (0E9F6E) có icon điện thoại; Cụm 2 nút hành động: Nút QUAY LẠI viền xám và Nút XÓA LIÊN HỆ màu đỏ cảnh báo (E02424).</w:t>
       </w:r>
     </w:p>
     <w:p>
@@ -1840,9 +1963,9 @@
           <w:rFonts w:ascii="Arial" w:hAnsi="Arial"/>
           <w:b/>
           <w:bCs/>
-          <w:sz w:val="24"/>
-          <w:szCs w:val="24"/>
           <w:color w:val="0F172A"/>
+          <w:sz w:val="24"/>
+          <w:szCs w:val="24"/>
         </w:rPr>
         <w:t xml:space="preserve">• </w:t>
       </w:r>
@@ -1852,7 +1975,7 @@
           <w:sz w:val="24"/>
           <w:szCs w:val="24"/>
         </w:rPr>
-        <w:t xml:space="preserve">Cách nhận dữ liệu qua Intent: Nhận contactIndex = getIntent().getIntExtra(MainActivity.EXTRA_CONTACT_INDEX, -1); sau đó lấy đối tượng liên hệ tương ứng currentContact = repository.getContact(contactIndex); và bind dữ liệu lên các View.</w:t>
+        <w:t>Truy xuất dữ liệu: Nhận contactId qua constructor, lấy đối tượng tương ứng _contact = _repository.getById(widget.contactId).</w:t>
       </w:r>
     </w:p>
     <w:p>
@@ -1869,9 +1992,9 @@
           <w:rFonts w:ascii="Arial" w:hAnsi="Arial"/>
           <w:b/>
           <w:bCs/>
-          <w:sz w:val="24"/>
-          <w:szCs w:val="24"/>
           <w:color w:val="0F172A"/>
+          <w:sz w:val="24"/>
+          <w:szCs w:val="24"/>
         </w:rPr>
         <w:t xml:space="preserve">• </w:t>
       </w:r>
@@ -1881,7 +2004,7 @@
           <w:sz w:val="24"/>
           <w:szCs w:val="24"/>
         </w:rPr>
-        <w:t xml:space="preserve">Đổi trạng thái yêu thích: Bắt sự kiện cbDetailFavorite.setOnCheckedChangeListener((btn, isChecked) -&gt; currentContact.setFavorite(isChecked));. Vì currentContact là đối tượng tham chiếu trong Repository Singleton nên thay đổi được áp dụng ngay lập tức, khi quay lại MainActivity số liệu thống kê và ngôi sao vàng tự động cập nhật.</w:t>
+        <w:t>Đổi trạng thái yêu thích: Bắt sự kiện CheckBox gọi _repository.toggleFavorite(contact.id) và setState() -&gt; trạng thái được cập nhật tức thời vào repository, khi back về MainScreen thì số liệu thống kê và dấu sao vàng tự động đồng bộ.</w:t>
       </w:r>
     </w:p>
     <w:p>
@@ -1898,9 +2021,9 @@
           <w:rFonts w:ascii="Arial" w:hAnsi="Arial"/>
           <w:b/>
           <w:bCs/>
-          <w:sz w:val="24"/>
-          <w:szCs w:val="24"/>
           <w:color w:val="0F172A"/>
+          <w:sz w:val="24"/>
+          <w:szCs w:val="24"/>
         </w:rPr>
         <w:t xml:space="preserve">• </w:t>
       </w:r>
@@ -1910,7 +2033,7 @@
           <w:sz w:val="24"/>
           <w:szCs w:val="24"/>
         </w:rPr>
-        <w:t xml:space="preserve">Nút Gọi điện (Intent ACTION_DIAL): Sử dụng Intent ngầm định Intent dialIntent = new Intent(Intent.ACTION_DIAL, Uri.parse("tel:" + currentContact.getPhone())); startActivity(dialIntent);. Phương pháp này mở trực tiếp trình quay số của hệ thống Android với số điện thoại đã điền sẵn, không yêu cầu cấp quyền nguy hiểm trong runtime và tuyệt đối an toàn.</w:t>
+        <w:t>Nút Gọi điện: Sử dụng thư viện url_launcher để mở URL scheme 'tel:&lt;số_điện_thoại&gt;' kích hoạt trình quay số của hệ thống an toàn.</w:t>
       </w:r>
     </w:p>
     <w:p>
@@ -1927,9 +2050,9 @@
           <w:rFonts w:ascii="Arial" w:hAnsi="Arial"/>
           <w:b/>
           <w:bCs/>
-          <w:sz w:val="24"/>
-          <w:szCs w:val="24"/>
           <w:color w:val="0F172A"/>
+          <w:sz w:val="24"/>
+          <w:szCs w:val="24"/>
         </w:rPr>
         <w:t xml:space="preserve">• </w:t>
       </w:r>
@@ -1939,7 +2062,7 @@
           <w:sz w:val="24"/>
           <w:szCs w:val="24"/>
         </w:rPr>
-        <w:t xml:space="preserve">Xử lý nút Quay lại &amp; Xóa liên hệ: Nút Quay lại gọi finish(); nút Xóa liên hệ hiển thị AlertDialog xác nhận người dùng. Nếu xác nhận 'Xóa', ứng dụng gọi repository.removeContact(contactIndex); hiển thị Toast và gọi finish() quay về danh sách.</w:t>
+        <w:t>Nút Quay lại &amp; Nút Xóa: Nút Quay lại gọi Navigator.pop(context); nút Xóa hiển thị AlertDialog xác nhận người dùng. Nếu xác nhận 'XÓA' -&gt; gọi _repository.removeContact(contactId), hiển thị SnackBar và Navigator.pop(context).</w:t>
       </w:r>
     </w:p>
     <w:p>
@@ -1949,48 +2072,51 @@
       <w:r>
         <w:rPr>
           <w:rFonts w:ascii="Arial" w:hAnsi="Arial" w:cs="Arial"/>
-          <w:sz w:val="24"/>
-          <w:szCs w:val="24"/>
           <w:b/>
           <w:bCs/>
           <w:color w:val="0F172A"/>
-        </w:rPr>
-        <w:t xml:space="preserve">Đoạn mã xử lý tiêu biểu (ContactDetailActivity.java):</w:t>
-      </w:r>
-    </w:p>
-    <w:p>
-      <w:pPr>
+          <w:sz w:val="24"/>
+          <w:szCs w:val="24"/>
+        </w:rPr>
+        <w:t>Đoạn mã tiêu biểu (lib/screens/contact_detail_screen.dart):</w:t>
+      </w:r>
+    </w:p>
+    <w:p>
+      <w:pPr>
+        <w:pBdr>
+          <w:left w:val="single" w:color="3B82F6" w:sz="18" w:space="8"/>
+        </w:pBdr>
+        <w:shd w:val="clear" w:color="auto" w:fill="F1F5F9"/>
         <w:spacing w:before="140" w:after="140"/>
-        <w:shd w:val="clear" w:color="auto" w:fill="F1F5F9"/>
         <w:ind w:left="360" w:right="360"/>
-        <w:pBdr>
-          <w:left w:val="single" w:sz="18" w:space="8" w:color="3B82F6"/>
-        </w:pBdr>
       </w:pPr>
       <w:r>
         <w:rPr>
           <w:rFonts w:ascii="Consolas" w:hAnsi="Consolas"/>
+          <w:color w:val="0F172A"/>
           <w:sz w:val="20"/>
           <w:szCs w:val="20"/>
-          <w:color w:val="0F172A"/>
-        </w:rPr>
-        <w:t xml:space="preserve">// Gọi điện bằng Intent ngầm định ACTION_DIAL
-btnCall.setOnClickListener(v -&gt; {
-    Intent dialIntent = new Intent(Intent.ACTION_DIAL, Uri.parse("tel:" + currentContact.getPhone()));
-    startActivity(dialIntent);
-});
-// Xác nhận xóa liên hệ
-btnDelete.setOnClickListener(v -&gt; {
-    new AlertDialog.Builder(this)
-        .setTitle(R.string.dialog_delete_title)
-        .setMessage(R.string.dialog_delete_msg)
-        .setPositiveButton(R.string.action_yes, (d, w) -&gt; {
-            repository.removeContact(contactIndex);
-            finish();
-        })
-        .setNegativeButton(R.string.action_no, null)
-        .show();
-});</w:t>
+        </w:rPr>
+        <w:t>// Gọi điện qua url_launcher
+Future&lt;void&gt; _handleCall() async {
+  final uri = Uri.parse('tel:${_contact!.phone}');
+  if (await canLaunchUrl(uri)) await launchUrl(uri);
+}
+// Hộp thoại xác nhận xóa liên hệ
+void _showDeleteDialog() {
+  showDialog(context: context, builder: (ctx) =&gt; AlertDialog(
+    title: const Text('Xác nhận xóa'),
+    content: const Text('Bạn có chắc chắn muốn xóa liên hệ này khỏi danh bạ không?'),
+    actions: [
+      TextButton(onPressed: () =&gt; Navigator.pop(ctx), child: const Text('HỦY')),
+      ElevatedButton(onPressed: () {
+        _repository.removeContact(widget.contactId);
+        Navigator.pop(ctx);
+        Navigator.pop(context);
+      }, child: const Text('XÓA')),
+    ],
+  ));
+}</w:t>
       </w:r>
     </w:p>
     <w:p>
@@ -2000,31 +2126,62 @@
       <w:r>
         <w:rPr>
           <w:rFonts w:ascii="Arial" w:hAnsi="Arial" w:cs="Arial"/>
+          <w:b/>
+          <w:bCs/>
+          <w:color w:val="1A56DB"/>
           <w:sz w:val="32"/>
           <w:szCs w:val="32"/>
-          <w:b/>
-          <w:bCs/>
-          <w:color w:val="1A56DB"/>
-        </w:rPr>
-        <w:t xml:space="preserve">3. TỔNG KẾT &amp; KẾT QUẢ NGHIỆM THU</w:t>
+        </w:rPr>
+        <w:t>3. TỔNG KẾT &amp; KẾT QUẢ NGHIỆM THU</w:t>
       </w:r>
     </w:p>
     <w:tbl>
       <w:tblPr>
+        <w:tblStyle w:val="9"/>
         <w:tblW w:w="9360" w:type="dxa"/>
+        <w:jc w:val="center"/>
         <w:tblBorders>
-          <w:top w:val="single" w:sz="4" w:space="0" w:color="CCCCCC"/>
-          <w:left w:val="single" w:sz="4" w:space="0" w:color="CCCCCC"/>
-          <w:bottom w:val="single" w:sz="4" w:space="0" w:color="CCCCCC"/>
-          <w:right w:val="single" w:sz="4" w:space="0" w:color="CCCCCC"/>
-          <w:insideH w:val="single" w:sz="4" w:space="0" w:color="E2E8F0"/>
-          <w:insideV w:val="single" w:sz="4" w:space="0" w:color="E2E8F0"/>
+          <w:top w:val="single" w:color="CCCCCC" w:sz="4" w:space="0"/>
+          <w:left w:val="single" w:color="CCCCCC" w:sz="4" w:space="0"/>
+          <w:bottom w:val="single" w:color="CCCCCC" w:sz="4" w:space="0"/>
+          <w:right w:val="single" w:color="CCCCCC" w:sz="4" w:space="0"/>
+          <w:insideH w:val="single" w:color="E2E8F0" w:sz="4" w:space="0"/>
+          <w:insideV w:val="single" w:color="E2E8F0" w:sz="4" w:space="0"/>
         </w:tblBorders>
-        <w:jc w:val="center"/>
+        <w:tblLayout w:type="autofit"/>
+        <w:tblCellMar>
+          <w:top w:w="0" w:type="dxa"/>
+          <w:left w:w="10" w:type="dxa"/>
+          <w:bottom w:w="0" w:type="dxa"/>
+          <w:right w:w="10" w:type="dxa"/>
+        </w:tblCellMar>
       </w:tblPr>
+      <w:tblGrid>
+        <w:gridCol w:w="2445"/>
+        <w:gridCol w:w="3072"/>
+        <w:gridCol w:w="2680"/>
+        <w:gridCol w:w="1163"/>
+      </w:tblGrid>
       <w:tr>
+        <w:tblPrEx>
+          <w:tblBorders>
+            <w:top w:val="single" w:color="CCCCCC" w:sz="4" w:space="0"/>
+            <w:left w:val="single" w:color="CCCCCC" w:sz="4" w:space="0"/>
+            <w:bottom w:val="single" w:color="CCCCCC" w:sz="4" w:space="0"/>
+            <w:right w:val="single" w:color="CCCCCC" w:sz="4" w:space="0"/>
+            <w:insideH w:val="single" w:color="E2E8F0" w:sz="4" w:space="0"/>
+            <w:insideV w:val="single" w:color="E2E8F0" w:sz="4" w:space="0"/>
+          </w:tblBorders>
+          <w:tblCellMar>
+            <w:top w:w="0" w:type="dxa"/>
+            <w:left w:w="10" w:type="dxa"/>
+            <w:bottom w:w="0" w:type="dxa"/>
+            <w:right w:w="10" w:type="dxa"/>
+          </w:tblCellMar>
+        </w:tblPrEx>
         <w:trPr>
           <w:tblHeader/>
+          <w:jc w:val="center"/>
         </w:trPr>
         <w:tc>
           <w:tcPr>
@@ -2032,24 +2189,24 @@
             <w:shd w:val="clear" w:color="auto" w:fill="E1EFFE"/>
             <w:tcMar>
               <w:top w:w="120" w:type="dxa"/>
+              <w:left w:w="160" w:type="dxa"/>
               <w:bottom w:w="120" w:type="dxa"/>
-              <w:left w:w="160" w:type="dxa"/>
               <w:right w:w="160" w:type="dxa"/>
             </w:tcMar>
           </w:tcPr>
           <w:p>
             <w:pPr>
+              <w:spacing w:before="60" w:after="60"/>
               <w:jc w:val="center"/>
-              <w:spacing w:before="60" w:after="60"/>
             </w:pPr>
             <w:r>
               <w:rPr>
                 <w:rFonts w:ascii="Arial" w:hAnsi="Arial"/>
                 <w:b/>
                 <w:bCs/>
-                <w:sz w:val="22"/>
-                <w:szCs w:val="22"/>
                 <w:color w:val="1E429F"/>
+                <w:sz w:val="22"/>
+                <w:szCs w:val="22"/>
               </w:rPr>
               <w:t>Tiêu chí đánh giá</w:t>
             </w:r>
@@ -2061,24 +2218,24 @@
             <w:shd w:val="clear" w:color="auto" w:fill="E1EFFE"/>
             <w:tcMar>
               <w:top w:w="120" w:type="dxa"/>
+              <w:left w:w="160" w:type="dxa"/>
               <w:bottom w:w="120" w:type="dxa"/>
-              <w:left w:w="160" w:type="dxa"/>
               <w:right w:w="160" w:type="dxa"/>
             </w:tcMar>
           </w:tcPr>
           <w:p>
             <w:pPr>
+              <w:spacing w:before="60" w:after="60"/>
               <w:jc w:val="center"/>
-              <w:spacing w:before="60" w:after="60"/>
             </w:pPr>
             <w:r>
               <w:rPr>
                 <w:rFonts w:ascii="Arial" w:hAnsi="Arial"/>
                 <w:b/>
                 <w:bCs/>
-                <w:sz w:val="22"/>
-                <w:szCs w:val="22"/>
                 <w:color w:val="1E429F"/>
+                <w:sz w:val="22"/>
+                <w:szCs w:val="22"/>
               </w:rPr>
               <w:t>Yêu cầu đề bài</w:t>
             </w:r>
@@ -2090,24 +2247,24 @@
             <w:shd w:val="clear" w:color="auto" w:fill="E1EFFE"/>
             <w:tcMar>
               <w:top w:w="120" w:type="dxa"/>
+              <w:left w:w="160" w:type="dxa"/>
               <w:bottom w:w="120" w:type="dxa"/>
-              <w:left w:w="160" w:type="dxa"/>
               <w:right w:w="160" w:type="dxa"/>
             </w:tcMar>
           </w:tcPr>
           <w:p>
             <w:pPr>
+              <w:spacing w:before="60" w:after="60"/>
               <w:jc w:val="center"/>
-              <w:spacing w:before="60" w:after="60"/>
             </w:pPr>
             <w:r>
               <w:rPr>
                 <w:rFonts w:ascii="Arial" w:hAnsi="Arial"/>
                 <w:b/>
                 <w:bCs/>
-                <w:sz w:val="22"/>
-                <w:szCs w:val="22"/>
                 <w:color w:val="1E429F"/>
+                <w:sz w:val="22"/>
+                <w:szCs w:val="22"/>
               </w:rPr>
               <w:t>Kết quả thực hiện</w:t>
             </w:r>
@@ -2119,24 +2276,24 @@
             <w:shd w:val="clear" w:color="auto" w:fill="E1EFFE"/>
             <w:tcMar>
               <w:top w:w="120" w:type="dxa"/>
+              <w:left w:w="160" w:type="dxa"/>
               <w:bottom w:w="120" w:type="dxa"/>
-              <w:left w:w="160" w:type="dxa"/>
               <w:right w:w="160" w:type="dxa"/>
             </w:tcMar>
           </w:tcPr>
           <w:p>
             <w:pPr>
+              <w:spacing w:before="60" w:after="60"/>
               <w:jc w:val="center"/>
-              <w:spacing w:before="60" w:after="60"/>
             </w:pPr>
             <w:r>
               <w:rPr>
                 <w:rFonts w:ascii="Arial" w:hAnsi="Arial"/>
                 <w:b/>
                 <w:bCs/>
-                <w:sz w:val="22"/>
-                <w:szCs w:val="22"/>
                 <w:color w:val="1E429F"/>
+                <w:sz w:val="22"/>
+                <w:szCs w:val="22"/>
               </w:rPr>
               <w:t>Đánh giá</w:t>
             </w:r>
@@ -2144,14 +2301,33 @@
         </w:tc>
       </w:tr>
       <w:tr>
+        <w:tblPrEx>
+          <w:tblBorders>
+            <w:top w:val="single" w:color="CCCCCC" w:sz="4" w:space="0"/>
+            <w:left w:val="single" w:color="CCCCCC" w:sz="4" w:space="0"/>
+            <w:bottom w:val="single" w:color="CCCCCC" w:sz="4" w:space="0"/>
+            <w:right w:val="single" w:color="CCCCCC" w:sz="4" w:space="0"/>
+            <w:insideH w:val="single" w:color="E2E8F0" w:sz="4" w:space="0"/>
+            <w:insideV w:val="single" w:color="E2E8F0" w:sz="4" w:space="0"/>
+          </w:tblBorders>
+          <w:tblCellMar>
+            <w:top w:w="0" w:type="dxa"/>
+            <w:left w:w="10" w:type="dxa"/>
+            <w:bottom w:w="0" w:type="dxa"/>
+            <w:right w:w="10" w:type="dxa"/>
+          </w:tblCellMar>
+        </w:tblPrEx>
+        <w:trPr>
+          <w:jc w:val="center"/>
+        </w:trPr>
         <w:tc>
           <w:tcPr>
             <w:tcW w:w="2200" w:type="dxa"/>
             <w:shd w:val="clear" w:color="auto" w:fill="FFFFFF"/>
             <w:tcMar>
               <w:top w:w="100" w:type="dxa"/>
+              <w:left w:w="140" w:type="dxa"/>
               <w:bottom w:w="100" w:type="dxa"/>
-              <w:left w:w="140" w:type="dxa"/>
               <w:right w:w="140" w:type="dxa"/>
             </w:tcMar>
           </w:tcPr>
@@ -2162,11 +2338,11 @@
             <w:r>
               <w:rPr>
                 <w:rFonts w:ascii="Arial" w:hAnsi="Arial"/>
-                <w:sz w:val="22"/>
-                <w:szCs w:val="22"/>
                 <w:color w:val="0F172A"/>
-              </w:rPr>
-              <w:t>Đăng nhập (LoginActivity)</w:t>
+                <w:sz w:val="22"/>
+                <w:szCs w:val="22"/>
+              </w:rPr>
+              <w:t>Đăng nhập (LoginScreen)</w:t>
             </w:r>
           </w:p>
         </w:tc>
@@ -2176,8 +2352,8 @@
             <w:shd w:val="clear" w:color="auto" w:fill="FFFFFF"/>
             <w:tcMar>
               <w:top w:w="100" w:type="dxa"/>
+              <w:left w:w="140" w:type="dxa"/>
               <w:bottom w:w="100" w:type="dxa"/>
-              <w:left w:w="140" w:type="dxa"/>
               <w:right w:w="140" w:type="dxa"/>
             </w:tcMar>
           </w:tcPr>
@@ -2188,11 +2364,11 @@
             <w:r>
               <w:rPr>
                 <w:rFonts w:ascii="Arial" w:hAnsi="Arial"/>
-                <w:sz w:val="22"/>
-                <w:szCs w:val="22"/>
                 <w:color w:val="0F172A"/>
-              </w:rPr>
-              <w:t>admin / 123456, kiểm tra bỏ trống/sai, Intent finish()</w:t>
+                <w:sz w:val="22"/>
+                <w:szCs w:val="22"/>
+              </w:rPr>
+              <w:t>admin / 123456, kiểm tra bỏ trống/sai, pushReplacement</w:t>
             </w:r>
           </w:p>
         </w:tc>
@@ -2202,8 +2378,8 @@
             <w:shd w:val="clear" w:color="auto" w:fill="FFFFFF"/>
             <w:tcMar>
               <w:top w:w="100" w:type="dxa"/>
+              <w:left w:w="140" w:type="dxa"/>
               <w:bottom w:w="100" w:type="dxa"/>
-              <w:left w:w="140" w:type="dxa"/>
               <w:right w:w="140" w:type="dxa"/>
             </w:tcMar>
           </w:tcPr>
@@ -2214,11 +2390,11 @@
             <w:r>
               <w:rPr>
                 <w:rFonts w:ascii="Arial" w:hAnsi="Arial"/>
-                <w:sz w:val="22"/>
-                <w:szCs w:val="22"/>
                 <w:color w:val="0F172A"/>
-              </w:rPr>
-              <w:t>Đã hoàn thành 100%, có setError &amp; Toast</w:t>
+                <w:sz w:val="22"/>
+                <w:szCs w:val="22"/>
+              </w:rPr>
+              <w:t>Đã hoàn thành 100%, có cảnh báo lỗi và ẩn/hiện mật khẩu</w:t>
             </w:r>
           </w:p>
         </w:tc>
@@ -2228,8 +2404,8 @@
             <w:shd w:val="clear" w:color="auto" w:fill="FFFFFF"/>
             <w:tcMar>
               <w:top w:w="100" w:type="dxa"/>
+              <w:left w:w="140" w:type="dxa"/>
               <w:bottom w:w="100" w:type="dxa"/>
-              <w:left w:w="140" w:type="dxa"/>
               <w:right w:w="140" w:type="dxa"/>
             </w:tcMar>
           </w:tcPr>
@@ -2240,9 +2416,9 @@
             <w:r>
               <w:rPr>
                 <w:rFonts w:ascii="Arial" w:hAnsi="Arial"/>
-                <w:sz w:val="22"/>
-                <w:szCs w:val="22"/>
                 <w:color w:val="0F172A"/>
+                <w:sz w:val="22"/>
+                <w:szCs w:val="22"/>
               </w:rPr>
               <w:t>ĐẠT (Xuất sắc)</w:t>
             </w:r>
@@ -2250,14 +2426,33 @@
         </w:tc>
       </w:tr>
       <w:tr>
+        <w:tblPrEx>
+          <w:tblBorders>
+            <w:top w:val="single" w:color="CCCCCC" w:sz="4" w:space="0"/>
+            <w:left w:val="single" w:color="CCCCCC" w:sz="4" w:space="0"/>
+            <w:bottom w:val="single" w:color="CCCCCC" w:sz="4" w:space="0"/>
+            <w:right w:val="single" w:color="CCCCCC" w:sz="4" w:space="0"/>
+            <w:insideH w:val="single" w:color="E2E8F0" w:sz="4" w:space="0"/>
+            <w:insideV w:val="single" w:color="E2E8F0" w:sz="4" w:space="0"/>
+          </w:tblBorders>
+          <w:tblCellMar>
+            <w:top w:w="0" w:type="dxa"/>
+            <w:left w:w="10" w:type="dxa"/>
+            <w:bottom w:w="0" w:type="dxa"/>
+            <w:right w:w="10" w:type="dxa"/>
+          </w:tblCellMar>
+        </w:tblPrEx>
+        <w:trPr>
+          <w:jc w:val="center"/>
+        </w:trPr>
         <w:tc>
           <w:tcPr>
             <w:tcW w:w="2200" w:type="dxa"/>
             <w:shd w:val="clear" w:color="auto" w:fill="F8FAFC"/>
             <w:tcMar>
               <w:top w:w="100" w:type="dxa"/>
+              <w:left w:w="140" w:type="dxa"/>
               <w:bottom w:w="100" w:type="dxa"/>
-              <w:left w:w="140" w:type="dxa"/>
               <w:right w:w="140" w:type="dxa"/>
             </w:tcMar>
           </w:tcPr>
@@ -2268,11 +2463,11 @@
             <w:r>
               <w:rPr>
                 <w:rFonts w:ascii="Arial" w:hAnsi="Arial"/>
-                <w:sz w:val="22"/>
-                <w:szCs w:val="22"/>
                 <w:color w:val="0F172A"/>
-              </w:rPr>
-              <w:t>Danh sách (MainActivity)</w:t>
+                <w:sz w:val="22"/>
+                <w:szCs w:val="22"/>
+              </w:rPr>
+              <w:t>Danh sách (MainScreen)</w:t>
             </w:r>
           </w:p>
         </w:tc>
@@ -2282,8 +2477,8 @@
             <w:shd w:val="clear" w:color="auto" w:fill="F8FAFC"/>
             <w:tcMar>
               <w:top w:w="100" w:type="dxa"/>
+              <w:left w:w="140" w:type="dxa"/>
               <w:bottom w:w="100" w:type="dxa"/>
-              <w:left w:w="140" w:type="dxa"/>
               <w:right w:w="140" w:type="dxa"/>
             </w:tcMar>
           </w:tcPr>
@@ -2294,11 +2489,11 @@
             <w:r>
               <w:rPr>
                 <w:rFonts w:ascii="Arial" w:hAnsi="Arial"/>
-                <w:sz w:val="22"/>
-                <w:szCs w:val="22"/>
                 <w:color w:val="0F172A"/>
-              </w:rPr>
-              <w:t>ListView/RecyclerView, thống kê, 3 liên hệ mẫu ban đầu</w:t>
+                <w:sz w:val="22"/>
+                <w:szCs w:val="22"/>
+              </w:rPr>
+              <w:t>ListView, banner thống kê, 3 liên hệ mẫu ban đầu</w:t>
             </w:r>
           </w:p>
         </w:tc>
@@ -2308,8 +2503,8 @@
             <w:shd w:val="clear" w:color="auto" w:fill="F8FAFC"/>
             <w:tcMar>
               <w:top w:w="100" w:type="dxa"/>
+              <w:left w:w="140" w:type="dxa"/>
               <w:bottom w:w="100" w:type="dxa"/>
-              <w:left w:w="140" w:type="dxa"/>
               <w:right w:w="140" w:type="dxa"/>
             </w:tcMar>
           </w:tcPr>
@@ -2320,11 +2515,11 @@
             <w:r>
               <w:rPr>
                 <w:rFonts w:ascii="Arial" w:hAnsi="Arial"/>
-                <w:sz w:val="22"/>
-                <w:szCs w:val="22"/>
                 <w:color w:val="0F172A"/>
-              </w:rPr>
-              <w:t>Đã hoàn thành 100%, ViewHolder tối ưu, tự động cập nhật</w:t>
+                <w:sz w:val="22"/>
+                <w:szCs w:val="22"/>
+              </w:rPr>
+              <w:t>Đã hoàn thành 100%, Avatar tự sinh chữ cái, cập nhật tự động</w:t>
             </w:r>
           </w:p>
         </w:tc>
@@ -2334,8 +2529,8 @@
             <w:shd w:val="clear" w:color="auto" w:fill="F8FAFC"/>
             <w:tcMar>
               <w:top w:w="100" w:type="dxa"/>
+              <w:left w:w="140" w:type="dxa"/>
               <w:bottom w:w="100" w:type="dxa"/>
-              <w:left w:w="140" w:type="dxa"/>
               <w:right w:w="140" w:type="dxa"/>
             </w:tcMar>
           </w:tcPr>
@@ -2346,9 +2541,9 @@
             <w:r>
               <w:rPr>
                 <w:rFonts w:ascii="Arial" w:hAnsi="Arial"/>
-                <w:sz w:val="22"/>
-                <w:szCs w:val="22"/>
                 <w:color w:val="0F172A"/>
+                <w:sz w:val="22"/>
+                <w:szCs w:val="22"/>
               </w:rPr>
               <w:t>ĐẠT (Xuất sắc)</w:t>
             </w:r>
@@ -2356,14 +2551,33 @@
         </w:tc>
       </w:tr>
       <w:tr>
+        <w:tblPrEx>
+          <w:tblBorders>
+            <w:top w:val="single" w:color="CCCCCC" w:sz="4" w:space="0"/>
+            <w:left w:val="single" w:color="CCCCCC" w:sz="4" w:space="0"/>
+            <w:bottom w:val="single" w:color="CCCCCC" w:sz="4" w:space="0"/>
+            <w:right w:val="single" w:color="CCCCCC" w:sz="4" w:space="0"/>
+            <w:insideH w:val="single" w:color="E2E8F0" w:sz="4" w:space="0"/>
+            <w:insideV w:val="single" w:color="E2E8F0" w:sz="4" w:space="0"/>
+          </w:tblBorders>
+          <w:tblCellMar>
+            <w:top w:w="0" w:type="dxa"/>
+            <w:left w:w="10" w:type="dxa"/>
+            <w:bottom w:w="0" w:type="dxa"/>
+            <w:right w:w="10" w:type="dxa"/>
+          </w:tblCellMar>
+        </w:tblPrEx>
+        <w:trPr>
+          <w:jc w:val="center"/>
+        </w:trPr>
         <w:tc>
           <w:tcPr>
             <w:tcW w:w="2200" w:type="dxa"/>
             <w:shd w:val="clear" w:color="auto" w:fill="FFFFFF"/>
             <w:tcMar>
               <w:top w:w="100" w:type="dxa"/>
+              <w:left w:w="140" w:type="dxa"/>
               <w:bottom w:w="100" w:type="dxa"/>
-              <w:left w:w="140" w:type="dxa"/>
               <w:right w:w="140" w:type="dxa"/>
             </w:tcMar>
           </w:tcPr>
@@ -2374,11 +2588,11 @@
             <w:r>
               <w:rPr>
                 <w:rFonts w:ascii="Arial" w:hAnsi="Arial"/>
-                <w:sz w:val="22"/>
-                <w:szCs w:val="22"/>
                 <w:color w:val="0F172A"/>
-              </w:rPr>
-              <w:t>Thêm mới (AddContactActivity)</w:t>
+                <w:sz w:val="22"/>
+                <w:szCs w:val="22"/>
+              </w:rPr>
+              <w:t>Thêm mới (AddContactScreen)</w:t>
             </w:r>
           </w:p>
         </w:tc>
@@ -2388,8 +2602,8 @@
             <w:shd w:val="clear" w:color="auto" w:fill="FFFFFF"/>
             <w:tcMar>
               <w:top w:w="100" w:type="dxa"/>
+              <w:left w:w="140" w:type="dxa"/>
               <w:bottom w:w="100" w:type="dxa"/>
-              <w:left w:w="140" w:type="dxa"/>
               <w:right w:w="140" w:type="dxa"/>
             </w:tcMar>
           </w:tcPr>
@@ -2400,11 +2614,11 @@
             <w:r>
               <w:rPr>
                 <w:rFonts w:ascii="Arial" w:hAnsi="Arial"/>
-                <w:sz w:val="22"/>
-                <w:szCs w:val="22"/>
                 <w:color w:val="0F172A"/>
-              </w:rPr>
-              <w:t>Đầy đủ 7 trường, kiểm tra hợp lệ, chống trùng SĐT</w:t>
+                <w:sz w:val="22"/>
+                <w:szCs w:val="22"/>
+              </w:rPr>
+              <w:t>Đầy đủ 7 trường, validation rỗng, regex SĐT, chống trùng</w:t>
             </w:r>
           </w:p>
         </w:tc>
@@ -2414,8 +2628,8 @@
             <w:shd w:val="clear" w:color="auto" w:fill="FFFFFF"/>
             <w:tcMar>
               <w:top w:w="100" w:type="dxa"/>
+              <w:left w:w="140" w:type="dxa"/>
               <w:bottom w:w="100" w:type="dxa"/>
-              <w:left w:w="140" w:type="dxa"/>
               <w:right w:w="140" w:type="dxa"/>
             </w:tcMar>
           </w:tcPr>
@@ -2426,11 +2640,11 @@
             <w:r>
               <w:rPr>
                 <w:rFonts w:ascii="Arial" w:hAnsi="Arial"/>
-                <w:sz w:val="22"/>
-                <w:szCs w:val="22"/>
                 <w:color w:val="0F172A"/>
-              </w:rPr>
-              <w:t>Đã hoàn thành 100%, Regex SĐT chuẩn, kiểm tra trùng lặp</w:t>
+                <w:sz w:val="22"/>
+                <w:szCs w:val="22"/>
+              </w:rPr>
+              <w:t>Đã hoàn thành 100%, SegmentedButton hiện đại, kiểm tra trùng lặp</w:t>
             </w:r>
           </w:p>
         </w:tc>
@@ -2440,8 +2654,8 @@
             <w:shd w:val="clear" w:color="auto" w:fill="FFFFFF"/>
             <w:tcMar>
               <w:top w:w="100" w:type="dxa"/>
+              <w:left w:w="140" w:type="dxa"/>
               <w:bottom w:w="100" w:type="dxa"/>
-              <w:left w:w="140" w:type="dxa"/>
               <w:right w:w="140" w:type="dxa"/>
             </w:tcMar>
           </w:tcPr>
@@ -2452,9 +2666,9 @@
             <w:r>
               <w:rPr>
                 <w:rFonts w:ascii="Arial" w:hAnsi="Arial"/>
-                <w:sz w:val="22"/>
-                <w:szCs w:val="22"/>
                 <w:color w:val="0F172A"/>
+                <w:sz w:val="22"/>
+                <w:szCs w:val="22"/>
               </w:rPr>
               <w:t>ĐẠT (Xuất sắc)</w:t>
             </w:r>
@@ -2462,14 +2676,33 @@
         </w:tc>
       </w:tr>
       <w:tr>
+        <w:tblPrEx>
+          <w:tblBorders>
+            <w:top w:val="single" w:color="CCCCCC" w:sz="4" w:space="0"/>
+            <w:left w:val="single" w:color="CCCCCC" w:sz="4" w:space="0"/>
+            <w:bottom w:val="single" w:color="CCCCCC" w:sz="4" w:space="0"/>
+            <w:right w:val="single" w:color="CCCCCC" w:sz="4" w:space="0"/>
+            <w:insideH w:val="single" w:color="E2E8F0" w:sz="4" w:space="0"/>
+            <w:insideV w:val="single" w:color="E2E8F0" w:sz="4" w:space="0"/>
+          </w:tblBorders>
+          <w:tblCellMar>
+            <w:top w:w="0" w:type="dxa"/>
+            <w:left w:w="10" w:type="dxa"/>
+            <w:bottom w:w="0" w:type="dxa"/>
+            <w:right w:w="10" w:type="dxa"/>
+          </w:tblCellMar>
+        </w:tblPrEx>
+        <w:trPr>
+          <w:jc w:val="center"/>
+        </w:trPr>
         <w:tc>
           <w:tcPr>
             <w:tcW w:w="2200" w:type="dxa"/>
             <w:shd w:val="clear" w:color="auto" w:fill="F8FAFC"/>
             <w:tcMar>
               <w:top w:w="100" w:type="dxa"/>
+              <w:left w:w="140" w:type="dxa"/>
               <w:bottom w:w="100" w:type="dxa"/>
-              <w:left w:w="140" w:type="dxa"/>
               <w:right w:w="140" w:type="dxa"/>
             </w:tcMar>
           </w:tcPr>
@@ -2480,11 +2713,11 @@
             <w:r>
               <w:rPr>
                 <w:rFonts w:ascii="Arial" w:hAnsi="Arial"/>
-                <w:sz w:val="22"/>
-                <w:szCs w:val="22"/>
                 <w:color w:val="0F172A"/>
-              </w:rPr>
-              <w:t>Chi tiết (ContactDetailActivity)</w:t>
+                <w:sz w:val="22"/>
+                <w:szCs w:val="22"/>
+              </w:rPr>
+              <w:t>Chi tiết (ContactDetailScreen)</w:t>
             </w:r>
           </w:p>
         </w:tc>
@@ -2494,8 +2727,8 @@
             <w:shd w:val="clear" w:color="auto" w:fill="F8FAFC"/>
             <w:tcMar>
               <w:top w:w="100" w:type="dxa"/>
+              <w:left w:w="140" w:type="dxa"/>
               <w:bottom w:w="100" w:type="dxa"/>
-              <w:left w:w="140" w:type="dxa"/>
               <w:right w:w="140" w:type="dxa"/>
             </w:tcMar>
           </w:tcPr>
@@ -2506,11 +2739,11 @@
             <w:r>
               <w:rPr>
                 <w:rFonts w:ascii="Arial" w:hAnsi="Arial"/>
-                <w:sz w:val="22"/>
-                <w:szCs w:val="22"/>
                 <w:color w:val="0F172A"/>
-              </w:rPr>
-              <w:t>Xem chi tiết, toggle yêu thích, gọi điện ACTION_DIAL, xóa</w:t>
+                <w:sz w:val="22"/>
+                <w:szCs w:val="22"/>
+              </w:rPr>
+              <w:t>Xem chi tiết, toggle yêu thích, gọi điện, dialog xóa an toàn</w:t>
             </w:r>
           </w:p>
         </w:tc>
@@ -2520,8 +2753,8 @@
             <w:shd w:val="clear" w:color="auto" w:fill="F8FAFC"/>
             <w:tcMar>
               <w:top w:w="100" w:type="dxa"/>
+              <w:left w:w="140" w:type="dxa"/>
               <w:bottom w:w="100" w:type="dxa"/>
-              <w:left w:w="140" w:type="dxa"/>
               <w:right w:w="140" w:type="dxa"/>
             </w:tcMar>
           </w:tcPr>
@@ -2532,11 +2765,11 @@
             <w:r>
               <w:rPr>
                 <w:rFonts w:ascii="Arial" w:hAnsi="Arial"/>
-                <w:sz w:val="22"/>
-                <w:szCs w:val="22"/>
                 <w:color w:val="0F172A"/>
-              </w:rPr>
-              <w:t>Đã hoàn thành 100%, AlertDialog xác nhận xóa an toàn</w:t>
+                <w:sz w:val="22"/>
+                <w:szCs w:val="22"/>
+              </w:rPr>
+              <w:t>Đã hoàn thành 100%, gọi điện url_launcher, AlertDialog xác nhận</w:t>
             </w:r>
           </w:p>
         </w:tc>
@@ -2546,8 +2779,8 @@
             <w:shd w:val="clear" w:color="auto" w:fill="F8FAFC"/>
             <w:tcMar>
               <w:top w:w="100" w:type="dxa"/>
+              <w:left w:w="140" w:type="dxa"/>
               <w:bottom w:w="100" w:type="dxa"/>
-              <w:left w:w="140" w:type="dxa"/>
               <w:right w:w="140" w:type="dxa"/>
             </w:tcMar>
           </w:tcPr>
@@ -2558,9 +2791,9 @@
             <w:r>
               <w:rPr>
                 <w:rFonts w:ascii="Arial" w:hAnsi="Arial"/>
-                <w:sz w:val="22"/>
-                <w:szCs w:val="22"/>
                 <w:color w:val="0F172A"/>
+                <w:sz w:val="22"/>
+                <w:szCs w:val="22"/>
               </w:rPr>
               <w:t>ĐẠT (Xuất sắc)</w:t>
             </w:r>
@@ -2568,14 +2801,33 @@
         </w:tc>
       </w:tr>
       <w:tr>
+        <w:tblPrEx>
+          <w:tblBorders>
+            <w:top w:val="single" w:color="CCCCCC" w:sz="4" w:space="0"/>
+            <w:left w:val="single" w:color="CCCCCC" w:sz="4" w:space="0"/>
+            <w:bottom w:val="single" w:color="CCCCCC" w:sz="4" w:space="0"/>
+            <w:right w:val="single" w:color="CCCCCC" w:sz="4" w:space="0"/>
+            <w:insideH w:val="single" w:color="E2E8F0" w:sz="4" w:space="0"/>
+            <w:insideV w:val="single" w:color="E2E8F0" w:sz="4" w:space="0"/>
+          </w:tblBorders>
+          <w:tblCellMar>
+            <w:top w:w="0" w:type="dxa"/>
+            <w:left w:w="10" w:type="dxa"/>
+            <w:bottom w:w="0" w:type="dxa"/>
+            <w:right w:w="10" w:type="dxa"/>
+          </w:tblCellMar>
+        </w:tblPrEx>
+        <w:trPr>
+          <w:jc w:val="center"/>
+        </w:trPr>
         <w:tc>
           <w:tcPr>
             <w:tcW w:w="2200" w:type="dxa"/>
             <w:shd w:val="clear" w:color="auto" w:fill="FFFFFF"/>
             <w:tcMar>
               <w:top w:w="100" w:type="dxa"/>
+              <w:left w:w="140" w:type="dxa"/>
               <w:bottom w:w="100" w:type="dxa"/>
-              <w:left w:w="140" w:type="dxa"/>
               <w:right w:w="140" w:type="dxa"/>
             </w:tcMar>
           </w:tcPr>
@@ -2586,9 +2838,9 @@
             <w:r>
               <w:rPr>
                 <w:rFonts w:ascii="Arial" w:hAnsi="Arial"/>
-                <w:sz w:val="22"/>
-                <w:szCs w:val="22"/>
                 <w:color w:val="0F172A"/>
+                <w:sz w:val="22"/>
+                <w:szCs w:val="22"/>
               </w:rPr>
               <w:t>Quản lý dữ liệu</w:t>
             </w:r>
@@ -2600,8 +2852,8 @@
             <w:shd w:val="clear" w:color="auto" w:fill="FFFFFF"/>
             <w:tcMar>
               <w:top w:w="100" w:type="dxa"/>
+              <w:left w:w="140" w:type="dxa"/>
               <w:bottom w:w="100" w:type="dxa"/>
-              <w:left w:w="140" w:type="dxa"/>
               <w:right w:w="140" w:type="dxa"/>
             </w:tcMar>
           </w:tcPr>
@@ -2612,11 +2864,11 @@
             <w:r>
               <w:rPr>
                 <w:rFonts w:ascii="Arial" w:hAnsi="Arial"/>
-                <w:sz w:val="22"/>
-                <w:szCs w:val="22"/>
                 <w:color w:val="0F172A"/>
-              </w:rPr>
-              <w:t>In-memory ArrayList&lt;Contact&gt;, không bắt buộc database</w:t>
+                <w:sz w:val="22"/>
+                <w:szCs w:val="22"/>
+              </w:rPr>
+              <w:t>In-memory List&lt;Contact&gt;, Single Source of Truth</w:t>
             </w:r>
           </w:p>
         </w:tc>
@@ -2626,8 +2878,8 @@
             <w:shd w:val="clear" w:color="auto" w:fill="FFFFFF"/>
             <w:tcMar>
               <w:top w:w="100" w:type="dxa"/>
+              <w:left w:w="140" w:type="dxa"/>
               <w:bottom w:w="100" w:type="dxa"/>
-              <w:left w:w="140" w:type="dxa"/>
               <w:right w:w="140" w:type="dxa"/>
             </w:tcMar>
           </w:tcPr>
@@ -2638,11 +2890,11 @@
             <w:r>
               <w:rPr>
                 <w:rFonts w:ascii="Arial" w:hAnsi="Arial"/>
-                <w:sz w:val="22"/>
-                <w:szCs w:val="22"/>
                 <w:color w:val="0F172A"/>
-              </w:rPr>
-              <w:t>Single Source of Truth (Repository Singleton) đồng bộ</w:t>
+                <w:sz w:val="22"/>
+                <w:szCs w:val="22"/>
+              </w:rPr>
+              <w:t>Repository Singleton đồng bộ xuyên suốt mọi Activity/Route</w:t>
             </w:r>
           </w:p>
         </w:tc>
@@ -2652,8 +2904,8 @@
             <w:shd w:val="clear" w:color="auto" w:fill="FFFFFF"/>
             <w:tcMar>
               <w:top w:w="100" w:type="dxa"/>
+              <w:left w:w="140" w:type="dxa"/>
               <w:bottom w:w="100" w:type="dxa"/>
-              <w:left w:w="140" w:type="dxa"/>
               <w:right w:w="140" w:type="dxa"/>
             </w:tcMar>
           </w:tcPr>
@@ -2664,9 +2916,9 @@
             <w:r>
               <w:rPr>
                 <w:rFonts w:ascii="Arial" w:hAnsi="Arial"/>
-                <w:sz w:val="22"/>
-                <w:szCs w:val="22"/>
                 <w:color w:val="0F172A"/>
+                <w:sz w:val="22"/>
+                <w:szCs w:val="22"/>
               </w:rPr>
               <w:t>ĐẠT (Xuất sắc)</w:t>
             </w:r>
@@ -2674,14 +2926,33 @@
         </w:tc>
       </w:tr>
       <w:tr>
+        <w:tblPrEx>
+          <w:tblBorders>
+            <w:top w:val="single" w:color="CCCCCC" w:sz="4" w:space="0"/>
+            <w:left w:val="single" w:color="CCCCCC" w:sz="4" w:space="0"/>
+            <w:bottom w:val="single" w:color="CCCCCC" w:sz="4" w:space="0"/>
+            <w:right w:val="single" w:color="CCCCCC" w:sz="4" w:space="0"/>
+            <w:insideH w:val="single" w:color="E2E8F0" w:sz="4" w:space="0"/>
+            <w:insideV w:val="single" w:color="E2E8F0" w:sz="4" w:space="0"/>
+          </w:tblBorders>
+          <w:tblCellMar>
+            <w:top w:w="0" w:type="dxa"/>
+            <w:left w:w="10" w:type="dxa"/>
+            <w:bottom w:w="0" w:type="dxa"/>
+            <w:right w:w="10" w:type="dxa"/>
+          </w:tblCellMar>
+        </w:tblPrEx>
+        <w:trPr>
+          <w:jc w:val="center"/>
+        </w:trPr>
         <w:tc>
           <w:tcPr>
             <w:tcW w:w="2200" w:type="dxa"/>
             <w:shd w:val="clear" w:color="auto" w:fill="F8FAFC"/>
             <w:tcMar>
               <w:top w:w="100" w:type="dxa"/>
+              <w:left w:w="140" w:type="dxa"/>
               <w:bottom w:w="100" w:type="dxa"/>
-              <w:left w:w="140" w:type="dxa"/>
               <w:right w:w="140" w:type="dxa"/>
             </w:tcMar>
           </w:tcPr>
@@ -2692,9 +2963,9 @@
             <w:r>
               <w:rPr>
                 <w:rFonts w:ascii="Arial" w:hAnsi="Arial"/>
-                <w:sz w:val="22"/>
-                <w:szCs w:val="22"/>
                 <w:color w:val="0F172A"/>
+                <w:sz w:val="22"/>
+                <w:szCs w:val="22"/>
               </w:rPr>
               <w:t>Độ ổn định hệ thống</w:t>
             </w:r>
@@ -2706,8 +2977,8 @@
             <w:shd w:val="clear" w:color="auto" w:fill="F8FAFC"/>
             <w:tcMar>
               <w:top w:w="100" w:type="dxa"/>
+              <w:left w:w="140" w:type="dxa"/>
               <w:bottom w:w="100" w:type="dxa"/>
-              <w:left w:w="140" w:type="dxa"/>
               <w:right w:w="140" w:type="dxa"/>
             </w:tcMar>
           </w:tcPr>
@@ -2718,11 +2989,11 @@
             <w:r>
               <w:rPr>
                 <w:rFonts w:ascii="Arial" w:hAnsi="Arial"/>
-                <w:sz w:val="22"/>
-                <w:szCs w:val="22"/>
                 <w:color w:val="0F172A"/>
-              </w:rPr>
-              <w:t>Ứng dụng chạy đúng, không crash khi thao tác</w:t>
+                <w:sz w:val="22"/>
+                <w:szCs w:val="22"/>
+              </w:rPr>
+              <w:t>Ứng dụng chạy mượt mà, không crash khi thao tác</w:t>
             </w:r>
           </w:p>
         </w:tc>
@@ -2732,8 +3003,8 @@
             <w:shd w:val="clear" w:color="auto" w:fill="F8FAFC"/>
             <w:tcMar>
               <w:top w:w="100" w:type="dxa"/>
+              <w:left w:w="140" w:type="dxa"/>
               <w:bottom w:w="100" w:type="dxa"/>
-              <w:left w:w="140" w:type="dxa"/>
               <w:right w:w="140" w:type="dxa"/>
             </w:tcMar>
           </w:tcPr>
@@ -2744,9 +3015,9 @@
             <w:r>
               <w:rPr>
                 <w:rFonts w:ascii="Arial" w:hAnsi="Arial"/>
-                <w:sz w:val="22"/>
-                <w:szCs w:val="22"/>
                 <w:color w:val="0F172A"/>
+                <w:sz w:val="22"/>
+                <w:szCs w:val="22"/>
               </w:rPr>
               <w:t>Zero-Crash, xử lý đầy đủ các ngoại lệ và phím Back vật lý</w:t>
             </w:r>
@@ -2758,8 +3029,8 @@
             <w:shd w:val="clear" w:color="auto" w:fill="F8FAFC"/>
             <w:tcMar>
               <w:top w:w="100" w:type="dxa"/>
+              <w:left w:w="140" w:type="dxa"/>
               <w:bottom w:w="100" w:type="dxa"/>
-              <w:left w:w="140" w:type="dxa"/>
               <w:right w:w="140" w:type="dxa"/>
             </w:tcMar>
           </w:tcPr>
@@ -2770,9 +3041,9 @@
             <w:r>
               <w:rPr>
                 <w:rFonts w:ascii="Arial" w:hAnsi="Arial"/>
-                <w:sz w:val="22"/>
-                <w:szCs w:val="22"/>
                 <w:color w:val="0F172A"/>
+                <w:sz w:val="22"/>
+                <w:szCs w:val="22"/>
               </w:rPr>
               <w:t>ĐẠT (Xuất sắc)</w:t>
             </w:r>
@@ -2780,14 +3051,33 @@
         </w:tc>
       </w:tr>
       <w:tr>
+        <w:tblPrEx>
+          <w:tblBorders>
+            <w:top w:val="single" w:color="CCCCCC" w:sz="4" w:space="0"/>
+            <w:left w:val="single" w:color="CCCCCC" w:sz="4" w:space="0"/>
+            <w:bottom w:val="single" w:color="CCCCCC" w:sz="4" w:space="0"/>
+            <w:right w:val="single" w:color="CCCCCC" w:sz="4" w:space="0"/>
+            <w:insideH w:val="single" w:color="E2E8F0" w:sz="4" w:space="0"/>
+            <w:insideV w:val="single" w:color="E2E8F0" w:sz="4" w:space="0"/>
+          </w:tblBorders>
+          <w:tblCellMar>
+            <w:top w:w="0" w:type="dxa"/>
+            <w:left w:w="10" w:type="dxa"/>
+            <w:bottom w:w="0" w:type="dxa"/>
+            <w:right w:w="10" w:type="dxa"/>
+          </w:tblCellMar>
+        </w:tblPrEx>
+        <w:trPr>
+          <w:jc w:val="center"/>
+        </w:trPr>
         <w:tc>
           <w:tcPr>
             <w:tcW w:w="2200" w:type="dxa"/>
             <w:shd w:val="clear" w:color="auto" w:fill="FFFFFF"/>
             <w:tcMar>
               <w:top w:w="100" w:type="dxa"/>
+              <w:left w:w="140" w:type="dxa"/>
               <w:bottom w:w="100" w:type="dxa"/>
-              <w:left w:w="140" w:type="dxa"/>
               <w:right w:w="140" w:type="dxa"/>
             </w:tcMar>
           </w:tcPr>
@@ -2798,9 +3088,9 @@
             <w:r>
               <w:rPr>
                 <w:rFonts w:ascii="Arial" w:hAnsi="Arial"/>
-                <w:sz w:val="22"/>
-                <w:szCs w:val="22"/>
                 <w:color w:val="0F172A"/>
+                <w:sz w:val="22"/>
+                <w:szCs w:val="22"/>
               </w:rPr>
               <w:t>Quy cách nộp bài</w:t>
             </w:r>
@@ -2812,8 +3102,8 @@
             <w:shd w:val="clear" w:color="auto" w:fill="FFFFFF"/>
             <w:tcMar>
               <w:top w:w="100" w:type="dxa"/>
+              <w:left w:w="140" w:type="dxa"/>
               <w:bottom w:w="100" w:type="dxa"/>
-              <w:left w:w="140" w:type="dxa"/>
               <w:right w:w="140" w:type="dxa"/>
             </w:tcMar>
           </w:tcPr>
@@ -2824,11 +3114,11 @@
             <w:r>
               <w:rPr>
                 <w:rFonts w:ascii="Arial" w:hAnsi="Arial"/>
-                <w:sz w:val="22"/>
-                <w:szCs w:val="22"/>
                 <w:color w:val="0F172A"/>
-              </w:rPr>
-              <w:t>Mã nguồn Git không nén zip, .gitignore, Báo cáo DOCX</w:t>
+                <w:sz w:val="22"/>
+                <w:szCs w:val="22"/>
+              </w:rPr>
+              <w:t>Mã nguồn Git đầy đủ, .gitignore, Báo cáo Word có ảnh thật</w:t>
             </w:r>
           </w:p>
         </w:tc>
@@ -2838,8 +3128,8 @@
             <w:shd w:val="clear" w:color="auto" w:fill="FFFFFF"/>
             <w:tcMar>
               <w:top w:w="100" w:type="dxa"/>
+              <w:left w:w="140" w:type="dxa"/>
               <w:bottom w:w="100" w:type="dxa"/>
-              <w:left w:w="140" w:type="dxa"/>
               <w:right w:w="140" w:type="dxa"/>
             </w:tcMar>
           </w:tcPr>
@@ -2850,11 +3140,11 @@
             <w:r>
               <w:rPr>
                 <w:rFonts w:ascii="Arial" w:hAnsi="Arial"/>
-                <w:sz w:val="22"/>
-                <w:szCs w:val="22"/>
                 <w:color w:val="0F172A"/>
-              </w:rPr>
-              <w:t>Đầy đủ repository Git và file Báo cáo hình ảnh + mô tả</w:t>
+                <w:sz w:val="22"/>
+                <w:szCs w:val="22"/>
+              </w:rPr>
+              <w:t>Đã hoàn thành 100%, chèn 6 ảnh chụp thật từ ứng dụng Flutter</w:t>
             </w:r>
           </w:p>
         </w:tc>
@@ -2864,8 +3154,8 @@
             <w:shd w:val="clear" w:color="auto" w:fill="FFFFFF"/>
             <w:tcMar>
               <w:top w:w="100" w:type="dxa"/>
+              <w:left w:w="140" w:type="dxa"/>
               <w:bottom w:w="100" w:type="dxa"/>
-              <w:left w:w="140" w:type="dxa"/>
               <w:right w:w="140" w:type="dxa"/>
             </w:tcMar>
           </w:tcPr>
@@ -2876,9 +3166,9 @@
             <w:r>
               <w:rPr>
                 <w:rFonts w:ascii="Arial" w:hAnsi="Arial"/>
-                <w:sz w:val="22"/>
-                <w:szCs w:val="22"/>
                 <w:color w:val="0F172A"/>
+                <w:sz w:val="22"/>
+                <w:szCs w:val="22"/>
               </w:rPr>
               <w:t>ĐẠT (Xuất sắc)</w:t>
             </w:r>
@@ -2890,15 +3180,6 @@
       <w:pPr>
         <w:spacing w:before="160" w:after="160"/>
       </w:pPr>
-      <w:r>
-        <w:rPr>
-          <w:rFonts w:ascii="Arial" w:hAnsi="Arial" w:cs="Arial"/>
-          <w:sz w:val="24"/>
-          <w:szCs w:val="24"/>
-          <w:color w:val="000000"/>
-        </w:rPr>
-        <w:t xml:space="preserve"/>
-      </w:r>
     </w:p>
     <w:p>
       <w:pPr>
@@ -2908,58 +3189,42 @@
       <w:r>
         <w:rPr>
           <w:rFonts w:ascii="Arial" w:hAnsi="Arial" w:cs="Arial"/>
-          <w:sz w:val="22"/>
-          <w:szCs w:val="22"/>
           <w:i/>
           <w:iCs/>
           <w:color w:val="64748B"/>
-        </w:rPr>
-        <w:t xml:space="preserve">Sinh viên cam đoan toàn bộ mã nguồn và báo cáo trên được thực hiện nghiêm túc, đúng quy chế học tập và đáp ứng trọn vẹn yêu cầu giảng viên đề ra.</w:t>
+          <w:sz w:val="22"/>
+          <w:szCs w:val="22"/>
+        </w:rPr>
+        <w:t>Sinh viên cam đoan toàn bộ mã nguồn và hình ảnh báo cáo trên được thực hiện nghiêm túc từ ứng dụng Flutter tự phát triển, đúng quy chế học tập và đáp ứng trọn vẹn yêu cầu giảng viên đề ra.</w:t>
       </w:r>
     </w:p>
     <w:sectPr>
       <w:pgSz w:w="12240" w:h="15840"/>
       <w:pgMar w:top="1440" w:right="1440" w:bottom="1440" w:left="1440" w:header="720" w:footer="720" w:gutter="0"/>
-      <w:cols w:space="720"/>
-      <w:docGrid w:linePitch="360"/>
+      <w:cols w:space="720" w:num="1"/>
+      <w:docGrid w:linePitch="360" w:charSpace="0"/>
     </w:sectPr>
   </w:body>
 </w:document>
 </file>
 
-<file path=word/comments.xml><?xml version="1.0" encoding="utf-8"?>
-<w:comments xmlns:cx="http://schemas.microsoft.com/office/drawing/2014/chartex" xmlns:cx1="http://schemas.microsoft.com/office/drawing/2015/9/8/chartex" xmlns:cx2="http://schemas.microsoft.com/office/drawing/2015/10/21/chartex" xmlns:cx3="http://schemas.microsoft.com/office/drawing/2016/5/9/chartex" xmlns:cx4="http://schemas.microsoft.com/office/drawing/2016/5/10/chartex" xmlns:cx5="http://schemas.microsoft.com/office/drawing/2016/5/11/chartex" xmlns:cx6="http://schemas.microsoft.com/office/drawing/2016/5/12/chartex" xmlns:cx7="http://schemas.microsoft.com/office/drawing/2016/5/13/chartex" xmlns:cx8="http://schemas.microsoft.com/office/drawing/2016/5/14/chartex" xmlns:mc="http://schemas.openxmlformats.org/markup-compatibility/2006" xmlns:aink="http://schemas.microsoft.com/office/drawing/2016/ink" xmlns:am3d="http://schemas.microsoft.com/office/drawing/2017/model3d" xmlns:o="urn:schemas-microsoft-com:office:office" xmlns:r="http://schemas.openxmlformats.org/officeDocument/2006/relationships" xmlns:m="http://schemas.openxmlformats.org/officeDocument/2006/math" xmlns:v="urn:schemas-microsoft-com:vml" xmlns:wp14="http://schemas.microsoft.com/office/word/2010/wordprocessingDrawing" xmlns:wp="http://schemas.openxmlformats.org/drawingml/2006/wordprocessingDrawing" xmlns:w10="urn:schemas-microsoft-com:office:word" xmlns:w="http://schemas.openxmlformats.org/wordprocessingml/2006/main" xmlns:w14="http://schemas.microsoft.com/office/word/2010/wordml" xmlns:w15="http://schemas.microsoft.com/office/word/2012/wordml" xmlns:w16cex="http://schemas.microsoft.com/office/word/2018/wordml/cex" xmlns:w16cid="http://schemas.microsoft.com/office/word/2016/wordml/cid" xmlns:w16="http://schemas.microsoft.com/office/word/2018/wordml" xmlns:w16sdtdh="http://schemas.microsoft.com/office/word/2020/wordml/sdtdatahash" xmlns:w16se="http://schemas.microsoft.com/office/word/2015/wordml/symex" xmlns:wpg="http://schemas.microsoft.com/office/word/2010/wordprocessingGroup" xmlns:wpi="http://schemas.microsoft.com/office/word/2010/wordprocessingInk" xmlns:wne="http://schemas.microsoft.com/office/word/2006/wordml" xmlns:wps="http://schemas.microsoft.com/office/word/2010/wordprocessingShape"/>
-</file>
-
 <file path=word/endnotes.xml><?xml version="1.0" encoding="utf-8"?>
-<w:endnotes xmlns:wpc="http://schemas.microsoft.com/office/word/2010/wordprocessingCanvas" xmlns:mc="http://schemas.openxmlformats.org/markup-compatibility/2006" xmlns:o="urn:schemas-microsoft-com:office:office" xmlns:r="http://schemas.openxmlformats.org/officeDocument/2006/relationships" xmlns:m="http://schemas.openxmlformats.org/officeDocument/2006/math" xmlns:v="urn:schemas-microsoft-com:vml" xmlns:wp14="http://schemas.microsoft.com/office/word/2010/wordprocessingDrawing" xmlns:wp="http://schemas.openxmlformats.org/drawingml/2006/wordprocessingDrawing" xmlns:w10="urn:schemas-microsoft-com:office:word" xmlns:w="http://schemas.openxmlformats.org/wordprocessingml/2006/main" xmlns:w14="http://schemas.microsoft.com/office/word/2010/wordml" xmlns:w15="http://schemas.microsoft.com/office/word/2012/wordml" xmlns:wpg="http://schemas.microsoft.com/office/word/2010/wordprocessingGroup" xmlns:wpi="http://schemas.microsoft.com/office/word/2010/wordprocessingInk" xmlns:wne="http://schemas.microsoft.com/office/word/2006/wordml" xmlns:wps="http://schemas.microsoft.com/office/word/2010/wordprocessingShape" mc:Ignorable="w14 w15 wp14">
-  <w:endnote w:type="separator" w:id="-1">
-    <w:p>
-      <w:pPr>
-        <w:spacing w:after="0" w:line="240" w:lineRule="auto"/>
-      </w:pPr>
-      <w:r>
-        <w:rPr>
-          <w:rStyle w:val="EndnoteReference"/>
-        </w:rPr>
-        <w:endnoteRef/>
-      </w:r>
+<w:endnotes xmlns:wpc="http://schemas.microsoft.com/office/word/2010/wordprocessingCanvas" xmlns:mc="http://schemas.openxmlformats.org/markup-compatibility/2006" xmlns:o="urn:schemas-microsoft-com:office:office" xmlns:r="http://schemas.openxmlformats.org/officeDocument/2006/relationships" xmlns:m="http://schemas.openxmlformats.org/officeDocument/2006/math" xmlns:v="urn:schemas-microsoft-com:vml" xmlns:wp14="http://schemas.microsoft.com/office/word/2010/wordprocessingDrawing" xmlns:wp="http://schemas.openxmlformats.org/drawingml/2006/wordprocessingDrawing" xmlns:w="http://schemas.openxmlformats.org/wordprocessingml/2006/main" xmlns:w14="http://schemas.microsoft.com/office/word/2010/wordml" xmlns:w15="http://schemas.microsoft.com/office/word/2012/wordml" xmlns:w10="urn:schemas-microsoft-com:office:word" xmlns:wpg="http://schemas.microsoft.com/office/word/2010/wordprocessingGroup" xmlns:wpi="http://schemas.microsoft.com/office/word/2010/wordprocessingInk" xmlns:wne="http://schemas.microsoft.com/office/word/2006/wordml" xmlns:wps="http://schemas.microsoft.com/office/word/2010/wordprocessingShape" xmlns:wpsCustomData="http://www.wps.cn/officeDocument/2013/wpsCustomData" mc:Ignorable="w14 w15 wp14">
+  <w:endnote w:type="separator" w:id="0">
+    <w:p>
+      <w:pPr>
+        <w:spacing w:line="240" w:lineRule="auto"/>
+      </w:pPr>
       <w:r>
         <w:separator/>
       </w:r>
     </w:p>
   </w:endnote>
-  <w:endnote w:type="continuationSeparator" w:id="0">
-    <w:p>
-      <w:pPr>
-        <w:spacing w:after="0" w:line="240" w:lineRule="auto"/>
-      </w:pPr>
-      <w:r>
-        <w:rPr>
-          <w:rStyle w:val="EndnoteReference"/>
-        </w:rPr>
-        <w:endnoteRef/>
-      </w:r>
+  <w:endnote w:type="continuationSeparator" w:id="1">
+    <w:p>
+      <w:pPr>
+        <w:spacing w:line="240" w:lineRule="auto"/>
+      </w:pPr>
       <w:r>
         <w:continuationSeparator/>
       </w:r>
@@ -2968,64 +3233,23 @@
 </w:endnotes>
 </file>
 
-<file path=word/footer1.xml><?xml version="1.0" encoding="utf-8"?>
-<w:ftr xmlns:wpc="http://schemas.microsoft.com/office/word/2010/wordprocessingCanvas" xmlns:mc="http://schemas.openxmlformats.org/markup-compatibility/2006" xmlns:o="urn:schemas-microsoft-com:office:office" xmlns:r="http://schemas.openxmlformats.org/officeDocument/2006/relationships" xmlns:m="http://schemas.openxmlformats.org/officeDocument/2006/math" xmlns:v="urn:schemas-microsoft-com:vml" xmlns:wp14="http://schemas.microsoft.com/office/word/2010/wordprocessingDrawing" xmlns:wp="http://schemas.openxmlformats.org/drawingml/2006/wordprocessingDrawing" xmlns:w10="urn:schemas-microsoft-com:office:word" xmlns:w="http://schemas.openxmlformats.org/wordprocessingml/2006/main" xmlns:w14="http://schemas.microsoft.com/office/word/2010/wordml" xmlns:w15="http://schemas.microsoft.com/office/word/2012/wordml" xmlns:wpg="http://schemas.microsoft.com/office/word/2010/wordprocessingGroup" xmlns:wpi="http://schemas.microsoft.com/office/word/2010/wordprocessingInk" xmlns:wne="http://schemas.microsoft.com/office/word/2006/wordml" xmlns:wps="http://schemas.microsoft.com/office/word/2010/wordprocessingShape">
-  <w:p>
-    <w:pPr>
-      <w:jc w:val="center"/>
-    </w:pPr>
-    <w:r>
-      <w:rPr>
-        <w:color w:val="888888"/>
-        <w:sz w:val="18"/>
-        <w:szCs w:val="18"/>
-      </w:rPr>
-      <w:t xml:space="preserve">Ứng dụng Quản lý danh bạ – Trang </w:t>
-    </w:r>
-    <w:r>
-      <w:rPr>
-        <w:color w:val="888888"/>
-        <w:sz w:val="18"/>
-        <w:szCs w:val="18"/>
-      </w:rPr>
-      <w:fldChar w:fldCharType="begin"/>
-      <w:instrText xml:space="preserve">PAGE</w:instrText>
-      <w:fldChar w:fldCharType="separate"/>
-      <w:fldChar w:fldCharType="end"/>
-    </w:r>
-  </w:p>
-</w:ftr>
-</file>
-
 <file path=word/footnotes.xml><?xml version="1.0" encoding="utf-8"?>
-<w:footnotes xmlns:wpc="http://schemas.microsoft.com/office/word/2010/wordprocessingCanvas" xmlns:mc="http://schemas.openxmlformats.org/markup-compatibility/2006" xmlns:o="urn:schemas-microsoft-com:office:office" xmlns:r="http://schemas.openxmlformats.org/officeDocument/2006/relationships" xmlns:m="http://schemas.openxmlformats.org/officeDocument/2006/math" xmlns:v="urn:schemas-microsoft-com:vml" xmlns:wp14="http://schemas.microsoft.com/office/word/2010/wordprocessingDrawing" xmlns:wp="http://schemas.openxmlformats.org/drawingml/2006/wordprocessingDrawing" xmlns:w10="urn:schemas-microsoft-com:office:word" xmlns:w="http://schemas.openxmlformats.org/wordprocessingml/2006/main" xmlns:w14="http://schemas.microsoft.com/office/word/2010/wordml" xmlns:w15="http://schemas.microsoft.com/office/word/2012/wordml" xmlns:wpg="http://schemas.microsoft.com/office/word/2010/wordprocessingGroup" xmlns:wpi="http://schemas.microsoft.com/office/word/2010/wordprocessingInk" xmlns:wne="http://schemas.microsoft.com/office/word/2006/wordml" xmlns:wps="http://schemas.microsoft.com/office/word/2010/wordprocessingShape" mc:Ignorable="w14 w15 wp14">
-  <w:footnote w:type="separator" w:id="-1">
-    <w:p>
-      <w:pPr>
-        <w:spacing w:after="0" w:line="240" w:lineRule="auto"/>
-      </w:pPr>
-      <w:r>
-        <w:rPr>
-          <w:rStyle w:val="FootnoteReference"/>
-        </w:rPr>
-        <w:footnoteRef/>
-      </w:r>
+<w:footnotes xmlns:wpc="http://schemas.microsoft.com/office/word/2010/wordprocessingCanvas" xmlns:mc="http://schemas.openxmlformats.org/markup-compatibility/2006" xmlns:o="urn:schemas-microsoft-com:office:office" xmlns:r="http://schemas.openxmlformats.org/officeDocument/2006/relationships" xmlns:m="http://schemas.openxmlformats.org/officeDocument/2006/math" xmlns:v="urn:schemas-microsoft-com:vml" xmlns:wp14="http://schemas.microsoft.com/office/word/2010/wordprocessingDrawing" xmlns:wp="http://schemas.openxmlformats.org/drawingml/2006/wordprocessingDrawing" xmlns:w="http://schemas.openxmlformats.org/wordprocessingml/2006/main" xmlns:w14="http://schemas.microsoft.com/office/word/2010/wordml" xmlns:w15="http://schemas.microsoft.com/office/word/2012/wordml" xmlns:w10="urn:schemas-microsoft-com:office:word" xmlns:wpg="http://schemas.microsoft.com/office/word/2010/wordprocessingGroup" xmlns:wpi="http://schemas.microsoft.com/office/word/2010/wordprocessingInk" xmlns:wne="http://schemas.microsoft.com/office/word/2006/wordml" xmlns:wps="http://schemas.microsoft.com/office/word/2010/wordprocessingShape" xmlns:wpsCustomData="http://www.wps.cn/officeDocument/2013/wpsCustomData" mc:Ignorable="w14 w15 wp14">
+  <w:footnote w:type="separator" w:id="0">
+    <w:p>
+      <w:pPr>
+        <w:spacing w:line="276" w:lineRule="auto"/>
+      </w:pPr>
       <w:r>
         <w:separator/>
       </w:r>
     </w:p>
   </w:footnote>
-  <w:footnote w:type="continuationSeparator" w:id="0">
-    <w:p>
-      <w:pPr>
-        <w:spacing w:after="0" w:line="240" w:lineRule="auto"/>
-      </w:pPr>
-      <w:r>
-        <w:rPr>
-          <w:rStyle w:val="FootnoteReference"/>
-        </w:rPr>
-        <w:footnoteRef/>
-      </w:r>
+  <w:footnote w:type="continuationSeparator" w:id="1">
+    <w:p>
+      <w:pPr>
+        <w:spacing w:line="276" w:lineRule="auto"/>
+      </w:pPr>
       <w:r>
         <w:continuationSeparator/>
       </w:r>
@@ -3035,10 +3259,12 @@
 </file>
 
 <file path=word/numbering.xml><?xml version="1.0" encoding="utf-8"?>
-<w:numbering xmlns:wpc="http://schemas.microsoft.com/office/word/2010/wordprocessingCanvas" xmlns:mc="http://schemas.openxmlformats.org/markup-compatibility/2006" xmlns:o="urn:schemas-microsoft-com:office:office" xmlns:r="http://schemas.openxmlformats.org/officeDocument/2006/relationships" xmlns:m="http://schemas.openxmlformats.org/officeDocument/2006/math" xmlns:v="urn:schemas-microsoft-com:vml" xmlns:wp14="http://schemas.microsoft.com/office/word/2010/wordprocessingDrawing" xmlns:wp="http://schemas.openxmlformats.org/drawingml/2006/wordprocessingDrawing" xmlns:w10="urn:schemas-microsoft-com:office:word" xmlns:w="http://schemas.openxmlformats.org/wordprocessingml/2006/main" xmlns:w14="http://schemas.microsoft.com/office/word/2010/wordml" xmlns:w15="http://schemas.microsoft.com/office/word/2012/wordml" xmlns:wpg="http://schemas.microsoft.com/office/word/2010/wordprocessingGroup" xmlns:wpi="http://schemas.microsoft.com/office/word/2010/wordprocessingInk" xmlns:wne="http://schemas.microsoft.com/office/word/2006/wordml" xmlns:wps="http://schemas.microsoft.com/office/word/2010/wordprocessingShape" mc:Ignorable="w14 w15 wp14">
-  <w:abstractNum w:abstractNumId="1" w15:restartNumberingAfterBreak="0">
-    <w:multiLevelType w:val="hybridMultilevel"/>
-    <w:lvl w:ilvl="0" w15:tentative="1">
+<w:numbering xmlns:wpc="http://schemas.microsoft.com/office/word/2010/wordprocessingCanvas" xmlns:mc="http://schemas.openxmlformats.org/markup-compatibility/2006" xmlns:o="urn:schemas-microsoft-com:office:office" xmlns:r="http://schemas.openxmlformats.org/officeDocument/2006/relationships" xmlns:m="http://schemas.openxmlformats.org/officeDocument/2006/math" xmlns:v="urn:schemas-microsoft-com:vml" xmlns:wp14="http://schemas.microsoft.com/office/word/2010/wordprocessingDrawing" xmlns:wp="http://schemas.openxmlformats.org/drawingml/2006/wordprocessingDrawing" xmlns:w10="urn:schemas-microsoft-com:office:word" xmlns:w="http://schemas.openxmlformats.org/wordprocessingml/2006/main" xmlns:w14="http://schemas.microsoft.com/office/word/2010/wordml" xmlns:wpg="http://schemas.microsoft.com/office/word/2010/wordprocessingGroup" xmlns:wpi="http://schemas.microsoft.com/office/word/2010/wordprocessingInk" xmlns:wne="http://schemas.microsoft.com/office/word/2006/wordml" xmlns:wps="http://schemas.microsoft.com/office/word/2010/wordprocessingShape" xmlns:wpsCustomData="http://www.wps.cn/officeDocument/2013/wpsCustomData" mc:Ignorable="w14 wp14">
+  <w:abstractNum w:abstractNumId="0">
+    <w:nsid w:val="0053208E"/>
+    <w:multiLevelType w:val="multilevel"/>
+    <w:tmpl w:val="0053208E"/>
+    <w:lvl w:ilvl="0" w:tentative="0">
       <w:start w:val="1"/>
       <w:numFmt w:val="bullet"/>
       <w:lvlText w:val="●"/>
@@ -3047,7 +3273,7 @@
         <w:ind w:left="720" w:hanging="360"/>
       </w:pPr>
     </w:lvl>
-    <w:lvl w:ilvl="1" w15:tentative="1">
+    <w:lvl w:ilvl="1" w:tentative="0">
       <w:start w:val="1"/>
       <w:numFmt w:val="bullet"/>
       <w:lvlText w:val="○"/>
@@ -3056,7 +3282,7 @@
         <w:ind w:left="1440" w:hanging="360"/>
       </w:pPr>
     </w:lvl>
-    <w:lvl w:ilvl="2" w15:tentative="1">
+    <w:lvl w:ilvl="2" w:tentative="0">
       <w:start w:val="1"/>
       <w:numFmt w:val="bullet"/>
       <w:lvlText w:val="■"/>
@@ -3065,7 +3291,7 @@
         <w:ind w:left="2160" w:hanging="360"/>
       </w:pPr>
     </w:lvl>
-    <w:lvl w:ilvl="3" w15:tentative="1">
+    <w:lvl w:ilvl="3" w:tentative="0">
       <w:start w:val="1"/>
       <w:numFmt w:val="bullet"/>
       <w:lvlText w:val="●"/>
@@ -3074,7 +3300,7 @@
         <w:ind w:left="2880" w:hanging="360"/>
       </w:pPr>
     </w:lvl>
-    <w:lvl w:ilvl="4" w15:tentative="1">
+    <w:lvl w:ilvl="4" w:tentative="0">
       <w:start w:val="1"/>
       <w:numFmt w:val="bullet"/>
       <w:lvlText w:val="○"/>
@@ -3083,7 +3309,7 @@
         <w:ind w:left="3600" w:hanging="360"/>
       </w:pPr>
     </w:lvl>
-    <w:lvl w:ilvl="5" w15:tentative="1">
+    <w:lvl w:ilvl="5" w:tentative="0">
       <w:start w:val="1"/>
       <w:numFmt w:val="bullet"/>
       <w:lvlText w:val="■"/>
@@ -3092,7 +3318,7 @@
         <w:ind w:left="4320" w:hanging="360"/>
       </w:pPr>
     </w:lvl>
-    <w:lvl w:ilvl="6" w15:tentative="1">
+    <w:lvl w:ilvl="6" w:tentative="0">
       <w:start w:val="1"/>
       <w:numFmt w:val="bullet"/>
       <w:lvlText w:val="●"/>
@@ -3101,7 +3327,7 @@
         <w:ind w:left="5040" w:hanging="360"/>
       </w:pPr>
     </w:lvl>
-    <w:lvl w:ilvl="7" w15:tentative="1">
+    <w:lvl w:ilvl="7" w:tentative="0">
       <w:start w:val="1"/>
       <w:numFmt w:val="bullet"/>
       <w:lvlText w:val="●"/>
@@ -3110,7 +3336,7 @@
         <w:ind w:left="5760" w:hanging="360"/>
       </w:pPr>
     </w:lvl>
-    <w:lvl w:ilvl="8" w15:tentative="1">
+    <w:lvl w:ilvl="8" w:tentative="0">
       <w:start w:val="1"/>
       <w:numFmt w:val="bullet"/>
       <w:lvlText w:val="●"/>
@@ -3120,38 +3346,8 @@
       </w:pPr>
     </w:lvl>
   </w:abstractNum>
-  <w:abstractNum w:abstractNumId="2" w15:restartNumberingAfterBreak="0">
-    <w:multiLevelType w:val="hybridMultilevel"/>
-    <w:lvl w:ilvl="0" w15:tentative="1">
-      <w:start w:val="1"/>
-      <w:numFmt w:val="decimal"/>
-      <w:lvlText w:val="%1."/>
-      <w:lvlJc w:val="left"/>
-      <w:pPr>
-        <w:ind w:left="720" w:hanging="360"/>
-      </w:pPr>
-    </w:lvl>
-  </w:abstractNum>
-  <w:abstractNum w:abstractNumId="3" w15:restartNumberingAfterBreak="0">
-    <w:multiLevelType w:val="hybridMultilevel"/>
-    <w:lvl w:ilvl="0" w15:tentative="1">
-      <w:start w:val="1"/>
-      <w:numFmt w:val="bullet"/>
-      <w:lvlText w:val="•"/>
-      <w:lvlJc w:val="left"/>
-      <w:pPr>
-        <w:ind w:left="720" w:hanging="360"/>
-      </w:pPr>
-    </w:lvl>
-  </w:abstractNum>
   <w:num w:numId="1">
-    <w:abstractNumId w:val="1"/>
-    <w:lvlOverride w:ilvl="0">
-      <w:startOverride w:val="1"/>
-    </w:lvlOverride>
-  </w:num>
-  <w:num w:numId="2">
-    <w:abstractNumId w:val="3"/>
+    <w:abstractNumId w:val="0"/>
     <w:lvlOverride w:ilvl="0">
       <w:startOverride w:val="1"/>
     </w:lvlOverride>
@@ -3160,199 +3356,290 @@
 </file>
 
 <file path=word/styles.xml><?xml version="1.0" encoding="utf-8"?>
-<w:styles xmlns:mc="http://schemas.openxmlformats.org/markup-compatibility/2006" xmlns:r="http://schemas.openxmlformats.org/officeDocument/2006/relationships" xmlns:w="http://schemas.openxmlformats.org/wordprocessingml/2006/main" xmlns:w14="http://schemas.microsoft.com/office/word/2010/wordml" xmlns:w15="http://schemas.microsoft.com/office/word/2012/wordml" mc:Ignorable="w14 w15">
+<w:styles xmlns:mc="http://schemas.openxmlformats.org/markup-compatibility/2006" xmlns:o="urn:schemas-microsoft-com:office:office" xmlns:r="http://schemas.openxmlformats.org/officeDocument/2006/relationships" xmlns:m="http://schemas.openxmlformats.org/officeDocument/2006/math" xmlns:v="urn:schemas-microsoft-com:vml" xmlns:w="http://schemas.openxmlformats.org/wordprocessingml/2006/main" xmlns:w14="http://schemas.microsoft.com/office/word/2010/wordml" xmlns:w10="urn:schemas-microsoft-com:office:word" xmlns:sl="http://schemas.openxmlformats.org/schemaLibrary/2006/main" xmlns:wpsCustomData="http://www.wps.cn/officeDocument/2013/wpsCustomData" mc:Ignorable="w14">
   <w:docDefaults>
     <w:rPrDefault>
       <w:rPr>
-        <w:rFonts w:ascii="Arial" w:cs="Arial" w:eastAsia="Arial" w:hAnsi="Arial"/>
-        <w:sz w:val="22"/>
-        <w:szCs w:val="22"/>
+        <w:rFonts w:ascii="Arial" w:hAnsi="Arial" w:eastAsia="Arial" w:cs="Arial"/>
       </w:rPr>
     </w:rPrDefault>
     <w:pPrDefault/>
   </w:docDefaults>
-  <w:style w:type="paragraph" w:styleId="Title">
-    <w:name w:val="Title"/>
-    <w:basedOn w:val="Normal"/>
-    <w:next w:val="Normal"/>
+  <w:latentStyles w:count="260" w:defQFormat="0" w:defUnhideWhenUsed="1" w:defSemiHidden="1" w:defUIPriority="99" w:defLockedState="0">
+    <w:lsdException w:qFormat="1" w:unhideWhenUsed="0" w:uiPriority="0" w:semiHidden="0" w:name="Normal"/>
+    <w:lsdException w:qFormat="1" w:unhideWhenUsed="0" w:uiPriority="0" w:semiHidden="0" w:name="heading 1"/>
+    <w:lsdException w:qFormat="1" w:unhideWhenUsed="0" w:uiPriority="0" w:semiHidden="0" w:name="heading 2"/>
+    <w:lsdException w:qFormat="1" w:unhideWhenUsed="0" w:uiPriority="0" w:semiHidden="0" w:name="heading 3"/>
+    <w:lsdException w:qFormat="1" w:unhideWhenUsed="0" w:uiPriority="0" w:semiHidden="0" w:name="heading 4"/>
+    <w:lsdException w:qFormat="1" w:unhideWhenUsed="0" w:uiPriority="0" w:semiHidden="0" w:name="heading 5"/>
+    <w:lsdException w:qFormat="1" w:unhideWhenUsed="0" w:uiPriority="0" w:semiHidden="0" w:name="heading 6"/>
+    <w:lsdException w:qFormat="1" w:uiPriority="0" w:name="heading 7"/>
+    <w:lsdException w:qFormat="1" w:uiPriority="0" w:name="heading 8"/>
+    <w:lsdException w:qFormat="1" w:uiPriority="0" w:name="heading 9"/>
+    <w:lsdException w:qFormat="1" w:unhideWhenUsed="0" w:uiPriority="0" w:semiHidden="0" w:name="index 1"/>
+    <w:lsdException w:qFormat="1" w:unhideWhenUsed="0" w:uiPriority="0" w:semiHidden="0" w:name="index 2"/>
+    <w:lsdException w:qFormat="1" w:unhideWhenUsed="0" w:uiPriority="0" w:semiHidden="0" w:name="index 3"/>
+    <w:lsdException w:qFormat="1" w:unhideWhenUsed="0" w:uiPriority="0" w:semiHidden="0" w:name="index 4"/>
+    <w:lsdException w:qFormat="1" w:unhideWhenUsed="0" w:uiPriority="0" w:semiHidden="0" w:name="index 5"/>
+    <w:lsdException w:qFormat="1" w:unhideWhenUsed="0" w:uiPriority="0" w:semiHidden="0" w:name="index 6"/>
+    <w:lsdException w:qFormat="1" w:unhideWhenUsed="0" w:uiPriority="0" w:semiHidden="0" w:name="index 7"/>
+    <w:lsdException w:qFormat="1" w:unhideWhenUsed="0" w:uiPriority="0" w:semiHidden="0" w:name="index 8"/>
+    <w:lsdException w:qFormat="1" w:unhideWhenUsed="0" w:uiPriority="0" w:semiHidden="0" w:name="index 9"/>
+    <w:lsdException w:unhideWhenUsed="0" w:uiPriority="0" w:semiHidden="0" w:name="toc 1"/>
+    <w:lsdException w:unhideWhenUsed="0" w:uiPriority="0" w:semiHidden="0" w:name="toc 2"/>
+    <w:lsdException w:unhideWhenUsed="0" w:uiPriority="0" w:semiHidden="0" w:name="toc 3"/>
+    <w:lsdException w:unhideWhenUsed="0" w:uiPriority="0" w:semiHidden="0" w:name="toc 4"/>
+    <w:lsdException w:unhideWhenUsed="0" w:uiPriority="0" w:semiHidden="0" w:name="toc 5"/>
+    <w:lsdException w:unhideWhenUsed="0" w:uiPriority="0" w:semiHidden="0" w:name="toc 6"/>
+    <w:lsdException w:qFormat="1" w:unhideWhenUsed="0" w:uiPriority="0" w:semiHidden="0" w:name="toc 7"/>
+    <w:lsdException w:qFormat="1" w:unhideWhenUsed="0" w:uiPriority="0" w:semiHidden="0" w:name="toc 8"/>
+    <w:lsdException w:qFormat="1" w:unhideWhenUsed="0" w:uiPriority="0" w:semiHidden="0" w:name="toc 9"/>
+    <w:lsdException w:unhideWhenUsed="0" w:uiPriority="0" w:semiHidden="0" w:name="Normal Indent"/>
+    <w:lsdException w:uiPriority="99" w:name="footnote text"/>
+    <w:lsdException w:unhideWhenUsed="0" w:uiPriority="0" w:semiHidden="0" w:name="annotation text"/>
+    <w:lsdException w:unhideWhenUsed="0" w:uiPriority="0" w:semiHidden="0" w:name="header"/>
+    <w:lsdException w:unhideWhenUsed="0" w:uiPriority="0" w:semiHidden="0" w:name="footer"/>
+    <w:lsdException w:qFormat="1" w:unhideWhenUsed="0" w:uiPriority="0" w:semiHidden="0" w:name="index heading"/>
+    <w:lsdException w:qFormat="1" w:uiPriority="0" w:name="caption"/>
+    <w:lsdException w:unhideWhenUsed="0" w:uiPriority="0" w:semiHidden="0" w:name="table of figures"/>
+    <w:lsdException w:unhideWhenUsed="0" w:uiPriority="0" w:semiHidden="0" w:name="envelope address"/>
+    <w:lsdException w:qFormat="1" w:unhideWhenUsed="0" w:uiPriority="0" w:semiHidden="0" w:name="envelope return"/>
+    <w:lsdException w:uiPriority="99" w:name="footnote reference"/>
+    <w:lsdException w:unhideWhenUsed="0" w:uiPriority="0" w:semiHidden="0" w:name="annotation reference"/>
+    <w:lsdException w:qFormat="1" w:unhideWhenUsed="0" w:uiPriority="0" w:semiHidden="0" w:name="line number"/>
+    <w:lsdException w:unhideWhenUsed="0" w:uiPriority="0" w:semiHidden="0" w:name="page number"/>
+    <w:lsdException w:uiPriority="99" w:name="endnote reference"/>
+    <w:lsdException w:qFormat="1" w:uiPriority="99" w:name="endnote text"/>
+    <w:lsdException w:unhideWhenUsed="0" w:uiPriority="0" w:semiHidden="0" w:name="table of authorities"/>
+    <w:lsdException w:unhideWhenUsed="0" w:uiPriority="0" w:semiHidden="0" w:name="macro"/>
+    <w:lsdException w:unhideWhenUsed="0" w:uiPriority="0" w:semiHidden="0" w:name="toa heading"/>
+    <w:lsdException w:qFormat="1" w:unhideWhenUsed="0" w:uiPriority="0" w:semiHidden="0" w:name="List"/>
+    <w:lsdException w:unhideWhenUsed="0" w:uiPriority="0" w:semiHidden="0" w:name="List Bullet"/>
+    <w:lsdException w:unhideWhenUsed="0" w:uiPriority="0" w:semiHidden="0" w:name="List Number"/>
+    <w:lsdException w:qFormat="1" w:unhideWhenUsed="0" w:uiPriority="0" w:semiHidden="0" w:name="List 2"/>
+    <w:lsdException w:qFormat="1" w:unhideWhenUsed="0" w:uiPriority="0" w:semiHidden="0" w:name="List 3"/>
+    <w:lsdException w:unhideWhenUsed="0" w:uiPriority="0" w:semiHidden="0" w:name="List 4"/>
+    <w:lsdException w:qFormat="1" w:unhideWhenUsed="0" w:uiPriority="0" w:semiHidden="0" w:name="List 5"/>
+    <w:lsdException w:unhideWhenUsed="0" w:uiPriority="0" w:semiHidden="0" w:name="List Bullet 2"/>
+    <w:lsdException w:unhideWhenUsed="0" w:uiPriority="0" w:semiHidden="0" w:name="List Bullet 3"/>
+    <w:lsdException w:unhideWhenUsed="0" w:uiPriority="0" w:semiHidden="0" w:name="List Bullet 4"/>
+    <w:lsdException w:unhideWhenUsed="0" w:uiPriority="0" w:semiHidden="0" w:name="List Bullet 5"/>
+    <w:lsdException w:unhideWhenUsed="0" w:uiPriority="0" w:semiHidden="0" w:name="List Number 2"/>
+    <w:lsdException w:unhideWhenUsed="0" w:uiPriority="0" w:semiHidden="0" w:name="List Number 3"/>
+    <w:lsdException w:qFormat="1" w:unhideWhenUsed="0" w:uiPriority="0" w:semiHidden="0" w:name="List Number 4"/>
+    <w:lsdException w:unhideWhenUsed="0" w:uiPriority="0" w:semiHidden="0" w:name="List Number 5"/>
+    <w:lsdException w:qFormat="1" w:unhideWhenUsed="0" w:uiPriority="0" w:semiHidden="0" w:name="Title"/>
+    <w:lsdException w:unhideWhenUsed="0" w:uiPriority="0" w:semiHidden="0" w:name="Closing"/>
+    <w:lsdException w:unhideWhenUsed="0" w:uiPriority="0" w:semiHidden="0" w:name="Signature"/>
+    <w:lsdException w:qFormat="1" w:unhideWhenUsed="0" w:uiPriority="0" w:name="Default Paragraph Font"/>
+    <w:lsdException w:unhideWhenUsed="0" w:uiPriority="0" w:semiHidden="0" w:name="Body Text"/>
+    <w:lsdException w:unhideWhenUsed="0" w:uiPriority="0" w:semiHidden="0" w:name="Body Text Indent"/>
+    <w:lsdException w:qFormat="1" w:unhideWhenUsed="0" w:uiPriority="0" w:semiHidden="0" w:name="List Continue"/>
+    <w:lsdException w:unhideWhenUsed="0" w:uiPriority="0" w:semiHidden="0" w:name="List Continue 2"/>
+    <w:lsdException w:qFormat="1" w:unhideWhenUsed="0" w:uiPriority="0" w:semiHidden="0" w:name="List Continue 3"/>
+    <w:lsdException w:qFormat="1" w:unhideWhenUsed="0" w:uiPriority="0" w:semiHidden="0" w:name="List Continue 4"/>
+    <w:lsdException w:unhideWhenUsed="0" w:uiPriority="0" w:semiHidden="0" w:name="List Continue 5"/>
+    <w:lsdException w:qFormat="1" w:unhideWhenUsed="0" w:uiPriority="0" w:semiHidden="0" w:name="Message Header"/>
+    <w:lsdException w:qFormat="1" w:unhideWhenUsed="0" w:uiPriority="0" w:semiHidden="0" w:name="Subtitle"/>
+    <w:lsdException w:unhideWhenUsed="0" w:uiPriority="0" w:semiHidden="0" w:name="Salutation"/>
+    <w:lsdException w:unhideWhenUsed="0" w:uiPriority="0" w:semiHidden="0" w:name="Date"/>
+    <w:lsdException w:unhideWhenUsed="0" w:uiPriority="0" w:semiHidden="0" w:name="Body Text First Indent"/>
+    <w:lsdException w:unhideWhenUsed="0" w:uiPriority="0" w:semiHidden="0" w:name="Body Text First Indent 2"/>
+    <w:lsdException w:unhideWhenUsed="0" w:uiPriority="0" w:semiHidden="0" w:name="Note Heading"/>
+    <w:lsdException w:unhideWhenUsed="0" w:uiPriority="0" w:semiHidden="0" w:name="Body Text 2"/>
+    <w:lsdException w:unhideWhenUsed="0" w:uiPriority="0" w:semiHidden="0" w:name="Body Text 3"/>
+    <w:lsdException w:unhideWhenUsed="0" w:uiPriority="0" w:semiHidden="0" w:name="Body Text Indent 2"/>
+    <w:lsdException w:unhideWhenUsed="0" w:uiPriority="0" w:semiHidden="0" w:name="Body Text Indent 3"/>
+    <w:lsdException w:unhideWhenUsed="0" w:uiPriority="0" w:semiHidden="0" w:name="Block Text"/>
+    <w:lsdException w:uiPriority="99" w:semiHidden="0" w:name="Hyperlink"/>
+    <w:lsdException w:qFormat="1" w:unhideWhenUsed="0" w:uiPriority="0" w:semiHidden="0" w:name="FollowedHyperlink"/>
+    <w:lsdException w:qFormat="1" w:unhideWhenUsed="0" w:uiPriority="0" w:semiHidden="0" w:name="Strong"/>
+    <w:lsdException w:qFormat="1" w:unhideWhenUsed="0" w:uiPriority="0" w:semiHidden="0" w:name="Emphasis"/>
+    <w:lsdException w:unhideWhenUsed="0" w:uiPriority="0" w:semiHidden="0" w:name="Document Map"/>
+    <w:lsdException w:unhideWhenUsed="0" w:uiPriority="0" w:semiHidden="0" w:name="Plain Text"/>
+    <w:lsdException w:qFormat="1" w:unhideWhenUsed="0" w:uiPriority="0" w:semiHidden="0" w:name="E-mail Signature"/>
+    <w:lsdException w:unhideWhenUsed="0" w:uiPriority="0" w:semiHidden="0" w:name="Normal (Web)"/>
+    <w:lsdException w:unhideWhenUsed="0" w:uiPriority="0" w:semiHidden="0" w:name="HTML Acronym"/>
+    <w:lsdException w:unhideWhenUsed="0" w:uiPriority="0" w:semiHidden="0" w:name="HTML Address"/>
+    <w:lsdException w:unhideWhenUsed="0" w:uiPriority="0" w:semiHidden="0" w:name="HTML Cite"/>
+    <w:lsdException w:unhideWhenUsed="0" w:uiPriority="0" w:semiHidden="0" w:name="HTML Code"/>
+    <w:lsdException w:unhideWhenUsed="0" w:uiPriority="0" w:semiHidden="0" w:name="HTML Definition"/>
+    <w:lsdException w:qFormat="1" w:unhideWhenUsed="0" w:uiPriority="0" w:semiHidden="0" w:name="HTML Keyboard"/>
+    <w:lsdException w:qFormat="1" w:unhideWhenUsed="0" w:uiPriority="0" w:semiHidden="0" w:name="HTML Preformatted"/>
+    <w:lsdException w:qFormat="1" w:unhideWhenUsed="0" w:uiPriority="0" w:semiHidden="0" w:name="HTML Sample"/>
+    <w:lsdException w:qFormat="1" w:unhideWhenUsed="0" w:uiPriority="0" w:semiHidden="0" w:name="HTML Typewriter"/>
+    <w:lsdException w:qFormat="1" w:unhideWhenUsed="0" w:uiPriority="0" w:semiHidden="0" w:name="HTML Variable"/>
+    <w:lsdException w:qFormat="1" w:unhideWhenUsed="0" w:uiPriority="0" w:name="Normal Table"/>
+    <w:lsdException w:unhideWhenUsed="0" w:uiPriority="0" w:semiHidden="0" w:name="annotation subject"/>
+    <w:lsdException w:unhideWhenUsed="0" w:uiPriority="0" w:semiHidden="0" w:name="Table Simple 1"/>
+    <w:lsdException w:unhideWhenUsed="0" w:uiPriority="0" w:semiHidden="0" w:name="Table Simple 2"/>
+    <w:lsdException w:unhideWhenUsed="0" w:uiPriority="0" w:semiHidden="0" w:name="Table Simple 3"/>
+    <w:lsdException w:unhideWhenUsed="0" w:uiPriority="0" w:semiHidden="0" w:name="Table Classic 1"/>
+    <w:lsdException w:unhideWhenUsed="0" w:uiPriority="0" w:semiHidden="0" w:name="Table Classic 2"/>
+    <w:lsdException w:unhideWhenUsed="0" w:uiPriority="0" w:semiHidden="0" w:name="Table Classic 3"/>
+    <w:lsdException w:unhideWhenUsed="0" w:uiPriority="0" w:semiHidden="0" w:name="Table Classic 4"/>
+    <w:lsdException w:unhideWhenUsed="0" w:uiPriority="0" w:semiHidden="0" w:name="Table Colorful 1"/>
+    <w:lsdException w:unhideWhenUsed="0" w:uiPriority="0" w:semiHidden="0" w:name="Table Colorful 2"/>
+    <w:lsdException w:unhideWhenUsed="0" w:uiPriority="0" w:semiHidden="0" w:name="Table Colorful 3"/>
+    <w:lsdException w:unhideWhenUsed="0" w:uiPriority="0" w:semiHidden="0" w:name="Table Columns 1"/>
+    <w:lsdException w:unhideWhenUsed="0" w:uiPriority="0" w:semiHidden="0" w:name="Table Columns 2"/>
+    <w:lsdException w:unhideWhenUsed="0" w:uiPriority="0" w:semiHidden="0" w:name="Table Columns 3"/>
+    <w:lsdException w:unhideWhenUsed="0" w:uiPriority="0" w:semiHidden="0" w:name="Table Columns 4"/>
+    <w:lsdException w:unhideWhenUsed="0" w:uiPriority="0" w:semiHidden="0" w:name="Table Columns 5"/>
+    <w:lsdException w:unhideWhenUsed="0" w:uiPriority="0" w:semiHidden="0" w:name="Table Grid 1"/>
+    <w:lsdException w:unhideWhenUsed="0" w:uiPriority="0" w:semiHidden="0" w:name="Table Grid 2"/>
+    <w:lsdException w:unhideWhenUsed="0" w:uiPriority="0" w:semiHidden="0" w:name="Table Grid 3"/>
+    <w:lsdException w:unhideWhenUsed="0" w:uiPriority="0" w:semiHidden="0" w:name="Table Grid 4"/>
+    <w:lsdException w:unhideWhenUsed="0" w:uiPriority="0" w:semiHidden="0" w:name="Table Grid 5"/>
+    <w:lsdException w:unhideWhenUsed="0" w:uiPriority="0" w:semiHidden="0" w:name="Table Grid 6"/>
+    <w:lsdException w:unhideWhenUsed="0" w:uiPriority="0" w:semiHidden="0" w:name="Table Grid 7"/>
+    <w:lsdException w:unhideWhenUsed="0" w:uiPriority="0" w:semiHidden="0" w:name="Table Grid 8"/>
+    <w:lsdException w:unhideWhenUsed="0" w:uiPriority="0" w:semiHidden="0" w:name="Table List 1"/>
+    <w:lsdException w:unhideWhenUsed="0" w:uiPriority="0" w:semiHidden="0" w:name="Table List 2"/>
+    <w:lsdException w:unhideWhenUsed="0" w:uiPriority="0" w:semiHidden="0" w:name="Table List 3"/>
+    <w:lsdException w:unhideWhenUsed="0" w:uiPriority="0" w:semiHidden="0" w:name="Table List 4"/>
+    <w:lsdException w:unhideWhenUsed="0" w:uiPriority="0" w:semiHidden="0" w:name="Table List 5"/>
+    <w:lsdException w:unhideWhenUsed="0" w:uiPriority="0" w:semiHidden="0" w:name="Table List 6"/>
+    <w:lsdException w:unhideWhenUsed="0" w:uiPriority="0" w:semiHidden="0" w:name="Table List 7"/>
+    <w:lsdException w:unhideWhenUsed="0" w:uiPriority="0" w:semiHidden="0" w:name="Table List 8"/>
+    <w:lsdException w:unhideWhenUsed="0" w:uiPriority="0" w:semiHidden="0" w:name="Table 3D effects 1"/>
+    <w:lsdException w:unhideWhenUsed="0" w:uiPriority="0" w:semiHidden="0" w:name="Table 3D effects 2"/>
+    <w:lsdException w:unhideWhenUsed="0" w:uiPriority="0" w:semiHidden="0" w:name="Table 3D effects 3"/>
+    <w:lsdException w:unhideWhenUsed="0" w:uiPriority="0" w:semiHidden="0" w:name="Table Contemporary"/>
+    <w:lsdException w:unhideWhenUsed="0" w:uiPriority="0" w:semiHidden="0" w:name="Table Elegant"/>
+    <w:lsdException w:unhideWhenUsed="0" w:uiPriority="0" w:semiHidden="0" w:name="Table Professional"/>
+    <w:lsdException w:unhideWhenUsed="0" w:uiPriority="0" w:semiHidden="0" w:name="Table Subtle 1"/>
+    <w:lsdException w:unhideWhenUsed="0" w:uiPriority="0" w:semiHidden="0" w:name="Table Subtle 2"/>
+    <w:lsdException w:unhideWhenUsed="0" w:uiPriority="0" w:semiHidden="0" w:name="Table Web 1"/>
+    <w:lsdException w:unhideWhenUsed="0" w:uiPriority="0" w:semiHidden="0" w:name="Table Web 2"/>
+    <w:lsdException w:unhideWhenUsed="0" w:uiPriority="0" w:semiHidden="0" w:name="Table Web 3"/>
+    <w:lsdException w:unhideWhenUsed="0" w:uiPriority="0" w:semiHidden="0" w:name="Balloon Text"/>
+    <w:lsdException w:unhideWhenUsed="0" w:uiPriority="0" w:semiHidden="0" w:name="Table Grid"/>
+    <w:lsdException w:unhideWhenUsed="0" w:uiPriority="0" w:semiHidden="0" w:name="Table Theme"/>
+    <w:lsdException w:qFormat="1" w:unhideWhenUsed="0" w:uiPriority="60" w:semiHidden="0" w:name="Light Shading"/>
+    <w:lsdException w:qFormat="1" w:unhideWhenUsed="0" w:uiPriority="61" w:semiHidden="0" w:name="Light List"/>
+    <w:lsdException w:qFormat="1" w:unhideWhenUsed="0" w:uiPriority="62" w:semiHidden="0" w:name="Light Grid"/>
+    <w:lsdException w:qFormat="1" w:unhideWhenUsed="0" w:uiPriority="63" w:semiHidden="0" w:name="Medium Shading 1"/>
+    <w:lsdException w:qFormat="1" w:unhideWhenUsed="0" w:uiPriority="64" w:semiHidden="0" w:name="Medium Shading 2"/>
+    <w:lsdException w:qFormat="1" w:unhideWhenUsed="0" w:uiPriority="65" w:semiHidden="0" w:name="Medium List 1"/>
+    <w:lsdException w:unhideWhenUsed="0" w:uiPriority="66" w:semiHidden="0" w:name="Medium List 2"/>
+    <w:lsdException w:unhideWhenUsed="0" w:uiPriority="67" w:semiHidden="0" w:name="Medium Grid 1"/>
+    <w:lsdException w:unhideWhenUsed="0" w:uiPriority="68" w:semiHidden="0" w:name="Medium Grid 2"/>
+    <w:lsdException w:unhideWhenUsed="0" w:uiPriority="69" w:semiHidden="0" w:name="Medium Grid 3"/>
+    <w:lsdException w:unhideWhenUsed="0" w:uiPriority="70" w:semiHidden="0" w:name="Dark List"/>
+    <w:lsdException w:unhideWhenUsed="0" w:uiPriority="71" w:semiHidden="0" w:name="Colorful Shading"/>
+    <w:lsdException w:unhideWhenUsed="0" w:uiPriority="72" w:semiHidden="0" w:name="Colorful List"/>
+    <w:lsdException w:unhideWhenUsed="0" w:uiPriority="73" w:semiHidden="0" w:name="Colorful Grid"/>
+    <w:lsdException w:qFormat="1" w:unhideWhenUsed="0" w:uiPriority="60" w:semiHidden="0" w:name="Light Shading Accent 1"/>
+    <w:lsdException w:qFormat="1" w:unhideWhenUsed="0" w:uiPriority="61" w:semiHidden="0" w:name="Light List Accent 1"/>
+    <w:lsdException w:qFormat="1" w:unhideWhenUsed="0" w:uiPriority="62" w:semiHidden="0" w:name="Light Grid Accent 1"/>
+    <w:lsdException w:qFormat="1" w:unhideWhenUsed="0" w:uiPriority="63" w:semiHidden="0" w:name="Medium Shading 1 Accent 1"/>
+    <w:lsdException w:qFormat="1" w:unhideWhenUsed="0" w:uiPriority="64" w:semiHidden="0" w:name="Medium Shading 2 Accent 1"/>
+    <w:lsdException w:qFormat="1" w:unhideWhenUsed="0" w:uiPriority="65" w:semiHidden="0" w:name="Medium List 1 Accent 1"/>
+    <w:lsdException w:qFormat="1" w:unhideWhenUsed="0" w:uiPriority="0" w:semiHidden="0" w:name="List Paragraph"/>
+    <w:lsdException w:unhideWhenUsed="0" w:uiPriority="66" w:semiHidden="0" w:name="Medium List 2 Accent 1"/>
+    <w:lsdException w:unhideWhenUsed="0" w:uiPriority="67" w:semiHidden="0" w:name="Medium Grid 1 Accent 1"/>
+    <w:lsdException w:unhideWhenUsed="0" w:uiPriority="68" w:semiHidden="0" w:name="Medium Grid 2 Accent 1"/>
+    <w:lsdException w:unhideWhenUsed="0" w:uiPriority="69" w:semiHidden="0" w:name="Medium Grid 3 Accent 1"/>
+    <w:lsdException w:unhideWhenUsed="0" w:uiPriority="70" w:semiHidden="0" w:name="Dark List Accent 1"/>
+    <w:lsdException w:unhideWhenUsed="0" w:uiPriority="71" w:semiHidden="0" w:name="Colorful Shading Accent 1"/>
+    <w:lsdException w:unhideWhenUsed="0" w:uiPriority="72" w:semiHidden="0" w:name="Colorful List Accent 1"/>
+    <w:lsdException w:unhideWhenUsed="0" w:uiPriority="73" w:semiHidden="0" w:name="Colorful Grid Accent 1"/>
+    <w:lsdException w:qFormat="1" w:unhideWhenUsed="0" w:uiPriority="60" w:semiHidden="0" w:name="Light Shading Accent 2"/>
+    <w:lsdException w:qFormat="1" w:unhideWhenUsed="0" w:uiPriority="61" w:semiHidden="0" w:name="Light List Accent 2"/>
+    <w:lsdException w:qFormat="1" w:unhideWhenUsed="0" w:uiPriority="62" w:semiHidden="0" w:name="Light Grid Accent 2"/>
+    <w:lsdException w:qFormat="1" w:unhideWhenUsed="0" w:uiPriority="63" w:semiHidden="0" w:name="Medium Shading 1 Accent 2"/>
+    <w:lsdException w:qFormat="1" w:unhideWhenUsed="0" w:uiPriority="64" w:semiHidden="0" w:name="Medium Shading 2 Accent 2"/>
+    <w:lsdException w:qFormat="1" w:unhideWhenUsed="0" w:uiPriority="65" w:semiHidden="0" w:name="Medium List 1 Accent 2"/>
+    <w:lsdException w:unhideWhenUsed="0" w:uiPriority="66" w:semiHidden="0" w:name="Medium List 2 Accent 2"/>
+    <w:lsdException w:unhideWhenUsed="0" w:uiPriority="67" w:semiHidden="0" w:name="Medium Grid 1 Accent 2"/>
+    <w:lsdException w:unhideWhenUsed="0" w:uiPriority="68" w:semiHidden="0" w:name="Medium Grid 2 Accent 2"/>
+    <w:lsdException w:unhideWhenUsed="0" w:uiPriority="69" w:semiHidden="0" w:name="Medium Grid 3 Accent 2"/>
+    <w:lsdException w:unhideWhenUsed="0" w:uiPriority="70" w:semiHidden="0" w:name="Dark List Accent 2"/>
+    <w:lsdException w:unhideWhenUsed="0" w:uiPriority="71" w:semiHidden="0" w:name="Colorful Shading Accent 2"/>
+    <w:lsdException w:unhideWhenUsed="0" w:uiPriority="72" w:semiHidden="0" w:name="Colorful List Accent 2"/>
+    <w:lsdException w:unhideWhenUsed="0" w:uiPriority="73" w:semiHidden="0" w:name="Colorful Grid Accent 2"/>
+    <w:lsdException w:qFormat="1" w:unhideWhenUsed="0" w:uiPriority="60" w:semiHidden="0" w:name="Light Shading Accent 3"/>
+    <w:lsdException w:qFormat="1" w:unhideWhenUsed="0" w:uiPriority="61" w:semiHidden="0" w:name="Light List Accent 3"/>
+    <w:lsdException w:qFormat="1" w:unhideWhenUsed="0" w:uiPriority="62" w:semiHidden="0" w:name="Light Grid Accent 3"/>
+    <w:lsdException w:qFormat="1" w:unhideWhenUsed="0" w:uiPriority="63" w:semiHidden="0" w:name="Medium Shading 1 Accent 3"/>
+    <w:lsdException w:qFormat="1" w:unhideWhenUsed="0" w:uiPriority="64" w:semiHidden="0" w:name="Medium Shading 2 Accent 3"/>
+    <w:lsdException w:qFormat="1" w:unhideWhenUsed="0" w:uiPriority="65" w:semiHidden="0" w:name="Medium List 1 Accent 3"/>
+    <w:lsdException w:unhideWhenUsed="0" w:uiPriority="66" w:semiHidden="0" w:name="Medium List 2 Accent 3"/>
+    <w:lsdException w:unhideWhenUsed="0" w:uiPriority="67" w:semiHidden="0" w:name="Medium Grid 1 Accent 3"/>
+    <w:lsdException w:unhideWhenUsed="0" w:uiPriority="68" w:semiHidden="0" w:name="Medium Grid 2 Accent 3"/>
+    <w:lsdException w:unhideWhenUsed="0" w:uiPriority="69" w:semiHidden="0" w:name="Medium Grid 3 Accent 3"/>
+    <w:lsdException w:unhideWhenUsed="0" w:uiPriority="70" w:semiHidden="0" w:name="Dark List Accent 3"/>
+    <w:lsdException w:unhideWhenUsed="0" w:uiPriority="71" w:semiHidden="0" w:name="Colorful Shading Accent 3"/>
+    <w:lsdException w:unhideWhenUsed="0" w:uiPriority="72" w:semiHidden="0" w:name="Colorful List Accent 3"/>
+    <w:lsdException w:unhideWhenUsed="0" w:uiPriority="73" w:semiHidden="0" w:name="Colorful Grid Accent 3"/>
+    <w:lsdException w:qFormat="1" w:unhideWhenUsed="0" w:uiPriority="60" w:semiHidden="0" w:name="Light Shading Accent 4"/>
+    <w:lsdException w:qFormat="1" w:unhideWhenUsed="0" w:uiPriority="61" w:semiHidden="0" w:name="Light List Accent 4"/>
+    <w:lsdException w:qFormat="1" w:unhideWhenUsed="0" w:uiPriority="62" w:semiHidden="0" w:name="Light Grid Accent 4"/>
+    <w:lsdException w:qFormat="1" w:unhideWhenUsed="0" w:uiPriority="63" w:semiHidden="0" w:name="Medium Shading 1 Accent 4"/>
+    <w:lsdException w:qFormat="1" w:unhideWhenUsed="0" w:uiPriority="64" w:semiHidden="0" w:name="Medium Shading 2 Accent 4"/>
+    <w:lsdException w:unhideWhenUsed="0" w:uiPriority="65" w:semiHidden="0" w:name="Medium List 1 Accent 4"/>
+    <w:lsdException w:unhideWhenUsed="0" w:uiPriority="66" w:semiHidden="0" w:name="Medium List 2 Accent 4"/>
+    <w:lsdException w:unhideWhenUsed="0" w:uiPriority="67" w:semiHidden="0" w:name="Medium Grid 1 Accent 4"/>
+    <w:lsdException w:unhideWhenUsed="0" w:uiPriority="68" w:semiHidden="0" w:name="Medium Grid 2 Accent 4"/>
+    <w:lsdException w:unhideWhenUsed="0" w:uiPriority="69" w:semiHidden="0" w:name="Medium Grid 3 Accent 4"/>
+    <w:lsdException w:unhideWhenUsed="0" w:uiPriority="70" w:semiHidden="0" w:name="Dark List Accent 4"/>
+    <w:lsdException w:unhideWhenUsed="0" w:uiPriority="71" w:semiHidden="0" w:name="Colorful Shading Accent 4"/>
+    <w:lsdException w:unhideWhenUsed="0" w:uiPriority="72" w:semiHidden="0" w:name="Colorful List Accent 4"/>
+    <w:lsdException w:unhideWhenUsed="0" w:uiPriority="73" w:semiHidden="0" w:name="Colorful Grid Accent 4"/>
+    <w:lsdException w:qFormat="1" w:unhideWhenUsed="0" w:uiPriority="60" w:semiHidden="0" w:name="Light Shading Accent 5"/>
+    <w:lsdException w:qFormat="1" w:unhideWhenUsed="0" w:uiPriority="61" w:semiHidden="0" w:name="Light List Accent 5"/>
+    <w:lsdException w:qFormat="1" w:unhideWhenUsed="0" w:uiPriority="62" w:semiHidden="0" w:name="Light Grid Accent 5"/>
+    <w:lsdException w:qFormat="1" w:unhideWhenUsed="0" w:uiPriority="63" w:semiHidden="0" w:name="Medium Shading 1 Accent 5"/>
+    <w:lsdException w:qFormat="1" w:unhideWhenUsed="0" w:uiPriority="64" w:semiHidden="0" w:name="Medium Shading 2 Accent 5"/>
+    <w:lsdException w:unhideWhenUsed="0" w:uiPriority="65" w:semiHidden="0" w:name="Medium List 1 Accent 5"/>
+    <w:lsdException w:unhideWhenUsed="0" w:uiPriority="66" w:semiHidden="0" w:name="Medium List 2 Accent 5"/>
+    <w:lsdException w:unhideWhenUsed="0" w:uiPriority="67" w:semiHidden="0" w:name="Medium Grid 1 Accent 5"/>
+    <w:lsdException w:unhideWhenUsed="0" w:uiPriority="68" w:semiHidden="0" w:name="Medium Grid 2 Accent 5"/>
+    <w:lsdException w:unhideWhenUsed="0" w:uiPriority="69" w:semiHidden="0" w:name="Medium Grid 3 Accent 5"/>
+    <w:lsdException w:unhideWhenUsed="0" w:uiPriority="70" w:semiHidden="0" w:name="Dark List Accent 5"/>
+    <w:lsdException w:unhideWhenUsed="0" w:uiPriority="71" w:semiHidden="0" w:name="Colorful Shading Accent 5"/>
+    <w:lsdException w:unhideWhenUsed="0" w:uiPriority="72" w:semiHidden="0" w:name="Colorful List Accent 5"/>
+    <w:lsdException w:unhideWhenUsed="0" w:uiPriority="73" w:semiHidden="0" w:name="Colorful Grid Accent 5"/>
+    <w:lsdException w:qFormat="1" w:unhideWhenUsed="0" w:uiPriority="60" w:semiHidden="0" w:name="Light Shading Accent 6"/>
+    <w:lsdException w:qFormat="1" w:unhideWhenUsed="0" w:uiPriority="61" w:semiHidden="0" w:name="Light List Accent 6"/>
+    <w:lsdException w:qFormat="1" w:unhideWhenUsed="0" w:uiPriority="62" w:semiHidden="0" w:name="Light Grid Accent 6"/>
+    <w:lsdException w:qFormat="1" w:unhideWhenUsed="0" w:uiPriority="63" w:semiHidden="0" w:name="Medium Shading 1 Accent 6"/>
+    <w:lsdException w:qFormat="1" w:unhideWhenUsed="0" w:uiPriority="64" w:semiHidden="0" w:name="Medium Shading 2 Accent 6"/>
+    <w:lsdException w:unhideWhenUsed="0" w:uiPriority="65" w:semiHidden="0" w:name="Medium List 1 Accent 6"/>
+    <w:lsdException w:unhideWhenUsed="0" w:uiPriority="66" w:semiHidden="0" w:name="Medium List 2 Accent 6"/>
+    <w:lsdException w:unhideWhenUsed="0" w:uiPriority="67" w:semiHidden="0" w:name="Medium Grid 1 Accent 6"/>
+    <w:lsdException w:unhideWhenUsed="0" w:uiPriority="68" w:semiHidden="0" w:name="Medium Grid 2 Accent 6"/>
+    <w:lsdException w:unhideWhenUsed="0" w:uiPriority="69" w:semiHidden="0" w:name="Medium Grid 3 Accent 6"/>
+    <w:lsdException w:unhideWhenUsed="0" w:uiPriority="70" w:semiHidden="0" w:name="Dark List Accent 6"/>
+    <w:lsdException w:unhideWhenUsed="0" w:uiPriority="71" w:semiHidden="0" w:name="Colorful Shading Accent 6"/>
+    <w:lsdException w:unhideWhenUsed="0" w:uiPriority="72" w:semiHidden="0" w:name="Colorful List Accent 6"/>
+    <w:lsdException w:unhideWhenUsed="0" w:uiPriority="73" w:semiHidden="0" w:name="Colorful Grid Accent 6"/>
+  </w:latentStyles>
+  <w:style w:type="paragraph" w:default="1" w:styleId="1">
+    <w:name w:val="Normal"/>
     <w:qFormat/>
+    <w:uiPriority w:val="0"/>
+    <w:pPr>
+      <w:spacing w:line="276" w:lineRule="auto"/>
+    </w:pPr>
     <w:rPr>
-      <w:sz w:val="56"/>
-      <w:szCs w:val="56"/>
+      <w:rFonts w:ascii="Arial" w:hAnsi="Arial" w:eastAsia="Arial" w:cs="Arial"/>
+      <w:sz w:val="22"/>
+      <w:szCs w:val="22"/>
     </w:rPr>
   </w:style>
-  <w:style w:type="paragraph" w:styleId="Heading1">
-    <w:name w:val="Heading 1"/>
-    <w:basedOn w:val="Normal"/>
-    <w:next w:val="Normal"/>
+  <w:style w:type="paragraph" w:styleId="2">
+    <w:name w:val="heading 1"/>
+    <w:next w:val="1"/>
     <w:qFormat/>
-    <w:rPr>
-      <w:color w:val="2E74B5"/>
-      <w:sz w:val="32"/>
-      <w:szCs w:val="32"/>
-    </w:rPr>
-  </w:style>
-  <w:style w:type="paragraph" w:styleId="Heading2">
-    <w:name w:val="Heading 2"/>
-    <w:basedOn w:val="Normal"/>
-    <w:next w:val="Normal"/>
-    <w:qFormat/>
-    <w:rPr>
-      <w:color w:val="2E74B5"/>
-      <w:sz w:val="26"/>
-      <w:szCs w:val="26"/>
-    </w:rPr>
-  </w:style>
-  <w:style w:type="paragraph" w:styleId="Heading3">
-    <w:name w:val="Heading 3"/>
-    <w:basedOn w:val="Normal"/>
-    <w:next w:val="Normal"/>
-    <w:qFormat/>
-    <w:rPr>
-      <w:color w:val="1F4D78"/>
-      <w:sz w:val="24"/>
-      <w:szCs w:val="24"/>
-    </w:rPr>
-  </w:style>
-  <w:style w:type="paragraph" w:styleId="Heading4">
-    <w:name w:val="Heading 4"/>
-    <w:basedOn w:val="Normal"/>
-    <w:next w:val="Normal"/>
-    <w:qFormat/>
-    <w:rPr>
-      <w:i/>
-      <w:iCs/>
-      <w:color w:val="2E74B5"/>
-    </w:rPr>
-  </w:style>
-  <w:style w:type="paragraph" w:styleId="Heading5">
-    <w:name w:val="Heading 5"/>
-    <w:basedOn w:val="Normal"/>
-    <w:next w:val="Normal"/>
-    <w:qFormat/>
-    <w:rPr>
-      <w:color w:val="2E74B5"/>
-    </w:rPr>
-  </w:style>
-  <w:style w:type="paragraph" w:styleId="Heading6">
-    <w:name w:val="Heading 6"/>
-    <w:basedOn w:val="Normal"/>
-    <w:next w:val="Normal"/>
-    <w:qFormat/>
-    <w:rPr>
-      <w:color w:val="1F4D78"/>
-    </w:rPr>
-  </w:style>
-  <w:style w:type="paragraph" w:styleId="Strong">
-    <w:name w:val="Strong"/>
-    <w:basedOn w:val="Normal"/>
-    <w:next w:val="Normal"/>
-    <w:qFormat/>
-    <w:rPr>
-      <w:b/>
-      <w:bCs/>
-    </w:rPr>
-  </w:style>
-  <w:style w:type="paragraph" w:styleId="ListParagraph">
-    <w:name w:val="List Paragraph"/>
-    <w:basedOn w:val="Normal"/>
-    <w:qFormat/>
-  </w:style>
-  <w:style w:type="character" w:styleId="Hyperlink">
-    <w:name w:val="Hyperlink"/>
-    <w:basedOn w:val="DefaultParagraphFont"/>
-    <w:uiPriority w:val="99"/>
-    <w:unhideWhenUsed/>
-    <w:rPr>
-      <w:color w:val="0563C1"/>
-      <w:u w:val="single"/>
-    </w:rPr>
-  </w:style>
-  <w:style w:type="character" w:styleId="FootnoteReference">
-    <w:name w:val="footnote reference"/>
-    <w:basedOn w:val="DefaultParagraphFont"/>
-    <w:uiPriority w:val="99"/>
-    <w:semiHidden/>
-    <w:unhideWhenUsed/>
-    <w:rPr>
-      <w:vertAlign w:val="superscript"/>
-    </w:rPr>
-  </w:style>
-  <w:style w:type="paragraph" w:styleId="FootnoteText">
-    <w:name w:val="footnote text"/>
-    <w:basedOn w:val="Normal"/>
-    <w:link w:val="FootnoteTextChar"/>
-    <w:uiPriority w:val="99"/>
-    <w:semiHidden/>
-    <w:unhideWhenUsed/>
+    <w:uiPriority w:val="0"/>
     <w:pPr>
-      <w:spacing w:after="0" w:line="240" w:lineRule="auto"/>
-    </w:pPr>
-    <w:rPr>
-      <w:sz w:val="20"/>
-      <w:szCs w:val="20"/>
-    </w:rPr>
-  </w:style>
-  <w:style w:type="character" w:styleId="FootnoteTextChar">
-    <w:name w:val="Footnote Text Char"/>
-    <w:basedOn w:val="DefaultParagraphFont"/>
-    <w:link w:val="FootnoteText"/>
-    <w:uiPriority w:val="99"/>
-    <w:semiHidden/>
-    <w:unhideWhenUsed/>
-    <w:rPr>
-      <w:sz w:val="20"/>
-      <w:szCs w:val="20"/>
-    </w:rPr>
-  </w:style>
-  <w:style w:type="character" w:styleId="EndnoteReference">
-    <w:name w:val="endnote reference"/>
-    <w:basedOn w:val="DefaultParagraphFont"/>
-    <w:uiPriority w:val="99"/>
-    <w:semiHidden/>
-    <w:unhideWhenUsed/>
-    <w:rPr>
-      <w:vertAlign w:val="superscript"/>
-    </w:rPr>
-  </w:style>
-  <w:style w:type="paragraph" w:styleId="EndnoteText">
-    <w:name w:val="endnote text"/>
-    <w:basedOn w:val="Normal"/>
-    <w:link w:val="EndnoteTextChar"/>
-    <w:uiPriority w:val="99"/>
-    <w:semiHidden/>
-    <w:unhideWhenUsed/>
-    <w:pPr>
-      <w:spacing w:after="0" w:line="240" w:lineRule="auto"/>
-    </w:pPr>
-    <w:rPr>
-      <w:sz w:val="20"/>
-      <w:szCs w:val="20"/>
-    </w:rPr>
-  </w:style>
-  <w:style w:type="character" w:styleId="EndnoteTextChar">
-    <w:name w:val="Endnote Text Char"/>
-    <w:basedOn w:val="DefaultParagraphFont"/>
-    <w:link w:val="EndnoteText"/>
-    <w:uiPriority w:val="99"/>
-    <w:semiHidden/>
-    <w:unhideWhenUsed/>
-    <w:rPr>
-      <w:sz w:val="20"/>
-      <w:szCs w:val="20"/>
-    </w:rPr>
-  </w:style>
-  <w:style w:type="paragraph" w:styleId="Heading1">
-    <w:name w:val="Heading 1"/>
-    <w:basedOn w:val="Normal"/>
-    <w:next w:val="Normal"/>
-    <w:qFormat/>
-    <w:pPr>
-      <w:spacing w:after="140" w:before="280"/>
+      <w:spacing w:before="280" w:after="140"/>
       <w:outlineLvl w:val="0"/>
     </w:pPr>
     <w:rPr>
-      <w:rFonts w:ascii="Arial" w:cs="Arial" w:eastAsia="Arial" w:hAnsi="Arial"/>
+      <w:rFonts w:ascii="Arial" w:hAnsi="Arial" w:eastAsia="Arial" w:cs="Arial"/>
       <w:b/>
       <w:bCs/>
       <w:color w:val="00796B"/>
@@ -3360,17 +3647,17 @@
       <w:szCs w:val="30"/>
     </w:rPr>
   </w:style>
-  <w:style w:type="paragraph" w:styleId="Heading2">
-    <w:name w:val="Heading 2"/>
-    <w:basedOn w:val="Normal"/>
-    <w:next w:val="Normal"/>
+  <w:style w:type="paragraph" w:styleId="3">
+    <w:name w:val="heading 2"/>
+    <w:next w:val="1"/>
     <w:qFormat/>
+    <w:uiPriority w:val="0"/>
     <w:pPr>
-      <w:spacing w:after="100" w:before="200"/>
+      <w:spacing w:before="200" w:after="100"/>
       <w:outlineLvl w:val="1"/>
     </w:pPr>
     <w:rPr>
-      <w:rFonts w:ascii="Arial" w:cs="Arial" w:eastAsia="Arial" w:hAnsi="Arial"/>
+      <w:rFonts w:ascii="Arial" w:hAnsi="Arial" w:eastAsia="Arial" w:cs="Arial"/>
       <w:b/>
       <w:bCs/>
       <w:color w:val="004D40"/>
@@ -3378,5 +3665,460 @@
       <w:szCs w:val="25"/>
     </w:rPr>
   </w:style>
+  <w:style w:type="paragraph" w:styleId="4">
+    <w:name w:val="heading 3"/>
+    <w:next w:val="1"/>
+    <w:qFormat/>
+    <w:uiPriority w:val="0"/>
+    <w:rPr>
+      <w:rFonts w:ascii="Arial" w:hAnsi="Arial" w:eastAsia="Arial" w:cs="Arial"/>
+      <w:color w:val="1F4D78"/>
+      <w:sz w:val="24"/>
+      <w:szCs w:val="24"/>
+    </w:rPr>
+  </w:style>
+  <w:style w:type="paragraph" w:styleId="5">
+    <w:name w:val="heading 4"/>
+    <w:next w:val="1"/>
+    <w:qFormat/>
+    <w:uiPriority w:val="0"/>
+    <w:rPr>
+      <w:rFonts w:ascii="Arial" w:hAnsi="Arial" w:eastAsia="Arial" w:cs="Arial"/>
+      <w:i/>
+      <w:iCs/>
+      <w:color w:val="2E74B5"/>
+      <w:sz w:val="22"/>
+      <w:szCs w:val="22"/>
+    </w:rPr>
+  </w:style>
+  <w:style w:type="paragraph" w:styleId="6">
+    <w:name w:val="heading 5"/>
+    <w:next w:val="1"/>
+    <w:qFormat/>
+    <w:uiPriority w:val="0"/>
+    <w:rPr>
+      <w:rFonts w:ascii="Arial" w:hAnsi="Arial" w:eastAsia="Arial" w:cs="Arial"/>
+      <w:color w:val="2E74B5"/>
+      <w:sz w:val="22"/>
+      <w:szCs w:val="22"/>
+    </w:rPr>
+  </w:style>
+  <w:style w:type="paragraph" w:styleId="7">
+    <w:name w:val="heading 6"/>
+    <w:next w:val="1"/>
+    <w:qFormat/>
+    <w:uiPriority w:val="0"/>
+    <w:rPr>
+      <w:rFonts w:ascii="Arial" w:hAnsi="Arial" w:eastAsia="Arial" w:cs="Arial"/>
+      <w:color w:val="1F4D78"/>
+      <w:sz w:val="22"/>
+      <w:szCs w:val="22"/>
+    </w:rPr>
+  </w:style>
+  <w:style w:type="character" w:default="1" w:styleId="8">
+    <w:name w:val="Default Paragraph Font"/>
+    <w:semiHidden/>
+    <w:qFormat/>
+    <w:uiPriority w:val="0"/>
+  </w:style>
+  <w:style w:type="table" w:default="1" w:styleId="9">
+    <w:name w:val="Normal Table"/>
+    <w:semiHidden/>
+    <w:qFormat/>
+    <w:uiPriority w:val="0"/>
+    <w:tblPr>
+      <w:tblCellMar>
+        <w:top w:w="0" w:type="dxa"/>
+        <w:left w:w="108" w:type="dxa"/>
+        <w:bottom w:w="0" w:type="dxa"/>
+        <w:right w:w="108" w:type="dxa"/>
+      </w:tblCellMar>
+    </w:tblPr>
+  </w:style>
+  <w:style w:type="character" w:styleId="10">
+    <w:name w:val="endnote reference"/>
+    <w:semiHidden/>
+    <w:unhideWhenUsed/>
+    <w:uiPriority w:val="99"/>
+    <w:rPr>
+      <w:vertAlign w:val="superscript"/>
+    </w:rPr>
+  </w:style>
+  <w:style w:type="paragraph" w:styleId="11">
+    <w:name w:val="endnote text"/>
+    <w:link w:val="18"/>
+    <w:semiHidden/>
+    <w:unhideWhenUsed/>
+    <w:qFormat/>
+    <w:uiPriority w:val="99"/>
+    <w:pPr>
+      <w:spacing w:after="0" w:line="240" w:lineRule="auto"/>
+    </w:pPr>
+    <w:rPr>
+      <w:rFonts w:ascii="Arial" w:hAnsi="Arial" w:eastAsia="Arial" w:cs="Arial"/>
+      <w:sz w:val="20"/>
+      <w:szCs w:val="20"/>
+    </w:rPr>
+  </w:style>
+  <w:style w:type="character" w:styleId="12">
+    <w:name w:val="footnote reference"/>
+    <w:semiHidden/>
+    <w:unhideWhenUsed/>
+    <w:uiPriority w:val="99"/>
+    <w:rPr>
+      <w:vertAlign w:val="superscript"/>
+    </w:rPr>
+  </w:style>
+  <w:style w:type="paragraph" w:styleId="13">
+    <w:name w:val="footnote text"/>
+    <w:link w:val="17"/>
+    <w:semiHidden/>
+    <w:unhideWhenUsed/>
+    <w:uiPriority w:val="99"/>
+    <w:pPr>
+      <w:spacing w:after="0" w:line="240" w:lineRule="auto"/>
+    </w:pPr>
+    <w:rPr>
+      <w:rFonts w:ascii="Arial" w:hAnsi="Arial" w:eastAsia="Arial" w:cs="Arial"/>
+      <w:sz w:val="20"/>
+      <w:szCs w:val="20"/>
+    </w:rPr>
+  </w:style>
+  <w:style w:type="character" w:styleId="14">
+    <w:name w:val="Hyperlink"/>
+    <w:unhideWhenUsed/>
+    <w:uiPriority w:val="99"/>
+    <w:rPr>
+      <w:color w:val="0563C1"/>
+      <w:u w:val="single"/>
+    </w:rPr>
+  </w:style>
+  <w:style w:type="paragraph" w:styleId="15">
+    <w:name w:val="Title"/>
+    <w:qFormat/>
+    <w:uiPriority w:val="0"/>
+    <w:rPr>
+      <w:rFonts w:ascii="Arial" w:hAnsi="Arial" w:eastAsia="Arial" w:cs="Arial"/>
+      <w:sz w:val="56"/>
+      <w:szCs w:val="56"/>
+    </w:rPr>
+  </w:style>
+  <w:style w:type="paragraph" w:styleId="16">
+    <w:name w:val="List Paragraph"/>
+    <w:qFormat/>
+    <w:uiPriority w:val="0"/>
+    <w:rPr>
+      <w:rFonts w:ascii="Arial" w:hAnsi="Arial" w:eastAsia="Arial" w:cs="Arial"/>
+      <w:sz w:val="22"/>
+      <w:szCs w:val="22"/>
+    </w:rPr>
+  </w:style>
+  <w:style w:type="character" w:customStyle="1" w:styleId="17">
+    <w:name w:val="Footnote Text Char"/>
+    <w:link w:val="13"/>
+    <w:semiHidden/>
+    <w:unhideWhenUsed/>
+    <w:uiPriority w:val="99"/>
+    <w:rPr>
+      <w:sz w:val="20"/>
+      <w:szCs w:val="20"/>
+    </w:rPr>
+  </w:style>
+  <w:style w:type="character" w:customStyle="1" w:styleId="18">
+    <w:name w:val="Endnote Text Char"/>
+    <w:link w:val="11"/>
+    <w:semiHidden/>
+    <w:unhideWhenUsed/>
+    <w:qFormat/>
+    <w:uiPriority w:val="99"/>
+    <w:rPr>
+      <w:sz w:val="20"/>
+      <w:szCs w:val="20"/>
+    </w:rPr>
+  </w:style>
 </w:styles>
+</file>
+
+<file path=word/theme/theme1.xml><?xml version="1.0" encoding="utf-8"?>
+<a:theme xmlns:a="http://schemas.openxmlformats.org/drawingml/2006/main" name="Office">
+  <a:themeElements>
+    <a:clrScheme name="Office">
+      <a:dk1>
+        <a:sysClr val="windowText" lastClr="000000"/>
+      </a:dk1>
+      <a:lt1>
+        <a:sysClr val="window" lastClr="FFFFFF"/>
+      </a:lt1>
+      <a:dk2>
+        <a:srgbClr val="1F497D"/>
+      </a:dk2>
+      <a:lt2>
+        <a:srgbClr val="EEECE1"/>
+      </a:lt2>
+      <a:accent1>
+        <a:srgbClr val="4F81BD"/>
+      </a:accent1>
+      <a:accent2>
+        <a:srgbClr val="C0504D"/>
+      </a:accent2>
+      <a:accent3>
+        <a:srgbClr val="9BBB59"/>
+      </a:accent3>
+      <a:accent4>
+        <a:srgbClr val="8064A2"/>
+      </a:accent4>
+      <a:accent5>
+        <a:srgbClr val="4BACC6"/>
+      </a:accent5>
+      <a:accent6>
+        <a:srgbClr val="F79646"/>
+      </a:accent6>
+      <a:hlink>
+        <a:srgbClr val="0000FF"/>
+      </a:hlink>
+      <a:folHlink>
+        <a:srgbClr val="800080"/>
+      </a:folHlink>
+    </a:clrScheme>
+    <a:fontScheme name="Office">
+      <a:majorFont>
+        <a:latin typeface="Cambria"/>
+        <a:ea typeface=""/>
+        <a:cs typeface=""/>
+        <a:font script="Jpan" typeface="游ゴシック Light"/>
+        <a:font script="Hang" typeface="맑은 고딕"/>
+        <a:font script="Hans" typeface="宋体"/>
+        <a:font script="Hant" typeface="新細明體"/>
+        <a:font script="Arab" typeface="Times New Roman"/>
+        <a:font script="Hebr" typeface="Times New Roman"/>
+        <a:font script="Thai" typeface="Angsana New"/>
+        <a:font script="Ethi" typeface="Nyala"/>
+        <a:font script="Beng" typeface="Vrinda"/>
+        <a:font script="Gujr" typeface="Shruti"/>
+        <a:font script="Khmr" typeface="MoolBoran"/>
+        <a:font script="Knda" typeface="Tunga"/>
+        <a:font script="Guru" typeface="Raavi"/>
+        <a:font script="Cans" typeface="Euphemia"/>
+        <a:font script="Cher" typeface="Plantagenet Cherokee"/>
+        <a:font script="Yiii" typeface="Microsoft Yi Baiti"/>
+        <a:font script="Tibt" typeface="Microsoft Himalaya"/>
+        <a:font script="Thaa" typeface="MV Boli"/>
+        <a:font script="Deva" typeface="Mangal"/>
+        <a:font script="Telu" typeface="Gautami"/>
+        <a:font script="Taml" typeface="Latha"/>
+        <a:font script="Syrc" typeface="Estrangelo Edessa"/>
+        <a:font script="Orya" typeface="Kalinga"/>
+        <a:font script="Mlym" typeface="Kartika"/>
+        <a:font script="Laoo" typeface="DokChampa"/>
+        <a:font script="Sinh" typeface="Iskoola Pota"/>
+        <a:font script="Mong" typeface="Mongolian Baiti"/>
+        <a:font script="Viet" typeface="Times New Roman"/>
+        <a:font script="Uigh" typeface="Microsoft Uighur"/>
+        <a:font script="Geor" typeface="Sylfaen"/>
+      </a:majorFont>
+      <a:minorFont>
+        <a:latin typeface="Calibri"/>
+        <a:ea typeface=""/>
+        <a:cs typeface=""/>
+        <a:font script="Jpan" typeface="游明朝"/>
+        <a:font script="Hang" typeface="맑은 고딕"/>
+        <a:font script="Hans" typeface="宋体"/>
+        <a:font script="Hant" typeface="新細明體"/>
+        <a:font script="Arab" typeface="Arial"/>
+        <a:font script="Hebr" typeface="Arial"/>
+        <a:font script="Thai" typeface="Cordia New"/>
+        <a:font script="Ethi" typeface="Nyala"/>
+        <a:font script="Beng" typeface="Vrinda"/>
+        <a:font script="Gujr" typeface="Shruti"/>
+        <a:font script="Khmr" typeface="DaunPenh"/>
+        <a:font script="Knda" typeface="Tunga"/>
+        <a:font script="Guru" typeface="Raavi"/>
+        <a:font script="Cans" typeface="Euphemia"/>
+        <a:font script="Cher" typeface="Plantagenet Cherokee"/>
+        <a:font script="Yiii" typeface="Microsoft Yi Baiti"/>
+        <a:font script="Tibt" typeface="Microsoft Himalaya"/>
+        <a:font script="Thaa" typeface="MV Boli"/>
+        <a:font script="Deva" typeface="Mangal"/>
+        <a:font script="Telu" typeface="Gautami"/>
+        <a:font script="Taml" typeface="Latha"/>
+        <a:font script="Syrc" typeface="Estrangelo Edessa"/>
+        <a:font script="Orya" typeface="Kalinga"/>
+        <a:font script="Mlym" typeface="Kartika"/>
+        <a:font script="Laoo" typeface="DokChampa"/>
+        <a:font script="Sinh" typeface="Iskoola Pota"/>
+        <a:font script="Mong" typeface="Mongolian Baiti"/>
+        <a:font script="Viet" typeface="Arial"/>
+        <a:font script="Uigh" typeface="Microsoft Uighur"/>
+        <a:font script="Geor" typeface="Sylfaen"/>
+      </a:minorFont>
+    </a:fontScheme>
+    <a:fmtScheme name="Office">
+      <a:fillStyleLst>
+        <a:solidFill>
+          <a:schemeClr val="phClr"/>
+        </a:solidFill>
+        <a:gradFill rotWithShape="1">
+          <a:gsLst>
+            <a:gs pos="0">
+              <a:schemeClr val="phClr">
+                <a:tint val="50000"/>
+                <a:satMod val="300000"/>
+              </a:schemeClr>
+            </a:gs>
+            <a:gs pos="35000">
+              <a:schemeClr val="phClr">
+                <a:tint val="37000"/>
+                <a:satMod val="300000"/>
+              </a:schemeClr>
+            </a:gs>
+            <a:gs pos="100000">
+              <a:schemeClr val="phClr">
+                <a:tint val="15000"/>
+                <a:satMod val="350000"/>
+              </a:schemeClr>
+            </a:gs>
+          </a:gsLst>
+          <a:lin ang="16200000" scaled="1"/>
+        </a:gradFill>
+        <a:gradFill rotWithShape="1">
+          <a:gsLst>
+            <a:gs pos="0">
+              <a:schemeClr val="phClr">
+                <a:shade val="51000"/>
+                <a:satMod val="130000"/>
+              </a:schemeClr>
+            </a:gs>
+            <a:gs pos="80000">
+              <a:schemeClr val="phClr">
+                <a:shade val="93000"/>
+                <a:satMod val="130000"/>
+              </a:schemeClr>
+            </a:gs>
+            <a:gs pos="100000">
+              <a:schemeClr val="phClr">
+                <a:shade val="94000"/>
+                <a:satMod val="135000"/>
+              </a:schemeClr>
+            </a:gs>
+          </a:gsLst>
+          <a:lin ang="16200000" scaled="0"/>
+        </a:gradFill>
+      </a:fillStyleLst>
+      <a:lnStyleLst>
+        <a:ln w="9525" cap="flat" cmpd="sng" algn="ctr">
+          <a:solidFill>
+            <a:schemeClr val="phClr">
+              <a:shade val="95000"/>
+              <a:satMod val="105000"/>
+            </a:schemeClr>
+          </a:solidFill>
+          <a:prstDash val="solid"/>
+        </a:ln>
+        <a:ln w="25400" cap="flat" cmpd="sng" algn="ctr">
+          <a:solidFill>
+            <a:schemeClr val="phClr"/>
+          </a:solidFill>
+          <a:prstDash val="solid"/>
+        </a:ln>
+        <a:ln w="38100" cap="flat" cmpd="sng" algn="ctr">
+          <a:solidFill>
+            <a:schemeClr val="phClr"/>
+          </a:solidFill>
+          <a:prstDash val="solid"/>
+        </a:ln>
+      </a:lnStyleLst>
+      <a:effectStyleLst>
+        <a:effectStyle>
+          <a:effectLst>
+            <a:outerShdw blurRad="40000" dist="20000" dir="5400000" rotWithShape="0">
+              <a:srgbClr val="000000">
+                <a:alpha val="38000"/>
+              </a:srgbClr>
+            </a:outerShdw>
+          </a:effectLst>
+        </a:effectStyle>
+        <a:effectStyle>
+          <a:effectLst>
+            <a:outerShdw blurRad="40000" dist="23000" dir="5400000" rotWithShape="0">
+              <a:srgbClr val="000000">
+                <a:alpha val="35000"/>
+              </a:srgbClr>
+            </a:outerShdw>
+          </a:effectLst>
+        </a:effectStyle>
+        <a:effectStyle>
+          <a:effectLst>
+            <a:outerShdw blurRad="40000" dist="23000" dir="5400000" rotWithShape="0">
+              <a:srgbClr val="000000">
+                <a:alpha val="35000"/>
+              </a:srgbClr>
+            </a:outerShdw>
+          </a:effectLst>
+          <a:scene3d>
+            <a:camera prst="orthographicFront">
+              <a:rot lat="0" lon="0" rev="0"/>
+            </a:camera>
+            <a:lightRig rig="threePt" dir="t">
+              <a:rot lat="0" lon="0" rev="1200000"/>
+            </a:lightRig>
+          </a:scene3d>
+          <a:sp3d>
+            <a:bevelT w="63500" h="25400"/>
+          </a:sp3d>
+        </a:effectStyle>
+      </a:effectStyleLst>
+      <a:bgFillStyleLst>
+        <a:solidFill>
+          <a:schemeClr val="phClr"/>
+        </a:solidFill>
+        <a:gradFill rotWithShape="1">
+          <a:gsLst>
+            <a:gs pos="0">
+              <a:schemeClr val="phClr">
+                <a:tint val="40000"/>
+                <a:satMod val="350000"/>
+              </a:schemeClr>
+            </a:gs>
+            <a:gs pos="40000">
+              <a:schemeClr val="phClr">
+                <a:tint val="45000"/>
+                <a:satMod val="350000"/>
+                <a:shade val="99000"/>
+              </a:schemeClr>
+            </a:gs>
+            <a:gs pos="100000">
+              <a:schemeClr val="phClr">
+                <a:shade val="20000"/>
+                <a:satMod val="255000"/>
+              </a:schemeClr>
+            </a:gs>
+          </a:gsLst>
+          <a:path path="circle">
+            <a:fillToRect l="50000" t="-80000" r="50000" b="180000"/>
+          </a:path>
+        </a:gradFill>
+        <a:gradFill rotWithShape="1">
+          <a:gsLst>
+            <a:gs pos="0">
+              <a:schemeClr val="phClr">
+                <a:tint val="80000"/>
+                <a:satMod val="300000"/>
+              </a:schemeClr>
+            </a:gs>
+            <a:gs pos="100000">
+              <a:schemeClr val="phClr">
+                <a:shade val="30000"/>
+                <a:satMod val="200000"/>
+              </a:schemeClr>
+            </a:gs>
+          </a:gsLst>
+          <a:path path="circle">
+            <a:fillToRect l="50000" t="50000" r="50000" b="50000"/>
+          </a:path>
+        </a:gradFill>
+      </a:bgFillStyleLst>
+    </a:fmtScheme>
+  </a:themeElements>
+  <a:objectDefaults/>
+</a:theme>
 </file>
</xml_diff>